<commit_message>
Update resume with Chengfeng AOI experience and current location
</commit_message>
<xml_diff>
--- a/docs/秦宇-测试工程师.docx
+++ b/docs/秦宇-测试工程师.docx
@@ -4,11 +4,15 @@
   <w:body>
     <w:p>
       <w:pPr>
+        <w:pStyle w:val="Title"/>
+        <w:pBdr>
+          <w:bottom w:val="nil"/>
+        </w:pBdr>
         <w:spacing w:after="40"/>
       </w:pPr>
       <w:r>
         <w:rPr>
-          <w:rFonts w:ascii="Calibri" w:hAnsi="Calibri" w:eastAsia="微软雅黑"/>
+          <w:rFonts w:ascii="Calibri" w:hAnsi="Calibri" w:eastAsia="Noto Sans CJK SC"/>
           <w:b/>
           <w:color w:val="1A1A1A"/>
           <w:sz w:val="52"/>
@@ -22,12 +26,12 @@
       </w:pPr>
       <w:r>
         <w:rPr>
-          <w:rFonts w:ascii="Calibri" w:hAnsi="Calibri" w:eastAsia="微软雅黑"/>
+          <w:rFonts w:ascii="Calibri" w:hAnsi="Calibri" w:eastAsia="Noto Sans CJK SC"/>
           <w:b/>
-          <w:color w:val="0563C1"/>
+          <w:color w:val="1A1A1A"/>
           <w:sz w:val="22"/>
         </w:rPr>
-        <w:t>Test Development Engineer · AI Testing · Automation · ATE / Semiconductor · Windows Desktop Testing</w:t>
+        <w:t>Test Development Engineer · AI Testing · Automation · AOI / ATE · Windows Desktop Testing</w:t>
       </w:r>
     </w:p>
     <w:p>
@@ -36,7 +40,7 @@
       </w:pPr>
       <w:r>
         <w:rPr>
-          <w:rFonts w:ascii="Calibri" w:hAnsi="Calibri" w:eastAsia="微软雅黑"/>
+          <w:rFonts w:ascii="Calibri" w:hAnsi="Calibri" w:eastAsia="Noto Sans CJK SC"/>
           <w:b w:val="0"/>
           <w:color w:val="666666"/>
           <w:sz w:val="20"/>
@@ -45,7 +49,7 @@
       </w:r>
       <w:r>
         <w:rPr>
-          <w:rFonts w:ascii="Calibri" w:hAnsi="Calibri" w:eastAsia="微软雅黑"/>
+          <w:rFonts w:ascii="Calibri" w:hAnsi="Calibri" w:eastAsia="Noto Sans CJK SC"/>
           <w:b w:val="0"/>
           <w:sz w:val="20"/>
         </w:rPr>
@@ -53,7 +57,7 @@
       </w:r>
       <w:r>
         <w:rPr>
-          <w:rFonts w:ascii="Calibri" w:hAnsi="Calibri" w:eastAsia="微软雅黑"/>
+          <w:rFonts w:ascii="Calibri" w:hAnsi="Calibri" w:eastAsia="Noto Sans CJK SC"/>
           <w:b w:val="0"/>
           <w:color w:val="666666"/>
           <w:sz w:val="20"/>
@@ -63,7 +67,7 @@
       <w:hyperlink r:id="rId9">
         <w:r>
           <w:rPr>
-            <w:rFonts w:ascii="Calibri" w:eastAsia="微软雅黑"/>
+            <w:rFonts w:ascii="Calibri" w:eastAsia="Noto Sans CJK SC"/>
             <w:color w:val="0563C1"/>
             <w:u w:val="single"/>
           </w:rPr>
@@ -72,24 +76,24 @@
       </w:hyperlink>
       <w:r>
         <w:rPr>
-          <w:rFonts w:ascii="Calibri" w:hAnsi="Calibri" w:eastAsia="微软雅黑"/>
+          <w:rFonts w:ascii="Calibri" w:hAnsi="Calibri" w:eastAsia="Noto Sans CJK SC"/>
           <w:b w:val="0"/>
           <w:color w:val="666666"/>
           <w:sz w:val="20"/>
         </w:rPr>
-        <w:t xml:space="preserve"> ｜ 本科 · 软件工程 · 1 年+测试 / 测试开发经验 ｜ 期望城市：</w:t>
+        <w:t xml:space="preserve"> ｜ 本科 · 软件工程 · 1 年+测试 / 测试开发经验 ｜ 现居：</w:t>
       </w:r>
       <w:r>
         <w:rPr>
-          <w:rFonts w:ascii="Calibri" w:hAnsi="Calibri" w:eastAsia="微软雅黑"/>
+          <w:rFonts w:ascii="Calibri" w:hAnsi="Calibri" w:eastAsia="Noto Sans CJK SC"/>
           <w:b w:val="0"/>
           <w:sz w:val="20"/>
         </w:rPr>
-        <w:t>深圳</w:t>
+        <w:t>珠海</w:t>
       </w:r>
       <w:r>
         <w:rPr>
-          <w:rFonts w:ascii="Calibri" w:hAnsi="Calibri" w:eastAsia="微软雅黑"/>
+          <w:rFonts w:ascii="Calibri" w:hAnsi="Calibri" w:eastAsia="Noto Sans CJK SC"/>
           <w:b w:val="0"/>
           <w:color w:val="666666"/>
           <w:sz w:val="20"/>
@@ -98,7 +102,7 @@
       </w:r>
       <w:r>
         <w:rPr>
-          <w:rFonts w:ascii="Calibri" w:hAnsi="Calibri" w:eastAsia="微软雅黑"/>
+          <w:rFonts w:ascii="Calibri" w:hAnsi="Calibri" w:eastAsia="Noto Sans CJK SC"/>
           <w:b w:val="0"/>
           <w:sz w:val="20"/>
         </w:rPr>
@@ -111,7 +115,7 @@
       </w:pPr>
       <w:r>
         <w:rPr>
-          <w:rFonts w:ascii="Calibri" w:hAnsi="Calibri" w:eastAsia="微软雅黑"/>
+          <w:rFonts w:ascii="Calibri" w:hAnsi="Calibri" w:eastAsia="Noto Sans CJK SC"/>
           <w:b w:val="0"/>
           <w:color w:val="666666"/>
           <w:sz w:val="20"/>
@@ -121,7 +125,7 @@
       <w:hyperlink r:id="rId10">
         <w:r>
           <w:rPr>
-            <w:rFonts w:ascii="Calibri" w:eastAsia="微软雅黑"/>
+            <w:rFonts w:ascii="Calibri" w:eastAsia="Noto Sans CJK SC"/>
             <w:color w:val="0563C1"/>
             <w:u w:val="single"/>
           </w:rPr>
@@ -143,7 +147,7 @@
       </w:pPr>
       <w:r>
         <w:rPr>
-          <w:rFonts w:ascii="Calibri" w:hAnsi="Calibri" w:eastAsia="微软雅黑"/>
+          <w:rFonts w:ascii="Calibri" w:hAnsi="Calibri" w:eastAsia="Noto Sans CJK SC"/>
           <w:b/>
           <w:sz w:val="21"/>
         </w:rPr>
@@ -151,15 +155,16 @@
       </w:r>
       <w:r>
         <w:rPr>
-          <w:rFonts w:ascii="Calibri" w:hAnsi="Calibri" w:eastAsia="微软雅黑"/>
+          <w:rFonts w:ascii="Calibri" w:hAnsi="Calibri" w:eastAsia="Noto Sans CJK SC"/>
           <w:b w:val="0"/>
           <w:sz w:val="21"/>
         </w:rPr>
-        <w:t>专注软件测试开发、AI 应用测试与半导体 ATE 上位机测试。 现于半导体芯片测试机上市公司负责 ATE 上位机软件测试（黑盒 + UI 自动化）；此前在 AI 智能体与低代码平台独立完成 1000+ 用例与 50+ 核心 API 自动巡检。</w:t>
+        <w:t>专注软件测试开发、AI 应用测试与半导体设备软件测试。 软件工程本科，1 年+测试 / 测试开发经验。目前在珠海诚锋科技从事半导体 AOI 设备软件测试，此前参与 ATE 上位机测试与 AI 智能体平台测试，积累 1000+ 用例与 50+ 核心 API 自动巡检实践。结合接口、SQL 与日志定位问题，持续推进测试自动化。</w:t>
       </w:r>
     </w:p>
     <w:p>
       <w:pPr>
+        <w:keepNext/>
         <w:spacing w:before="200" w:after="80"/>
         <w:pBdr>
           <w:left w:val="single" w:sz="18" w:color="1A1A1A"/>
@@ -167,7 +172,7 @@
       </w:pPr>
       <w:r>
         <w:rPr>
-          <w:rFonts w:ascii="Calibri" w:hAnsi="Calibri" w:eastAsia="微软雅黑"/>
+          <w:rFonts w:ascii="Calibri" w:hAnsi="Calibri" w:eastAsia="Noto Sans CJK SC"/>
           <w:b/>
           <w:color w:val="1A1A1A"/>
           <w:sz w:val="25"/>
@@ -184,7 +189,7 @@
       </w:pPr>
       <w:r>
         <w:rPr>
-          <w:rFonts w:ascii="Calibri" w:hAnsi="Calibri" w:eastAsia="微软雅黑"/>
+          <w:rFonts w:ascii="Calibri" w:hAnsi="Calibri" w:eastAsia="Noto Sans CJK SC"/>
           <w:b w:val="0"/>
           <w:sz w:val="20"/>
         </w:rPr>
@@ -192,7 +197,7 @@
       </w:r>
       <w:r>
         <w:rPr>
-          <w:rFonts w:ascii="Calibri" w:hAnsi="Calibri" w:eastAsia="微软雅黑"/>
+          <w:rFonts w:ascii="Calibri" w:hAnsi="Calibri" w:eastAsia="Noto Sans CJK SC"/>
           <w:b w:val="0"/>
           <w:sz w:val="21"/>
         </w:rPr>
@@ -208,7 +213,7 @@
       </w:pPr>
       <w:r>
         <w:rPr>
-          <w:rFonts w:ascii="Calibri" w:hAnsi="Calibri" w:eastAsia="微软雅黑"/>
+          <w:rFonts w:ascii="Calibri" w:hAnsi="Calibri" w:eastAsia="Noto Sans CJK SC"/>
           <w:b w:val="0"/>
           <w:sz w:val="20"/>
         </w:rPr>
@@ -216,7 +221,7 @@
       </w:r>
       <w:r>
         <w:rPr>
-          <w:rFonts w:ascii="Calibri" w:hAnsi="Calibri" w:eastAsia="微软雅黑"/>
+          <w:rFonts w:ascii="Calibri" w:hAnsi="Calibri" w:eastAsia="Noto Sans CJK SC"/>
           <w:b w:val="0"/>
           <w:sz w:val="21"/>
         </w:rPr>
@@ -232,7 +237,7 @@
       </w:pPr>
       <w:r>
         <w:rPr>
-          <w:rFonts w:ascii="Calibri" w:hAnsi="Calibri" w:eastAsia="微软雅黑"/>
+          <w:rFonts w:ascii="Calibri" w:hAnsi="Calibri" w:eastAsia="Noto Sans CJK SC"/>
           <w:b w:val="0"/>
           <w:sz w:val="20"/>
         </w:rPr>
@@ -240,7 +245,7 @@
       </w:r>
       <w:r>
         <w:rPr>
-          <w:rFonts w:ascii="Calibri" w:hAnsi="Calibri" w:eastAsia="微软雅黑"/>
+          <w:rFonts w:ascii="Calibri" w:hAnsi="Calibri" w:eastAsia="Noto Sans CJK SC"/>
           <w:b w:val="0"/>
           <w:sz w:val="21"/>
         </w:rPr>
@@ -256,7 +261,7 @@
       </w:pPr>
       <w:r>
         <w:rPr>
-          <w:rFonts w:ascii="Calibri" w:hAnsi="Calibri" w:eastAsia="微软雅黑"/>
+          <w:rFonts w:ascii="Calibri" w:hAnsi="Calibri" w:eastAsia="Noto Sans CJK SC"/>
           <w:b w:val="0"/>
           <w:sz w:val="20"/>
         </w:rPr>
@@ -264,15 +269,16 @@
       </w:r>
       <w:r>
         <w:rPr>
-          <w:rFonts w:ascii="Calibri" w:hAnsi="Calibri" w:eastAsia="微软雅黑"/>
+          <w:rFonts w:ascii="Calibri" w:hAnsi="Calibri" w:eastAsia="Noto Sans CJK SC"/>
           <w:b w:val="0"/>
           <w:sz w:val="21"/>
         </w:rPr>
-        <w:t>1 年+ 测试 / 测试开发经验（软件测试 → 测试开发 → ATE）</w:t>
+        <w:t>1 年+ 测试 / 测试开发经验（AI 应用测试 · ATE 上位机 · AOI 设备软件）</w:t>
       </w:r>
     </w:p>
     <w:p>
       <w:pPr>
+        <w:keepNext/>
         <w:spacing w:before="200" w:after="80"/>
         <w:pBdr>
           <w:left w:val="single" w:sz="18" w:color="1A1A1A"/>
@@ -280,7 +286,7 @@
       </w:pPr>
       <w:r>
         <w:rPr>
-          <w:rFonts w:ascii="Calibri" w:hAnsi="Calibri" w:eastAsia="微软雅黑"/>
+          <w:rFonts w:ascii="Calibri" w:hAnsi="Calibri" w:eastAsia="Noto Sans CJK SC"/>
           <w:b/>
           <w:color w:val="1A1A1A"/>
           <w:sz w:val="25"/>
@@ -296,7 +302,7 @@
       </w:pPr>
       <w:r>
         <w:rPr>
-          <w:rFonts w:ascii="Calibri" w:hAnsi="Calibri" w:eastAsia="微软雅黑"/>
+          <w:rFonts w:ascii="Calibri" w:hAnsi="Calibri" w:eastAsia="Noto Sans CJK SC"/>
           <w:b/>
           <w:sz w:val="21"/>
         </w:rPr>
@@ -304,7 +310,7 @@
       </w:r>
       <w:r>
         <w:rPr>
-          <w:rFonts w:ascii="Calibri" w:hAnsi="Calibri" w:eastAsia="微软雅黑"/>
+          <w:rFonts w:ascii="Calibri" w:hAnsi="Calibri" w:eastAsia="Noto Sans CJK SC"/>
           <w:b w:val="0"/>
           <w:color w:val="666666"/>
           <w:sz w:val="19"/>
@@ -313,7 +319,7 @@
       </w:r>
       <w:r>
         <w:rPr>
-          <w:rFonts w:ascii="Calibri" w:hAnsi="Calibri" w:eastAsia="微软雅黑"/>
+          <w:rFonts w:ascii="Calibri" w:hAnsi="Calibri" w:eastAsia="Noto Sans CJK SC"/>
           <w:b w:val="0"/>
           <w:sz w:val="21"/>
         </w:rPr>
@@ -328,7 +334,7 @@
       </w:pPr>
       <w:r>
         <w:rPr>
-          <w:rFonts w:ascii="Calibri" w:hAnsi="Calibri" w:eastAsia="微软雅黑"/>
+          <w:rFonts w:ascii="Calibri" w:hAnsi="Calibri" w:eastAsia="Noto Sans CJK SC"/>
           <w:b/>
           <w:sz w:val="21"/>
         </w:rPr>
@@ -336,7 +342,7 @@
       </w:r>
       <w:r>
         <w:rPr>
-          <w:rFonts w:ascii="Calibri" w:hAnsi="Calibri" w:eastAsia="微软雅黑"/>
+          <w:rFonts w:ascii="Calibri" w:hAnsi="Calibri" w:eastAsia="Noto Sans CJK SC"/>
           <w:b w:val="0"/>
           <w:color w:val="666666"/>
           <w:sz w:val="19"/>
@@ -345,7 +351,7 @@
       </w:r>
       <w:r>
         <w:rPr>
-          <w:rFonts w:ascii="Calibri" w:hAnsi="Calibri" w:eastAsia="微软雅黑"/>
+          <w:rFonts w:ascii="Calibri" w:hAnsi="Calibri" w:eastAsia="Noto Sans CJK SC"/>
           <w:b w:val="0"/>
           <w:sz w:val="21"/>
         </w:rPr>
@@ -360,7 +366,7 @@
       </w:pPr>
       <w:r>
         <w:rPr>
-          <w:rFonts w:ascii="Calibri" w:hAnsi="Calibri" w:eastAsia="微软雅黑"/>
+          <w:rFonts w:ascii="Calibri" w:hAnsi="Calibri" w:eastAsia="Noto Sans CJK SC"/>
           <w:b/>
           <w:sz w:val="21"/>
         </w:rPr>
@@ -368,7 +374,7 @@
       </w:r>
       <w:r>
         <w:rPr>
-          <w:rFonts w:ascii="Calibri" w:hAnsi="Calibri" w:eastAsia="微软雅黑"/>
+          <w:rFonts w:ascii="Calibri" w:hAnsi="Calibri" w:eastAsia="Noto Sans CJK SC"/>
           <w:b w:val="0"/>
           <w:color w:val="666666"/>
           <w:sz w:val="19"/>
@@ -377,7 +383,7 @@
       </w:r>
       <w:r>
         <w:rPr>
-          <w:rFonts w:ascii="Calibri" w:hAnsi="Calibri" w:eastAsia="微软雅黑"/>
+          <w:rFonts w:ascii="Calibri" w:hAnsi="Calibri" w:eastAsia="Noto Sans CJK SC"/>
           <w:b w:val="0"/>
           <w:sz w:val="21"/>
         </w:rPr>
@@ -392,7 +398,7 @@
       </w:pPr>
       <w:r>
         <w:rPr>
-          <w:rFonts w:ascii="Calibri" w:hAnsi="Calibri" w:eastAsia="微软雅黑"/>
+          <w:rFonts w:ascii="Calibri" w:hAnsi="Calibri" w:eastAsia="Noto Sans CJK SC"/>
           <w:b/>
           <w:sz w:val="21"/>
         </w:rPr>
@@ -400,7 +406,7 @@
       </w:r>
       <w:r>
         <w:rPr>
-          <w:rFonts w:ascii="Calibri" w:hAnsi="Calibri" w:eastAsia="微软雅黑"/>
+          <w:rFonts w:ascii="Calibri" w:hAnsi="Calibri" w:eastAsia="Noto Sans CJK SC"/>
           <w:b w:val="0"/>
           <w:color w:val="666666"/>
           <w:sz w:val="19"/>
@@ -409,7 +415,7 @@
       </w:r>
       <w:r>
         <w:rPr>
-          <w:rFonts w:ascii="Calibri" w:hAnsi="Calibri" w:eastAsia="微软雅黑"/>
+          <w:rFonts w:ascii="Calibri" w:hAnsi="Calibri" w:eastAsia="Noto Sans CJK SC"/>
           <w:b w:val="0"/>
           <w:sz w:val="21"/>
         </w:rPr>
@@ -424,15 +430,15 @@
       </w:pPr>
       <w:r>
         <w:rPr>
-          <w:rFonts w:ascii="Calibri" w:hAnsi="Calibri" w:eastAsia="微软雅黑"/>
+          <w:rFonts w:ascii="Calibri" w:hAnsi="Calibri" w:eastAsia="Noto Sans CJK SC"/>
           <w:b/>
           <w:sz w:val="21"/>
         </w:rPr>
-        <w:t xml:space="preserve">Desktop Testing </w:t>
+        <w:t xml:space="preserve">AOI Equipment Testing </w:t>
       </w:r>
       <w:r>
         <w:rPr>
-          <w:rFonts w:ascii="Calibri" w:hAnsi="Calibri" w:eastAsia="微软雅黑"/>
+          <w:rFonts w:ascii="Calibri" w:hAnsi="Calibri" w:eastAsia="Noto Sans CJK SC"/>
           <w:b w:val="0"/>
           <w:color w:val="666666"/>
           <w:sz w:val="19"/>
@@ -441,7 +447,39 @@
       </w:r>
       <w:r>
         <w:rPr>
-          <w:rFonts w:ascii="Calibri" w:hAnsi="Calibri" w:eastAsia="微软雅黑"/>
+          <w:rFonts w:ascii="Calibri" w:hAnsi="Calibri" w:eastAsia="Noto Sans CJK SC"/>
+          <w:b w:val="0"/>
+          <w:sz w:val="21"/>
+        </w:rPr>
+        <w:t>设备操作流程 / 检测模板 / 建模 / 成像完整性检查 / 测试记录 / 问题跟踪</w:t>
+      </w:r>
+    </w:p>
+    <w:p>
+      <w:pPr>
+        <w:keepNext w:val="0"/>
+        <w:keepLines/>
+        <w:spacing w:after="40"/>
+      </w:pPr>
+      <w:r>
+        <w:rPr>
+          <w:rFonts w:ascii="Calibri" w:hAnsi="Calibri" w:eastAsia="Noto Sans CJK SC"/>
+          <w:b/>
+          <w:sz w:val="21"/>
+        </w:rPr>
+        <w:t xml:space="preserve">Desktop Testing </w:t>
+      </w:r>
+      <w:r>
+        <w:rPr>
+          <w:rFonts w:ascii="Calibri" w:hAnsi="Calibri" w:eastAsia="Noto Sans CJK SC"/>
+          <w:b w:val="0"/>
+          <w:color w:val="666666"/>
+          <w:sz w:val="19"/>
+        </w:rPr>
+        <w:t xml:space="preserve">（项目实践） </w:t>
+      </w:r>
+      <w:r>
+        <w:rPr>
+          <w:rFonts w:ascii="Calibri" w:hAnsi="Calibri" w:eastAsia="Noto Sans CJK SC"/>
           <w:b w:val="0"/>
           <w:sz w:val="21"/>
         </w:rPr>
@@ -456,7 +494,7 @@
       </w:pPr>
       <w:r>
         <w:rPr>
-          <w:rFonts w:ascii="Calibri" w:hAnsi="Calibri" w:eastAsia="微软雅黑"/>
+          <w:rFonts w:ascii="Calibri" w:hAnsi="Calibri" w:eastAsia="Noto Sans CJK SC"/>
           <w:b/>
           <w:sz w:val="21"/>
         </w:rPr>
@@ -464,7 +502,7 @@
       </w:r>
       <w:r>
         <w:rPr>
-          <w:rFonts w:ascii="Calibri" w:hAnsi="Calibri" w:eastAsia="微软雅黑"/>
+          <w:rFonts w:ascii="Calibri" w:hAnsi="Calibri" w:eastAsia="Noto Sans CJK SC"/>
           <w:b w:val="0"/>
           <w:color w:val="666666"/>
           <w:sz w:val="19"/>
@@ -473,7 +511,7 @@
       </w:r>
       <w:r>
         <w:rPr>
-          <w:rFonts w:ascii="Calibri" w:hAnsi="Calibri" w:eastAsia="微软雅黑"/>
+          <w:rFonts w:ascii="Calibri" w:hAnsi="Calibri" w:eastAsia="Noto Sans CJK SC"/>
           <w:b w:val="0"/>
           <w:sz w:val="21"/>
         </w:rPr>
@@ -488,7 +526,7 @@
       </w:pPr>
       <w:r>
         <w:rPr>
-          <w:rFonts w:ascii="Calibri" w:hAnsi="Calibri" w:eastAsia="微软雅黑"/>
+          <w:rFonts w:ascii="Calibri" w:hAnsi="Calibri" w:eastAsia="Noto Sans CJK SC"/>
           <w:b/>
           <w:sz w:val="21"/>
         </w:rPr>
@@ -496,7 +534,7 @@
       </w:r>
       <w:r>
         <w:rPr>
-          <w:rFonts w:ascii="Calibri" w:hAnsi="Calibri" w:eastAsia="微软雅黑"/>
+          <w:rFonts w:ascii="Calibri" w:hAnsi="Calibri" w:eastAsia="Noto Sans CJK SC"/>
           <w:b w:val="0"/>
           <w:color w:val="666666"/>
           <w:sz w:val="19"/>
@@ -505,7 +543,7 @@
       </w:r>
       <w:r>
         <w:rPr>
-          <w:rFonts w:ascii="Calibri" w:hAnsi="Calibri" w:eastAsia="微软雅黑"/>
+          <w:rFonts w:ascii="Calibri" w:hAnsi="Calibri" w:eastAsia="Noto Sans CJK SC"/>
           <w:b w:val="0"/>
           <w:sz w:val="21"/>
         </w:rPr>
@@ -520,7 +558,7 @@
       </w:pPr>
       <w:r>
         <w:rPr>
-          <w:rFonts w:ascii="Calibri" w:hAnsi="Calibri" w:eastAsia="微软雅黑"/>
+          <w:rFonts w:ascii="Calibri" w:hAnsi="Calibri" w:eastAsia="Noto Sans CJK SC"/>
           <w:b/>
           <w:sz w:val="21"/>
         </w:rPr>
@@ -528,7 +566,7 @@
       </w:r>
       <w:r>
         <w:rPr>
-          <w:rFonts w:ascii="Calibri" w:hAnsi="Calibri" w:eastAsia="微软雅黑"/>
+          <w:rFonts w:ascii="Calibri" w:hAnsi="Calibri" w:eastAsia="Noto Sans CJK SC"/>
           <w:b w:val="0"/>
           <w:color w:val="666666"/>
           <w:sz w:val="19"/>
@@ -537,7 +575,7 @@
       </w:r>
       <w:r>
         <w:rPr>
-          <w:rFonts w:ascii="Calibri" w:hAnsi="Calibri" w:eastAsia="微软雅黑"/>
+          <w:rFonts w:ascii="Calibri" w:hAnsi="Calibri" w:eastAsia="Noto Sans CJK SC"/>
           <w:b w:val="0"/>
           <w:sz w:val="21"/>
         </w:rPr>
@@ -552,7 +590,7 @@
       </w:pPr>
       <w:r>
         <w:rPr>
-          <w:rFonts w:ascii="Calibri" w:hAnsi="Calibri" w:eastAsia="微软雅黑"/>
+          <w:rFonts w:ascii="Calibri" w:hAnsi="Calibri" w:eastAsia="Noto Sans CJK SC"/>
           <w:b/>
           <w:sz w:val="21"/>
         </w:rPr>
@@ -560,7 +598,7 @@
       </w:r>
       <w:r>
         <w:rPr>
-          <w:rFonts w:ascii="Calibri" w:hAnsi="Calibri" w:eastAsia="微软雅黑"/>
+          <w:rFonts w:ascii="Calibri" w:hAnsi="Calibri" w:eastAsia="Noto Sans CJK SC"/>
           <w:b w:val="0"/>
           <w:color w:val="666666"/>
           <w:sz w:val="19"/>
@@ -569,7 +607,7 @@
       </w:r>
       <w:r>
         <w:rPr>
-          <w:rFonts w:ascii="Calibri" w:hAnsi="Calibri" w:eastAsia="微软雅黑"/>
+          <w:rFonts w:ascii="Calibri" w:hAnsi="Calibri" w:eastAsia="Noto Sans CJK SC"/>
           <w:b w:val="0"/>
           <w:sz w:val="21"/>
         </w:rPr>
@@ -578,6 +616,7 @@
     </w:p>
     <w:p>
       <w:pPr>
+        <w:keepNext/>
         <w:spacing w:before="200" w:after="80"/>
         <w:pBdr>
           <w:left w:val="single" w:sz="18" w:color="1A1A1A"/>
@@ -585,7 +624,7 @@
       </w:pPr>
       <w:r>
         <w:rPr>
-          <w:rFonts w:ascii="Calibri" w:hAnsi="Calibri" w:eastAsia="微软雅黑"/>
+          <w:rFonts w:ascii="Calibri" w:hAnsi="Calibri" w:eastAsia="Noto Sans CJK SC"/>
           <w:b/>
           <w:color w:val="1A1A1A"/>
           <w:sz w:val="25"/>
@@ -595,13 +634,157 @@
     </w:p>
     <w:p>
       <w:pPr>
-        <w:keepNext w:val="0"/>
+        <w:keepNext/>
         <w:keepLines/>
         <w:spacing w:before="100" w:after="20"/>
       </w:pPr>
       <w:r>
         <w:rPr>
-          <w:rFonts w:ascii="Calibri" w:hAnsi="Calibri" w:eastAsia="微软雅黑"/>
+          <w:rFonts w:ascii="Calibri" w:hAnsi="Calibri" w:eastAsia="Noto Sans CJK SC"/>
+          <w:b/>
+          <w:sz w:val="23"/>
+        </w:rPr>
+        <w:t xml:space="preserve">珠海诚锋电子科技有限公司　</w:t>
+      </w:r>
+      <w:r>
+        <w:rPr>
+          <w:rFonts w:ascii="Calibri" w:hAnsi="Calibri" w:eastAsia="Noto Sans CJK SC"/>
+          <w:b w:val="0"/>
+          <w:color w:val="666666"/>
+          <w:sz w:val="19"/>
+        </w:rPr>
+        <w:t xml:space="preserve">[测试工程师]　</w:t>
+      </w:r>
+      <w:r>
+        <w:rPr>
+          <w:rFonts w:ascii="Calibri" w:hAnsi="Calibri" w:eastAsia="Noto Sans CJK SC"/>
+          <w:b w:val="0"/>
+          <w:color w:val="666666"/>
+          <w:sz w:val="19"/>
+        </w:rPr>
+        <w:t>2026.09.28 — 至今</w:t>
+      </w:r>
+    </w:p>
+    <w:p>
+      <w:pPr>
+        <w:keepNext/>
+        <w:spacing w:after="40"/>
+      </w:pPr>
+      <w:r>
+        <w:rPr>
+          <w:rFonts w:ascii="Calibri" w:hAnsi="Calibri" w:eastAsia="Noto Sans CJK SC"/>
+          <w:b w:val="0"/>
+          <w:color w:val="666666"/>
+          <w:sz w:val="19"/>
+        </w:rPr>
+        <w:t>半导体 AOI 光学检测设备 · 设备软件测试</w:t>
+      </w:r>
+    </w:p>
+    <w:p>
+      <w:pPr>
+        <w:keepNext w:val="0"/>
+        <w:keepLines/>
+        <w:spacing w:after="40"/>
+        <w:ind w:left="283"/>
+      </w:pPr>
+      <w:r>
+        <w:rPr>
+          <w:rFonts w:ascii="Calibri" w:hAnsi="Calibri" w:eastAsia="Noto Sans CJK SC"/>
+          <w:b w:val="0"/>
+          <w:sz w:val="20"/>
+        </w:rPr>
+        <w:t xml:space="preserve">▪ </w:t>
+      </w:r>
+      <w:r>
+        <w:rPr>
+          <w:rFonts w:ascii="Calibri" w:hAnsi="Calibri" w:eastAsia="Noto Sans CJK SC"/>
+          <w:b/>
+          <w:sz w:val="21"/>
+        </w:rPr>
+        <w:t>设备流程梳理：</w:t>
+      </w:r>
+      <w:r>
+        <w:rPr>
+          <w:rFonts w:ascii="Calibri" w:hAnsi="Calibri" w:eastAsia="Noto Sans CJK SC"/>
+          <w:b w:val="0"/>
+          <w:sz w:val="21"/>
+        </w:rPr>
+        <w:t>结合设备作业指导书与软件功能清单，梳理操作流程、功能入口和测试关注点，逐步建立设备软件测试清单。</w:t>
+      </w:r>
+    </w:p>
+    <w:p>
+      <w:pPr>
+        <w:keepNext w:val="0"/>
+        <w:keepLines/>
+        <w:spacing w:after="40"/>
+        <w:ind w:left="283"/>
+      </w:pPr>
+      <w:r>
+        <w:rPr>
+          <w:rFonts w:ascii="Calibri" w:hAnsi="Calibri" w:eastAsia="Noto Sans CJK SC"/>
+          <w:b w:val="0"/>
+          <w:sz w:val="20"/>
+        </w:rPr>
+        <w:t xml:space="preserve">▪ </w:t>
+      </w:r>
+      <w:r>
+        <w:rPr>
+          <w:rFonts w:ascii="Calibri" w:hAnsi="Calibri" w:eastAsia="Noto Sans CJK SC"/>
+          <w:b/>
+          <w:sz w:val="21"/>
+        </w:rPr>
+        <w:t>建模与检测记录：</w:t>
+      </w:r>
+      <w:r>
+        <w:rPr>
+          <w:rFonts w:ascii="Calibri" w:hAnsi="Calibri" w:eastAsia="Noto Sans CJK SC"/>
+          <w:b w:val="0"/>
+          <w:sz w:val="21"/>
+        </w:rPr>
+        <w:t>参与 MPW 晶圆建模流程学习与检测验证，整理截图和检测记录，关注拍摄位置偏移、Die 成像不完整等影响检测覆盖的问题。</w:t>
+      </w:r>
+    </w:p>
+    <w:p>
+      <w:pPr>
+        <w:keepNext w:val="0"/>
+        <w:keepLines/>
+        <w:spacing w:after="40"/>
+        <w:ind w:left="283"/>
+      </w:pPr>
+      <w:r>
+        <w:rPr>
+          <w:rFonts w:ascii="Calibri" w:hAnsi="Calibri" w:eastAsia="Noto Sans CJK SC"/>
+          <w:b w:val="0"/>
+          <w:sz w:val="20"/>
+        </w:rPr>
+        <w:t xml:space="preserve">▪ </w:t>
+      </w:r>
+      <w:r>
+        <w:rPr>
+          <w:rFonts w:ascii="Calibri" w:hAnsi="Calibri" w:eastAsia="Noto Sans CJK SC"/>
+          <w:b/>
+          <w:sz w:val="21"/>
+        </w:rPr>
+        <w:t>测试管理工具：</w:t>
+      </w:r>
+      <w:r>
+        <w:rPr>
+          <w:rFonts w:ascii="Calibri" w:hAnsi="Calibri" w:eastAsia="Noto Sans CJK SC"/>
+          <w:b w:val="0"/>
+          <w:sz w:val="21"/>
+        </w:rPr>
+        <w:t>推进轻量测试管理系统的需求与交互设计，按项目、软件版本、功能模块组织问题，完善进度说明、附件及测试用例管理。</w:t>
+      </w:r>
+    </w:p>
+    <w:p>
+      <w:pPr>
+        <w:keepNext/>
+        <w:keepLines/>
+        <w:spacing w:before="100" w:after="20"/>
+      </w:pPr>
+      <w:r>
+        <w:rPr>
+          <w:rFonts w:ascii="Calibri" w:hAnsi="Calibri" w:eastAsia="Noto Sans CJK SC"/>
           <w:b/>
           <w:sz w:val="23"/>
         </w:rPr>
@@ -609,30 +792,31 @@
       </w:r>
       <w:r>
         <w:rPr>
-          <w:rFonts w:ascii="Calibri" w:hAnsi="Calibri" w:eastAsia="微软雅黑"/>
+          <w:rFonts w:ascii="Calibri" w:hAnsi="Calibri" w:eastAsia="Noto Sans CJK SC"/>
           <w:b w:val="0"/>
           <w:color w:val="666666"/>
           <w:sz w:val="19"/>
         </w:rPr>
-        <w:t xml:space="preserve">[软件测试]　</w:t>
+        <w:t xml:space="preserve">[软件测试助理工程师]　</w:t>
       </w:r>
       <w:r>
         <w:rPr>
-          <w:rFonts w:ascii="Calibri" w:hAnsi="Calibri" w:eastAsia="微软雅黑"/>
+          <w:rFonts w:ascii="Calibri" w:hAnsi="Calibri" w:eastAsia="Noto Sans CJK SC"/>
           <w:b w:val="0"/>
           <w:color w:val="666666"/>
           <w:sz w:val="19"/>
         </w:rPr>
-        <w:t>2026.07 — 至今</w:t>
+        <w:t>2026.07 — 2026.09</w:t>
       </w:r>
     </w:p>
     <w:p>
       <w:pPr>
+        <w:keepNext/>
         <w:spacing w:after="40"/>
       </w:pPr>
       <w:r>
         <w:rPr>
-          <w:rFonts w:ascii="Calibri" w:hAnsi="Calibri" w:eastAsia="微软雅黑"/>
+          <w:rFonts w:ascii="Calibri" w:hAnsi="Calibri" w:eastAsia="Noto Sans CJK SC"/>
           <w:b w:val="0"/>
           <w:color w:val="666666"/>
           <w:sz w:val="19"/>
@@ -649,7 +833,7 @@
       </w:pPr>
       <w:r>
         <w:rPr>
-          <w:rFonts w:ascii="Calibri" w:hAnsi="Calibri" w:eastAsia="微软雅黑"/>
+          <w:rFonts w:ascii="Calibri" w:hAnsi="Calibri" w:eastAsia="Noto Sans CJK SC"/>
           <w:b w:val="0"/>
           <w:sz w:val="20"/>
         </w:rPr>
@@ -657,7 +841,7 @@
       </w:r>
       <w:r>
         <w:rPr>
-          <w:rFonts w:ascii="Calibri" w:hAnsi="Calibri" w:eastAsia="微软雅黑"/>
+          <w:rFonts w:ascii="Calibri" w:hAnsi="Calibri" w:eastAsia="Noto Sans CJK SC"/>
           <w:b/>
           <w:sz w:val="21"/>
         </w:rPr>
@@ -665,7 +849,7 @@
       </w:r>
       <w:r>
         <w:rPr>
-          <w:rFonts w:ascii="Calibri" w:hAnsi="Calibri" w:eastAsia="微软雅黑"/>
+          <w:rFonts w:ascii="Calibri" w:hAnsi="Calibri" w:eastAsia="Noto Sans CJK SC"/>
           <w:b w:val="0"/>
           <w:sz w:val="21"/>
         </w:rPr>
@@ -681,7 +865,7 @@
       </w:pPr>
       <w:r>
         <w:rPr>
-          <w:rFonts w:ascii="Calibri" w:hAnsi="Calibri" w:eastAsia="微软雅黑"/>
+          <w:rFonts w:ascii="Calibri" w:hAnsi="Calibri" w:eastAsia="Noto Sans CJK SC"/>
           <w:b w:val="0"/>
           <w:sz w:val="20"/>
         </w:rPr>
@@ -689,7 +873,7 @@
       </w:r>
       <w:r>
         <w:rPr>
-          <w:rFonts w:ascii="Calibri" w:hAnsi="Calibri" w:eastAsia="微软雅黑"/>
+          <w:rFonts w:ascii="Calibri" w:hAnsi="Calibri" w:eastAsia="Noto Sans CJK SC"/>
           <w:b/>
           <w:sz w:val="21"/>
         </w:rPr>
@@ -697,7 +881,7 @@
       </w:r>
       <w:r>
         <w:rPr>
-          <w:rFonts w:ascii="Calibri" w:hAnsi="Calibri" w:eastAsia="微软雅黑"/>
+          <w:rFonts w:ascii="Calibri" w:hAnsi="Calibri" w:eastAsia="Noto Sans CJK SC"/>
           <w:b w:val="0"/>
           <w:sz w:val="21"/>
         </w:rPr>
@@ -713,7 +897,7 @@
       </w:pPr>
       <w:r>
         <w:rPr>
-          <w:rFonts w:ascii="Calibri" w:hAnsi="Calibri" w:eastAsia="微软雅黑"/>
+          <w:rFonts w:ascii="Calibri" w:hAnsi="Calibri" w:eastAsia="Noto Sans CJK SC"/>
           <w:b w:val="0"/>
           <w:sz w:val="20"/>
         </w:rPr>
@@ -721,7 +905,7 @@
       </w:r>
       <w:r>
         <w:rPr>
-          <w:rFonts w:ascii="Calibri" w:hAnsi="Calibri" w:eastAsia="微软雅黑"/>
+          <w:rFonts w:ascii="Calibri" w:hAnsi="Calibri" w:eastAsia="Noto Sans CJK SC"/>
           <w:b/>
           <w:sz w:val="21"/>
         </w:rPr>
@@ -729,7 +913,7 @@
       </w:r>
       <w:r>
         <w:rPr>
-          <w:rFonts w:ascii="Calibri" w:hAnsi="Calibri" w:eastAsia="微软雅黑"/>
+          <w:rFonts w:ascii="Calibri" w:hAnsi="Calibri" w:eastAsia="Noto Sans CJK SC"/>
           <w:b w:val="0"/>
           <w:sz w:val="21"/>
         </w:rPr>
@@ -745,7 +929,7 @@
       </w:pPr>
       <w:r>
         <w:rPr>
-          <w:rFonts w:ascii="Calibri" w:hAnsi="Calibri" w:eastAsia="微软雅黑"/>
+          <w:rFonts w:ascii="Calibri" w:hAnsi="Calibri" w:eastAsia="Noto Sans CJK SC"/>
           <w:b w:val="0"/>
           <w:sz w:val="20"/>
         </w:rPr>
@@ -753,7 +937,7 @@
       </w:r>
       <w:r>
         <w:rPr>
-          <w:rFonts w:ascii="Calibri" w:hAnsi="Calibri" w:eastAsia="微软雅黑"/>
+          <w:rFonts w:ascii="Calibri" w:hAnsi="Calibri" w:eastAsia="Noto Sans CJK SC"/>
           <w:b/>
           <w:sz w:val="21"/>
         </w:rPr>
@@ -761,7 +945,7 @@
       </w:r>
       <w:r>
         <w:rPr>
-          <w:rFonts w:ascii="Calibri" w:hAnsi="Calibri" w:eastAsia="微软雅黑"/>
+          <w:rFonts w:ascii="Calibri" w:hAnsi="Calibri" w:eastAsia="Noto Sans CJK SC"/>
           <w:b w:val="0"/>
           <w:sz w:val="21"/>
         </w:rPr>
@@ -770,13 +954,13 @@
     </w:p>
     <w:p>
       <w:pPr>
-        <w:keepNext w:val="0"/>
+        <w:keepNext/>
         <w:keepLines/>
         <w:spacing w:before="100" w:after="20"/>
       </w:pPr>
       <w:r>
         <w:rPr>
-          <w:rFonts w:ascii="Calibri" w:hAnsi="Calibri" w:eastAsia="微软雅黑"/>
+          <w:rFonts w:ascii="Calibri" w:hAnsi="Calibri" w:eastAsia="Noto Sans CJK SC"/>
           <w:b/>
           <w:sz w:val="23"/>
         </w:rPr>
@@ -784,7 +968,7 @@
       </w:r>
       <w:r>
         <w:rPr>
-          <w:rFonts w:ascii="Calibri" w:hAnsi="Calibri" w:eastAsia="微软雅黑"/>
+          <w:rFonts w:ascii="Calibri" w:hAnsi="Calibri" w:eastAsia="Noto Sans CJK SC"/>
           <w:b w:val="0"/>
           <w:color w:val="666666"/>
           <w:sz w:val="19"/>
@@ -793,7 +977,7 @@
       </w:r>
       <w:r>
         <w:rPr>
-          <w:rFonts w:ascii="Calibri" w:hAnsi="Calibri" w:eastAsia="微软雅黑"/>
+          <w:rFonts w:ascii="Calibri" w:hAnsi="Calibri" w:eastAsia="Noto Sans CJK SC"/>
           <w:b w:val="0"/>
           <w:color w:val="666666"/>
           <w:sz w:val="19"/>
@@ -803,11 +987,12 @@
     </w:p>
     <w:p>
       <w:pPr>
+        <w:keepNext/>
         <w:spacing w:after="40"/>
       </w:pPr>
       <w:r>
         <w:rPr>
-          <w:rFonts w:ascii="Calibri" w:hAnsi="Calibri" w:eastAsia="微软雅黑"/>
+          <w:rFonts w:ascii="Calibri" w:hAnsi="Calibri" w:eastAsia="Noto Sans CJK SC"/>
           <w:b w:val="0"/>
           <w:color w:val="666666"/>
           <w:sz w:val="19"/>
@@ -824,7 +1009,7 @@
       </w:pPr>
       <w:r>
         <w:rPr>
-          <w:rFonts w:ascii="Calibri" w:hAnsi="Calibri" w:eastAsia="微软雅黑"/>
+          <w:rFonts w:ascii="Calibri" w:hAnsi="Calibri" w:eastAsia="Noto Sans CJK SC"/>
           <w:b w:val="0"/>
           <w:sz w:val="20"/>
         </w:rPr>
@@ -832,7 +1017,7 @@
       </w:r>
       <w:r>
         <w:rPr>
-          <w:rFonts w:ascii="Calibri" w:hAnsi="Calibri" w:eastAsia="微软雅黑"/>
+          <w:rFonts w:ascii="Calibri" w:hAnsi="Calibri" w:eastAsia="Noto Sans CJK SC"/>
           <w:b/>
           <w:sz w:val="21"/>
         </w:rPr>
@@ -840,7 +1025,7 @@
       </w:r>
       <w:r>
         <w:rPr>
-          <w:rFonts w:ascii="Calibri" w:hAnsi="Calibri" w:eastAsia="微软雅黑"/>
+          <w:rFonts w:ascii="Calibri" w:hAnsi="Calibri" w:eastAsia="Noto Sans CJK SC"/>
           <w:b w:val="0"/>
           <w:sz w:val="21"/>
         </w:rPr>
@@ -856,7 +1041,7 @@
       </w:pPr>
       <w:r>
         <w:rPr>
-          <w:rFonts w:ascii="Calibri" w:hAnsi="Calibri" w:eastAsia="微软雅黑"/>
+          <w:rFonts w:ascii="Calibri" w:hAnsi="Calibri" w:eastAsia="Noto Sans CJK SC"/>
           <w:b w:val="0"/>
           <w:sz w:val="20"/>
         </w:rPr>
@@ -864,7 +1049,7 @@
       </w:r>
       <w:r>
         <w:rPr>
-          <w:rFonts w:ascii="Calibri" w:hAnsi="Calibri" w:eastAsia="微软雅黑"/>
+          <w:rFonts w:ascii="Calibri" w:hAnsi="Calibri" w:eastAsia="Noto Sans CJK SC"/>
           <w:b/>
           <w:sz w:val="21"/>
         </w:rPr>
@@ -872,7 +1057,7 @@
       </w:r>
       <w:r>
         <w:rPr>
-          <w:rFonts w:ascii="Calibri" w:hAnsi="Calibri" w:eastAsia="微软雅黑"/>
+          <w:rFonts w:ascii="Calibri" w:hAnsi="Calibri" w:eastAsia="Noto Sans CJK SC"/>
           <w:b w:val="0"/>
           <w:sz w:val="21"/>
         </w:rPr>
@@ -888,7 +1073,7 @@
       </w:pPr>
       <w:r>
         <w:rPr>
-          <w:rFonts w:ascii="Calibri" w:hAnsi="Calibri" w:eastAsia="微软雅黑"/>
+          <w:rFonts w:ascii="Calibri" w:hAnsi="Calibri" w:eastAsia="Noto Sans CJK SC"/>
           <w:b w:val="0"/>
           <w:sz w:val="20"/>
         </w:rPr>
@@ -896,7 +1081,7 @@
       </w:r>
       <w:r>
         <w:rPr>
-          <w:rFonts w:ascii="Calibri" w:hAnsi="Calibri" w:eastAsia="微软雅黑"/>
+          <w:rFonts w:ascii="Calibri" w:hAnsi="Calibri" w:eastAsia="Noto Sans CJK SC"/>
           <w:b/>
           <w:sz w:val="21"/>
         </w:rPr>
@@ -904,7 +1089,7 @@
       </w:r>
       <w:r>
         <w:rPr>
-          <w:rFonts w:ascii="Calibri" w:hAnsi="Calibri" w:eastAsia="微软雅黑"/>
+          <w:rFonts w:ascii="Calibri" w:hAnsi="Calibri" w:eastAsia="Noto Sans CJK SC"/>
           <w:b w:val="0"/>
           <w:sz w:val="21"/>
         </w:rPr>
@@ -920,7 +1105,7 @@
       </w:pPr>
       <w:r>
         <w:rPr>
-          <w:rFonts w:ascii="Calibri" w:hAnsi="Calibri" w:eastAsia="微软雅黑"/>
+          <w:rFonts w:ascii="Calibri" w:hAnsi="Calibri" w:eastAsia="Noto Sans CJK SC"/>
           <w:b w:val="0"/>
           <w:sz w:val="20"/>
         </w:rPr>
@@ -928,7 +1113,7 @@
       </w:r>
       <w:r>
         <w:rPr>
-          <w:rFonts w:ascii="Calibri" w:hAnsi="Calibri" w:eastAsia="微软雅黑"/>
+          <w:rFonts w:ascii="Calibri" w:hAnsi="Calibri" w:eastAsia="Noto Sans CJK SC"/>
           <w:b/>
           <w:sz w:val="21"/>
         </w:rPr>
@@ -936,7 +1121,7 @@
       </w:r>
       <w:r>
         <w:rPr>
-          <w:rFonts w:ascii="Calibri" w:hAnsi="Calibri" w:eastAsia="微软雅黑"/>
+          <w:rFonts w:ascii="Calibri" w:hAnsi="Calibri" w:eastAsia="Noto Sans CJK SC"/>
           <w:b w:val="0"/>
           <w:sz w:val="21"/>
         </w:rPr>
@@ -945,13 +1130,13 @@
     </w:p>
     <w:p>
       <w:pPr>
-        <w:keepNext w:val="0"/>
+        <w:keepNext/>
         <w:keepLines/>
         <w:spacing w:before="100" w:after="20"/>
       </w:pPr>
       <w:r>
         <w:rPr>
-          <w:rFonts w:ascii="Calibri" w:hAnsi="Calibri" w:eastAsia="微软雅黑"/>
+          <w:rFonts w:ascii="Calibri" w:hAnsi="Calibri" w:eastAsia="Noto Sans CJK SC"/>
           <w:b/>
           <w:sz w:val="23"/>
         </w:rPr>
@@ -959,7 +1144,7 @@
       </w:r>
       <w:r>
         <w:rPr>
-          <w:rFonts w:ascii="Calibri" w:hAnsi="Calibri" w:eastAsia="微软雅黑"/>
+          <w:rFonts w:ascii="Calibri" w:hAnsi="Calibri" w:eastAsia="Noto Sans CJK SC"/>
           <w:b w:val="0"/>
           <w:color w:val="666666"/>
           <w:sz w:val="19"/>
@@ -968,7 +1153,7 @@
       </w:r>
       <w:r>
         <w:rPr>
-          <w:rFonts w:ascii="Calibri" w:hAnsi="Calibri" w:eastAsia="微软雅黑"/>
+          <w:rFonts w:ascii="Calibri" w:hAnsi="Calibri" w:eastAsia="Noto Sans CJK SC"/>
           <w:b w:val="0"/>
           <w:color w:val="666666"/>
           <w:sz w:val="19"/>
@@ -978,11 +1163,12 @@
     </w:p>
     <w:p>
       <w:pPr>
+        <w:keepNext/>
         <w:spacing w:after="40"/>
       </w:pPr>
       <w:r>
         <w:rPr>
-          <w:rFonts w:ascii="Calibri" w:hAnsi="Calibri" w:eastAsia="微软雅黑"/>
+          <w:rFonts w:ascii="Calibri" w:hAnsi="Calibri" w:eastAsia="Noto Sans CJK SC"/>
           <w:b w:val="0"/>
           <w:color w:val="666666"/>
           <w:sz w:val="19"/>
@@ -999,7 +1185,7 @@
       </w:pPr>
       <w:r>
         <w:rPr>
-          <w:rFonts w:ascii="Calibri" w:hAnsi="Calibri" w:eastAsia="微软雅黑"/>
+          <w:rFonts w:ascii="Calibri" w:hAnsi="Calibri" w:eastAsia="Noto Sans CJK SC"/>
           <w:b w:val="0"/>
           <w:sz w:val="20"/>
         </w:rPr>
@@ -1007,7 +1193,7 @@
       </w:r>
       <w:r>
         <w:rPr>
-          <w:rFonts w:ascii="Calibri" w:hAnsi="Calibri" w:eastAsia="微软雅黑"/>
+          <w:rFonts w:ascii="Calibri" w:hAnsi="Calibri" w:eastAsia="Noto Sans CJK SC"/>
           <w:b/>
           <w:sz w:val="21"/>
         </w:rPr>
@@ -1015,7 +1201,7 @@
       </w:r>
       <w:r>
         <w:rPr>
-          <w:rFonts w:ascii="Calibri" w:hAnsi="Calibri" w:eastAsia="微软雅黑"/>
+          <w:rFonts w:ascii="Calibri" w:hAnsi="Calibri" w:eastAsia="Noto Sans CJK SC"/>
           <w:b w:val="0"/>
           <w:sz w:val="21"/>
         </w:rPr>
@@ -1031,7 +1217,7 @@
       </w:pPr>
       <w:r>
         <w:rPr>
-          <w:rFonts w:ascii="Calibri" w:hAnsi="Calibri" w:eastAsia="微软雅黑"/>
+          <w:rFonts w:ascii="Calibri" w:hAnsi="Calibri" w:eastAsia="Noto Sans CJK SC"/>
           <w:b w:val="0"/>
           <w:sz w:val="20"/>
         </w:rPr>
@@ -1039,7 +1225,7 @@
       </w:r>
       <w:r>
         <w:rPr>
-          <w:rFonts w:ascii="Calibri" w:hAnsi="Calibri" w:eastAsia="微软雅黑"/>
+          <w:rFonts w:ascii="Calibri" w:hAnsi="Calibri" w:eastAsia="Noto Sans CJK SC"/>
           <w:b/>
           <w:sz w:val="21"/>
         </w:rPr>
@@ -1047,7 +1233,7 @@
       </w:r>
       <w:r>
         <w:rPr>
-          <w:rFonts w:ascii="Calibri" w:hAnsi="Calibri" w:eastAsia="微软雅黑"/>
+          <w:rFonts w:ascii="Calibri" w:hAnsi="Calibri" w:eastAsia="Noto Sans CJK SC"/>
           <w:b w:val="0"/>
           <w:sz w:val="21"/>
         </w:rPr>
@@ -1063,7 +1249,7 @@
       </w:pPr>
       <w:r>
         <w:rPr>
-          <w:rFonts w:ascii="Calibri" w:hAnsi="Calibri" w:eastAsia="微软雅黑"/>
+          <w:rFonts w:ascii="Calibri" w:hAnsi="Calibri" w:eastAsia="Noto Sans CJK SC"/>
           <w:b w:val="0"/>
           <w:sz w:val="20"/>
         </w:rPr>
@@ -1071,7 +1257,7 @@
       </w:r>
       <w:r>
         <w:rPr>
-          <w:rFonts w:ascii="Calibri" w:hAnsi="Calibri" w:eastAsia="微软雅黑"/>
+          <w:rFonts w:ascii="Calibri" w:hAnsi="Calibri" w:eastAsia="Noto Sans CJK SC"/>
           <w:b/>
           <w:sz w:val="21"/>
         </w:rPr>
@@ -1079,7 +1265,7 @@
       </w:r>
       <w:r>
         <w:rPr>
-          <w:rFonts w:ascii="Calibri" w:hAnsi="Calibri" w:eastAsia="微软雅黑"/>
+          <w:rFonts w:ascii="Calibri" w:hAnsi="Calibri" w:eastAsia="Noto Sans CJK SC"/>
           <w:b w:val="0"/>
           <w:sz w:val="21"/>
         </w:rPr>
@@ -1088,6 +1274,7 @@
     </w:p>
     <w:p>
       <w:pPr>
+        <w:keepNext/>
         <w:spacing w:before="200" w:after="80"/>
         <w:pBdr>
           <w:left w:val="single" w:sz="18" w:color="1A1A1A"/>
@@ -1095,7 +1282,7 @@
       </w:pPr>
       <w:r>
         <w:rPr>
-          <w:rFonts w:ascii="Calibri" w:hAnsi="Calibri" w:eastAsia="微软雅黑"/>
+          <w:rFonts w:ascii="Calibri" w:hAnsi="Calibri" w:eastAsia="Noto Sans CJK SC"/>
           <w:b/>
           <w:color w:val="1A1A1A"/>
           <w:sz w:val="25"/>
@@ -1105,21 +1292,21 @@
     </w:p>
     <w:p>
       <w:pPr>
-        <w:keepNext w:val="0"/>
+        <w:keepNext/>
         <w:keepLines/>
         <w:spacing w:before="100" w:after="20"/>
       </w:pPr>
       <w:r>
         <w:rPr>
-          <w:rFonts w:ascii="Calibri" w:hAnsi="Calibri" w:eastAsia="微软雅黑"/>
+          <w:rFonts w:ascii="Calibri" w:hAnsi="Calibri" w:eastAsia="Noto Sans CJK SC"/>
           <w:b/>
           <w:sz w:val="22"/>
         </w:rPr>
-        <w:t xml:space="preserve">车规级芯片测试机（ATE）上位机软件　</w:t>
+        <w:t xml:space="preserve">半导体 AOI 设备软件测试与检测记录　</w:t>
       </w:r>
       <w:r>
         <w:rPr>
-          <w:rFonts w:ascii="Calibri" w:hAnsi="Calibri" w:eastAsia="微软雅黑"/>
+          <w:rFonts w:ascii="Calibri" w:hAnsi="Calibri" w:eastAsia="Noto Sans CJK SC"/>
           <w:b w:val="0"/>
           <w:color w:val="666666"/>
           <w:sz w:val="19"/>
@@ -1128,12 +1315,12 @@
       </w:r>
       <w:r>
         <w:rPr>
-          <w:rFonts w:ascii="Calibri" w:hAnsi="Calibri" w:eastAsia="微软雅黑"/>
+          <w:rFonts w:ascii="Calibri" w:hAnsi="Calibri" w:eastAsia="Noto Sans CJK SC"/>
           <w:b w:val="0"/>
           <w:color w:val="666666"/>
           <w:sz w:val="19"/>
         </w:rPr>
-        <w:t>2026.07 — 至今</w:t>
+        <w:t>2026.09 — 至今</w:t>
       </w:r>
     </w:p>
     <w:p>
@@ -1145,7 +1332,7 @@
       </w:pPr>
       <w:r>
         <w:rPr>
-          <w:rFonts w:ascii="Calibri" w:hAnsi="Calibri" w:eastAsia="微软雅黑"/>
+          <w:rFonts w:ascii="Calibri" w:hAnsi="Calibri" w:eastAsia="Noto Sans CJK SC"/>
           <w:b w:val="0"/>
           <w:sz w:val="20"/>
         </w:rPr>
@@ -1153,7 +1340,7 @@
       </w:r>
       <w:r>
         <w:rPr>
-          <w:rFonts w:ascii="Calibri" w:hAnsi="Calibri" w:eastAsia="微软雅黑"/>
+          <w:rFonts w:ascii="Calibri" w:hAnsi="Calibri" w:eastAsia="Noto Sans CJK SC"/>
           <w:b/>
           <w:sz w:val="21"/>
         </w:rPr>
@@ -1161,7 +1348,176 @@
       </w:r>
       <w:r>
         <w:rPr>
-          <w:rFonts w:ascii="Calibri" w:hAnsi="Calibri" w:eastAsia="微软雅黑"/>
+          <w:rFonts w:ascii="Calibri" w:hAnsi="Calibri" w:eastAsia="Noto Sans CJK SC"/>
+          <w:b w:val="0"/>
+          <w:sz w:val="21"/>
+        </w:rPr>
+        <w:t>光学检测结果依赖设备操作、模板参数和成像范围，需要把软件流程、现场现象与检测记录对应起来。 结合操作手册梳理建模与检测流程，按截图整理检测记录，记录拍摄偏移、Die 成像不完整等现象，并核对相机定位与建模环节。</w:t>
+      </w:r>
+    </w:p>
+    <w:p>
+      <w:pPr>
+        <w:keepNext w:val="0"/>
+        <w:keepLines/>
+        <w:spacing w:after="40"/>
+        <w:ind w:left="283"/>
+      </w:pPr>
+      <w:r>
+        <w:rPr>
+          <w:rFonts w:ascii="Calibri" w:hAnsi="Calibri" w:eastAsia="Noto Sans CJK SC"/>
+          <w:b w:val="0"/>
+          <w:sz w:val="20"/>
+        </w:rPr>
+        <w:t xml:space="preserve">▪ </w:t>
+      </w:r>
+      <w:r>
+        <w:rPr>
+          <w:rFonts w:ascii="Calibri" w:hAnsi="Calibri" w:eastAsia="Noto Sans CJK SC"/>
+          <w:b w:val="0"/>
+          <w:sz w:val="21"/>
+        </w:rPr>
+        <w:t>按操作步骤整理功能入口与测试关注点</w:t>
+      </w:r>
+    </w:p>
+    <w:p>
+      <w:pPr>
+        <w:keepNext w:val="0"/>
+        <w:keepLines/>
+        <w:spacing w:after="40"/>
+        <w:ind w:left="283"/>
+      </w:pPr>
+      <w:r>
+        <w:rPr>
+          <w:rFonts w:ascii="Calibri" w:hAnsi="Calibri" w:eastAsia="Noto Sans CJK SC"/>
+          <w:b w:val="0"/>
+          <w:sz w:val="20"/>
+        </w:rPr>
+        <w:t xml:space="preserve">▪ </w:t>
+      </w:r>
+      <w:r>
+        <w:rPr>
+          <w:rFonts w:ascii="Calibri" w:hAnsi="Calibri" w:eastAsia="Noto Sans CJK SC"/>
+          <w:b w:val="0"/>
+          <w:sz w:val="21"/>
+        </w:rPr>
+        <w:t>检查拍摄位置与 Die 成像完整性，保留现象截图</w:t>
+      </w:r>
+    </w:p>
+    <w:p>
+      <w:pPr>
+        <w:keepNext w:val="0"/>
+        <w:keepLines/>
+        <w:spacing w:after="40"/>
+        <w:ind w:left="283"/>
+      </w:pPr>
+      <w:r>
+        <w:rPr>
+          <w:rFonts w:ascii="Calibri" w:hAnsi="Calibri" w:eastAsia="Noto Sans CJK SC"/>
+          <w:b w:val="0"/>
+          <w:sz w:val="20"/>
+        </w:rPr>
+        <w:t xml:space="preserve">▪ </w:t>
+      </w:r>
+      <w:r>
+        <w:rPr>
+          <w:rFonts w:ascii="Calibri" w:hAnsi="Calibri" w:eastAsia="Noto Sans CJK SC"/>
+          <w:b w:val="0"/>
+          <w:sz w:val="21"/>
+        </w:rPr>
+        <w:t>将问题现象、复现条件与记录对应，便于后续验证</w:t>
+      </w:r>
+    </w:p>
+    <w:p>
+      <w:pPr>
+        <w:keepNext w:val="0"/>
+        <w:keepLines/>
+        <w:spacing w:after="40"/>
+        <w:ind w:left="283"/>
+      </w:pPr>
+      <w:r>
+        <w:rPr>
+          <w:rFonts w:ascii="Calibri" w:hAnsi="Calibri" w:eastAsia="Noto Sans CJK SC"/>
+          <w:b w:val="0"/>
+          <w:sz w:val="20"/>
+        </w:rPr>
+        <w:t xml:space="preserve">▪ </w:t>
+      </w:r>
+      <w:r>
+        <w:rPr>
+          <w:rFonts w:ascii="Calibri" w:hAnsi="Calibri" w:eastAsia="Noto Sans CJK SC"/>
+          <w:b/>
+          <w:sz w:val="21"/>
+        </w:rPr>
+        <w:t>结果：</w:t>
+      </w:r>
+      <w:r>
+        <w:rPr>
+          <w:rFonts w:ascii="Calibri" w:hAnsi="Calibri" w:eastAsia="Noto Sans CJK SC"/>
+          <w:b w:val="0"/>
+          <w:sz w:val="21"/>
+        </w:rPr>
+        <w:t>已整理 MPW 检测记录与截图材料，持续完善设备流程理解和测试清单。</w:t>
+      </w:r>
+    </w:p>
+    <w:p>
+      <w:pPr>
+        <w:keepNext/>
+        <w:keepLines/>
+        <w:spacing w:before="100" w:after="20"/>
+      </w:pPr>
+      <w:r>
+        <w:rPr>
+          <w:rFonts w:ascii="Calibri" w:hAnsi="Calibri" w:eastAsia="Noto Sans CJK SC"/>
+          <w:b/>
+          <w:sz w:val="22"/>
+        </w:rPr>
+        <w:t xml:space="preserve">车规级芯片测试机（ATE）上位机软件　</w:t>
+      </w:r>
+      <w:r>
+        <w:rPr>
+          <w:rFonts w:ascii="Calibri" w:hAnsi="Calibri" w:eastAsia="Noto Sans CJK SC"/>
+          <w:b w:val="0"/>
+          <w:color w:val="666666"/>
+          <w:sz w:val="19"/>
+        </w:rPr>
+        <w:t xml:space="preserve">[软件测试]　</w:t>
+      </w:r>
+      <w:r>
+        <w:rPr>
+          <w:rFonts w:ascii="Calibri" w:hAnsi="Calibri" w:eastAsia="Noto Sans CJK SC"/>
+          <w:b w:val="0"/>
+          <w:color w:val="666666"/>
+          <w:sz w:val="19"/>
+        </w:rPr>
+        <w:t>2026.07 — 2026.09</w:t>
+      </w:r>
+    </w:p>
+    <w:p>
+      <w:pPr>
+        <w:keepNext w:val="0"/>
+        <w:keepLines/>
+        <w:spacing w:after="40"/>
+        <w:ind w:left="283"/>
+      </w:pPr>
+      <w:r>
+        <w:rPr>
+          <w:rFonts w:ascii="Calibri" w:hAnsi="Calibri" w:eastAsia="Noto Sans CJK SC"/>
+          <w:b w:val="0"/>
+          <w:sz w:val="20"/>
+        </w:rPr>
+        <w:t xml:space="preserve">▪ </w:t>
+      </w:r>
+      <w:r>
+        <w:rPr>
+          <w:rFonts w:ascii="Calibri" w:hAnsi="Calibri" w:eastAsia="Noto Sans CJK SC"/>
+          <w:b/>
+          <w:sz w:val="21"/>
+        </w:rPr>
+        <w:t>问题与方法：</w:t>
+      </w:r>
+      <w:r>
+        <w:rPr>
+          <w:rFonts w:ascii="Calibri" w:hAnsi="Calibri" w:eastAsia="Noto Sans CJK SC"/>
           <w:b w:val="0"/>
           <w:sz w:val="21"/>
         </w:rPr>
@@ -1177,7 +1533,7 @@
       </w:pPr>
       <w:r>
         <w:rPr>
-          <w:rFonts w:ascii="Calibri" w:hAnsi="Calibri" w:eastAsia="微软雅黑"/>
+          <w:rFonts w:ascii="Calibri" w:hAnsi="Calibri" w:eastAsia="Noto Sans CJK SC"/>
           <w:b w:val="0"/>
           <w:sz w:val="20"/>
         </w:rPr>
@@ -1185,7 +1541,7 @@
       </w:r>
       <w:r>
         <w:rPr>
-          <w:rFonts w:ascii="Calibri" w:hAnsi="Calibri" w:eastAsia="微软雅黑"/>
+          <w:rFonts w:ascii="Calibri" w:hAnsi="Calibri" w:eastAsia="Noto Sans CJK SC"/>
           <w:b w:val="0"/>
           <w:sz w:val="21"/>
         </w:rPr>
@@ -1201,7 +1557,7 @@
       </w:pPr>
       <w:r>
         <w:rPr>
-          <w:rFonts w:ascii="Calibri" w:hAnsi="Calibri" w:eastAsia="微软雅黑"/>
+          <w:rFonts w:ascii="Calibri" w:hAnsi="Calibri" w:eastAsia="Noto Sans CJK SC"/>
           <w:b w:val="0"/>
           <w:sz w:val="20"/>
         </w:rPr>
@@ -1209,7 +1565,7 @@
       </w:r>
       <w:r>
         <w:rPr>
-          <w:rFonts w:ascii="Calibri" w:hAnsi="Calibri" w:eastAsia="微软雅黑"/>
+          <w:rFonts w:ascii="Calibri" w:hAnsi="Calibri" w:eastAsia="Noto Sans CJK SC"/>
           <w:b w:val="0"/>
           <w:sz w:val="21"/>
         </w:rPr>
@@ -1225,7 +1581,7 @@
       </w:pPr>
       <w:r>
         <w:rPr>
-          <w:rFonts w:ascii="Calibri" w:hAnsi="Calibri" w:eastAsia="微软雅黑"/>
+          <w:rFonts w:ascii="Calibri" w:hAnsi="Calibri" w:eastAsia="Noto Sans CJK SC"/>
           <w:b w:val="0"/>
           <w:sz w:val="20"/>
         </w:rPr>
@@ -1233,7 +1589,7 @@
       </w:r>
       <w:r>
         <w:rPr>
-          <w:rFonts w:ascii="Calibri" w:hAnsi="Calibri" w:eastAsia="微软雅黑"/>
+          <w:rFonts w:ascii="Calibri" w:hAnsi="Calibri" w:eastAsia="Noto Sans CJK SC"/>
           <w:b w:val="0"/>
           <w:sz w:val="21"/>
         </w:rPr>
@@ -1249,7 +1605,7 @@
       </w:pPr>
       <w:r>
         <w:rPr>
-          <w:rFonts w:ascii="Calibri" w:hAnsi="Calibri" w:eastAsia="微软雅黑"/>
+          <w:rFonts w:ascii="Calibri" w:hAnsi="Calibri" w:eastAsia="Noto Sans CJK SC"/>
           <w:b w:val="0"/>
           <w:sz w:val="20"/>
         </w:rPr>
@@ -1257,7 +1613,7 @@
       </w:r>
       <w:r>
         <w:rPr>
-          <w:rFonts w:ascii="Calibri" w:hAnsi="Calibri" w:eastAsia="微软雅黑"/>
+          <w:rFonts w:ascii="Calibri" w:hAnsi="Calibri" w:eastAsia="Noto Sans CJK SC"/>
           <w:b/>
           <w:sz w:val="21"/>
         </w:rPr>
@@ -1265,7 +1621,7 @@
       </w:r>
       <w:r>
         <w:rPr>
-          <w:rFonts w:ascii="Calibri" w:hAnsi="Calibri" w:eastAsia="微软雅黑"/>
+          <w:rFonts w:ascii="Calibri" w:hAnsi="Calibri" w:eastAsia="Noto Sans CJK SC"/>
           <w:b w:val="0"/>
           <w:sz w:val="21"/>
         </w:rPr>
@@ -1274,13 +1630,13 @@
     </w:p>
     <w:p>
       <w:pPr>
-        <w:keepNext w:val="0"/>
+        <w:keepNext/>
         <w:keepLines/>
         <w:spacing w:before="100" w:after="20"/>
       </w:pPr>
       <w:r>
         <w:rPr>
-          <w:rFonts w:ascii="Calibri" w:hAnsi="Calibri" w:eastAsia="微软雅黑"/>
+          <w:rFonts w:ascii="Calibri" w:hAnsi="Calibri" w:eastAsia="Noto Sans CJK SC"/>
           <w:b/>
           <w:sz w:val="22"/>
         </w:rPr>
@@ -1288,7 +1644,7 @@
       </w:r>
       <w:r>
         <w:rPr>
-          <w:rFonts w:ascii="Calibri" w:hAnsi="Calibri" w:eastAsia="微软雅黑"/>
+          <w:rFonts w:ascii="Calibri" w:hAnsi="Calibri" w:eastAsia="Noto Sans CJK SC"/>
           <w:b w:val="0"/>
           <w:color w:val="666666"/>
           <w:sz w:val="19"/>
@@ -1297,7 +1653,7 @@
       </w:r>
       <w:r>
         <w:rPr>
-          <w:rFonts w:ascii="Calibri" w:hAnsi="Calibri" w:eastAsia="微软雅黑"/>
+          <w:rFonts w:ascii="Calibri" w:hAnsi="Calibri" w:eastAsia="Noto Sans CJK SC"/>
           <w:b w:val="0"/>
           <w:color w:val="666666"/>
           <w:sz w:val="19"/>
@@ -1314,7 +1670,7 @@
       </w:pPr>
       <w:r>
         <w:rPr>
-          <w:rFonts w:ascii="Calibri" w:hAnsi="Calibri" w:eastAsia="微软雅黑"/>
+          <w:rFonts w:ascii="Calibri" w:hAnsi="Calibri" w:eastAsia="Noto Sans CJK SC"/>
           <w:b w:val="0"/>
           <w:sz w:val="20"/>
         </w:rPr>
@@ -1322,7 +1678,7 @@
       </w:r>
       <w:r>
         <w:rPr>
-          <w:rFonts w:ascii="Calibri" w:hAnsi="Calibri" w:eastAsia="微软雅黑"/>
+          <w:rFonts w:ascii="Calibri" w:hAnsi="Calibri" w:eastAsia="Noto Sans CJK SC"/>
           <w:b/>
           <w:sz w:val="21"/>
         </w:rPr>
@@ -1330,7 +1686,7 @@
       </w:r>
       <w:r>
         <w:rPr>
-          <w:rFonts w:ascii="Calibri" w:hAnsi="Calibri" w:eastAsia="微软雅黑"/>
+          <w:rFonts w:ascii="Calibri" w:hAnsi="Calibri" w:eastAsia="Noto Sans CJK SC"/>
           <w:b w:val="0"/>
           <w:sz w:val="21"/>
         </w:rPr>
@@ -1346,7 +1702,7 @@
       </w:pPr>
       <w:r>
         <w:rPr>
-          <w:rFonts w:ascii="Calibri" w:hAnsi="Calibri" w:eastAsia="微软雅黑"/>
+          <w:rFonts w:ascii="Calibri" w:hAnsi="Calibri" w:eastAsia="Noto Sans CJK SC"/>
           <w:b w:val="0"/>
           <w:sz w:val="20"/>
         </w:rPr>
@@ -1354,7 +1710,7 @@
       </w:r>
       <w:r>
         <w:rPr>
-          <w:rFonts w:ascii="Calibri" w:hAnsi="Calibri" w:eastAsia="微软雅黑"/>
+          <w:rFonts w:ascii="Calibri" w:hAnsi="Calibri" w:eastAsia="Noto Sans CJK SC"/>
           <w:b w:val="0"/>
           <w:sz w:val="21"/>
         </w:rPr>
@@ -1370,7 +1726,7 @@
       </w:pPr>
       <w:r>
         <w:rPr>
-          <w:rFonts w:ascii="Calibri" w:hAnsi="Calibri" w:eastAsia="微软雅黑"/>
+          <w:rFonts w:ascii="Calibri" w:hAnsi="Calibri" w:eastAsia="Noto Sans CJK SC"/>
           <w:b w:val="0"/>
           <w:sz w:val="20"/>
         </w:rPr>
@@ -1378,7 +1734,7 @@
       </w:r>
       <w:r>
         <w:rPr>
-          <w:rFonts w:ascii="Calibri" w:hAnsi="Calibri" w:eastAsia="微软雅黑"/>
+          <w:rFonts w:ascii="Calibri" w:hAnsi="Calibri" w:eastAsia="Noto Sans CJK SC"/>
           <w:b w:val="0"/>
           <w:sz w:val="21"/>
         </w:rPr>
@@ -1394,7 +1750,7 @@
       </w:pPr>
       <w:r>
         <w:rPr>
-          <w:rFonts w:ascii="Calibri" w:hAnsi="Calibri" w:eastAsia="微软雅黑"/>
+          <w:rFonts w:ascii="Calibri" w:hAnsi="Calibri" w:eastAsia="Noto Sans CJK SC"/>
           <w:b w:val="0"/>
           <w:sz w:val="20"/>
         </w:rPr>
@@ -1402,7 +1758,7 @@
       </w:r>
       <w:r>
         <w:rPr>
-          <w:rFonts w:ascii="Calibri" w:hAnsi="Calibri" w:eastAsia="微软雅黑"/>
+          <w:rFonts w:ascii="Calibri" w:hAnsi="Calibri" w:eastAsia="Noto Sans CJK SC"/>
           <w:b w:val="0"/>
           <w:sz w:val="21"/>
         </w:rPr>
@@ -1418,7 +1774,7 @@
       </w:pPr>
       <w:r>
         <w:rPr>
-          <w:rFonts w:ascii="Calibri" w:hAnsi="Calibri" w:eastAsia="微软雅黑"/>
+          <w:rFonts w:ascii="Calibri" w:hAnsi="Calibri" w:eastAsia="Noto Sans CJK SC"/>
           <w:b w:val="0"/>
           <w:sz w:val="20"/>
         </w:rPr>
@@ -1426,7 +1782,7 @@
       </w:r>
       <w:r>
         <w:rPr>
-          <w:rFonts w:ascii="Calibri" w:hAnsi="Calibri" w:eastAsia="微软雅黑"/>
+          <w:rFonts w:ascii="Calibri" w:hAnsi="Calibri" w:eastAsia="Noto Sans CJK SC"/>
           <w:b/>
           <w:sz w:val="21"/>
         </w:rPr>
@@ -1434,7 +1790,7 @@
       </w:r>
       <w:r>
         <w:rPr>
-          <w:rFonts w:ascii="Calibri" w:hAnsi="Calibri" w:eastAsia="微软雅黑"/>
+          <w:rFonts w:ascii="Calibri" w:hAnsi="Calibri" w:eastAsia="Noto Sans CJK SC"/>
           <w:b w:val="0"/>
           <w:sz w:val="21"/>
         </w:rPr>
@@ -1443,13 +1799,13 @@
     </w:p>
     <w:p>
       <w:pPr>
-        <w:keepNext w:val="0"/>
+        <w:keepNext/>
         <w:keepLines/>
         <w:spacing w:before="100" w:after="20"/>
       </w:pPr>
       <w:r>
         <w:rPr>
-          <w:rFonts w:ascii="Calibri" w:hAnsi="Calibri" w:eastAsia="微软雅黑"/>
+          <w:rFonts w:ascii="Calibri" w:hAnsi="Calibri" w:eastAsia="Noto Sans CJK SC"/>
           <w:b/>
           <w:sz w:val="22"/>
         </w:rPr>
@@ -1457,7 +1813,7 @@
       </w:r>
       <w:r>
         <w:rPr>
-          <w:rFonts w:ascii="Calibri" w:hAnsi="Calibri" w:eastAsia="微软雅黑"/>
+          <w:rFonts w:ascii="Calibri" w:hAnsi="Calibri" w:eastAsia="Noto Sans CJK SC"/>
           <w:b w:val="0"/>
           <w:color w:val="666666"/>
           <w:sz w:val="19"/>
@@ -1466,7 +1822,7 @@
       </w:r>
       <w:r>
         <w:rPr>
-          <w:rFonts w:ascii="Calibri" w:hAnsi="Calibri" w:eastAsia="微软雅黑"/>
+          <w:rFonts w:ascii="Calibri" w:hAnsi="Calibri" w:eastAsia="Noto Sans CJK SC"/>
           <w:b w:val="0"/>
           <w:color w:val="666666"/>
           <w:sz w:val="19"/>
@@ -1483,7 +1839,7 @@
       </w:pPr>
       <w:r>
         <w:rPr>
-          <w:rFonts w:ascii="Calibri" w:hAnsi="Calibri" w:eastAsia="微软雅黑"/>
+          <w:rFonts w:ascii="Calibri" w:hAnsi="Calibri" w:eastAsia="Noto Sans CJK SC"/>
           <w:b w:val="0"/>
           <w:sz w:val="20"/>
         </w:rPr>
@@ -1491,7 +1847,7 @@
       </w:r>
       <w:r>
         <w:rPr>
-          <w:rFonts w:ascii="Calibri" w:hAnsi="Calibri" w:eastAsia="微软雅黑"/>
+          <w:rFonts w:ascii="Calibri" w:hAnsi="Calibri" w:eastAsia="Noto Sans CJK SC"/>
           <w:b/>
           <w:sz w:val="21"/>
         </w:rPr>
@@ -1499,7 +1855,7 @@
       </w:r>
       <w:r>
         <w:rPr>
-          <w:rFonts w:ascii="Calibri" w:hAnsi="Calibri" w:eastAsia="微软雅黑"/>
+          <w:rFonts w:ascii="Calibri" w:hAnsi="Calibri" w:eastAsia="Noto Sans CJK SC"/>
           <w:b w:val="0"/>
           <w:sz w:val="21"/>
         </w:rPr>
@@ -1515,7 +1871,7 @@
       </w:pPr>
       <w:r>
         <w:rPr>
-          <w:rFonts w:ascii="Calibri" w:hAnsi="Calibri" w:eastAsia="微软雅黑"/>
+          <w:rFonts w:ascii="Calibri" w:hAnsi="Calibri" w:eastAsia="Noto Sans CJK SC"/>
           <w:b w:val="0"/>
           <w:sz w:val="20"/>
         </w:rPr>
@@ -1523,7 +1879,7 @@
       </w:r>
       <w:r>
         <w:rPr>
-          <w:rFonts w:ascii="Calibri" w:hAnsi="Calibri" w:eastAsia="微软雅黑"/>
+          <w:rFonts w:ascii="Calibri" w:hAnsi="Calibri" w:eastAsia="Noto Sans CJK SC"/>
           <w:b w:val="0"/>
           <w:sz w:val="21"/>
         </w:rPr>
@@ -1539,7 +1895,7 @@
       </w:pPr>
       <w:r>
         <w:rPr>
-          <w:rFonts w:ascii="Calibri" w:hAnsi="Calibri" w:eastAsia="微软雅黑"/>
+          <w:rFonts w:ascii="Calibri" w:hAnsi="Calibri" w:eastAsia="Noto Sans CJK SC"/>
           <w:b w:val="0"/>
           <w:sz w:val="20"/>
         </w:rPr>
@@ -1547,7 +1903,7 @@
       </w:r>
       <w:r>
         <w:rPr>
-          <w:rFonts w:ascii="Calibri" w:hAnsi="Calibri" w:eastAsia="微软雅黑"/>
+          <w:rFonts w:ascii="Calibri" w:hAnsi="Calibri" w:eastAsia="Noto Sans CJK SC"/>
           <w:b w:val="0"/>
           <w:sz w:val="21"/>
         </w:rPr>
@@ -1563,7 +1919,7 @@
       </w:pPr>
       <w:r>
         <w:rPr>
-          <w:rFonts w:ascii="Calibri" w:hAnsi="Calibri" w:eastAsia="微软雅黑"/>
+          <w:rFonts w:ascii="Calibri" w:hAnsi="Calibri" w:eastAsia="Noto Sans CJK SC"/>
           <w:b w:val="0"/>
           <w:sz w:val="20"/>
         </w:rPr>
@@ -1571,7 +1927,7 @@
       </w:r>
       <w:r>
         <w:rPr>
-          <w:rFonts w:ascii="Calibri" w:hAnsi="Calibri" w:eastAsia="微软雅黑"/>
+          <w:rFonts w:ascii="Calibri" w:hAnsi="Calibri" w:eastAsia="Noto Sans CJK SC"/>
           <w:b w:val="0"/>
           <w:sz w:val="21"/>
         </w:rPr>
@@ -1587,7 +1943,7 @@
       </w:pPr>
       <w:r>
         <w:rPr>
-          <w:rFonts w:ascii="Calibri" w:hAnsi="Calibri" w:eastAsia="微软雅黑"/>
+          <w:rFonts w:ascii="Calibri" w:hAnsi="Calibri" w:eastAsia="Noto Sans CJK SC"/>
           <w:b w:val="0"/>
           <w:sz w:val="20"/>
         </w:rPr>
@@ -1595,7 +1951,7 @@
       </w:r>
       <w:r>
         <w:rPr>
-          <w:rFonts w:ascii="Calibri" w:hAnsi="Calibri" w:eastAsia="微软雅黑"/>
+          <w:rFonts w:ascii="Calibri" w:hAnsi="Calibri" w:eastAsia="Noto Sans CJK SC"/>
           <w:b/>
           <w:sz w:val="21"/>
         </w:rPr>
@@ -1603,7 +1959,7 @@
       </w:r>
       <w:r>
         <w:rPr>
-          <w:rFonts w:ascii="Calibri" w:hAnsi="Calibri" w:eastAsia="微软雅黑"/>
+          <w:rFonts w:ascii="Calibri" w:hAnsi="Calibri" w:eastAsia="Noto Sans CJK SC"/>
           <w:b w:val="0"/>
           <w:sz w:val="21"/>
         </w:rPr>
@@ -1612,13 +1968,13 @@
     </w:p>
     <w:p>
       <w:pPr>
-        <w:keepNext w:val="0"/>
+        <w:keepNext/>
         <w:keepLines/>
         <w:spacing w:before="100" w:after="20"/>
       </w:pPr>
       <w:r>
         <w:rPr>
-          <w:rFonts w:ascii="Calibri" w:hAnsi="Calibri" w:eastAsia="微软雅黑"/>
+          <w:rFonts w:ascii="Calibri" w:hAnsi="Calibri" w:eastAsia="Noto Sans CJK SC"/>
           <w:b/>
           <w:sz w:val="22"/>
         </w:rPr>
@@ -1626,7 +1982,7 @@
       </w:r>
       <w:r>
         <w:rPr>
-          <w:rFonts w:ascii="Calibri" w:hAnsi="Calibri" w:eastAsia="微软雅黑"/>
+          <w:rFonts w:ascii="Calibri" w:hAnsi="Calibri" w:eastAsia="Noto Sans CJK SC"/>
           <w:b w:val="0"/>
           <w:color w:val="666666"/>
           <w:sz w:val="19"/>
@@ -1635,7 +1991,7 @@
       </w:r>
       <w:r>
         <w:rPr>
-          <w:rFonts w:ascii="Calibri" w:hAnsi="Calibri" w:eastAsia="微软雅黑"/>
+          <w:rFonts w:ascii="Calibri" w:hAnsi="Calibri" w:eastAsia="Noto Sans CJK SC"/>
           <w:b w:val="0"/>
           <w:color w:val="666666"/>
           <w:sz w:val="19"/>
@@ -1652,7 +2008,7 @@
       </w:pPr>
       <w:r>
         <w:rPr>
-          <w:rFonts w:ascii="Calibri" w:hAnsi="Calibri" w:eastAsia="微软雅黑"/>
+          <w:rFonts w:ascii="Calibri" w:hAnsi="Calibri" w:eastAsia="Noto Sans CJK SC"/>
           <w:b w:val="0"/>
           <w:sz w:val="20"/>
         </w:rPr>
@@ -1660,7 +2016,7 @@
       </w:r>
       <w:r>
         <w:rPr>
-          <w:rFonts w:ascii="Calibri" w:hAnsi="Calibri" w:eastAsia="微软雅黑"/>
+          <w:rFonts w:ascii="Calibri" w:hAnsi="Calibri" w:eastAsia="Noto Sans CJK SC"/>
           <w:b/>
           <w:sz w:val="21"/>
         </w:rPr>
@@ -1668,7 +2024,7 @@
       </w:r>
       <w:r>
         <w:rPr>
-          <w:rFonts w:ascii="Calibri" w:hAnsi="Calibri" w:eastAsia="微软雅黑"/>
+          <w:rFonts w:ascii="Calibri" w:hAnsi="Calibri" w:eastAsia="Noto Sans CJK SC"/>
           <w:b w:val="0"/>
           <w:sz w:val="21"/>
         </w:rPr>
@@ -1684,7 +2040,7 @@
       </w:pPr>
       <w:r>
         <w:rPr>
-          <w:rFonts w:ascii="Calibri" w:hAnsi="Calibri" w:eastAsia="微软雅黑"/>
+          <w:rFonts w:ascii="Calibri" w:hAnsi="Calibri" w:eastAsia="Noto Sans CJK SC"/>
           <w:b w:val="0"/>
           <w:sz w:val="20"/>
         </w:rPr>
@@ -1692,7 +2048,7 @@
       </w:r>
       <w:r>
         <w:rPr>
-          <w:rFonts w:ascii="Calibri" w:hAnsi="Calibri" w:eastAsia="微软雅黑"/>
+          <w:rFonts w:ascii="Calibri" w:hAnsi="Calibri" w:eastAsia="Noto Sans CJK SC"/>
           <w:b w:val="0"/>
           <w:sz w:val="21"/>
         </w:rPr>
@@ -1708,7 +2064,7 @@
       </w:pPr>
       <w:r>
         <w:rPr>
-          <w:rFonts w:ascii="Calibri" w:hAnsi="Calibri" w:eastAsia="微软雅黑"/>
+          <w:rFonts w:ascii="Calibri" w:hAnsi="Calibri" w:eastAsia="Noto Sans CJK SC"/>
           <w:b w:val="0"/>
           <w:sz w:val="20"/>
         </w:rPr>
@@ -1716,7 +2072,7 @@
       </w:r>
       <w:r>
         <w:rPr>
-          <w:rFonts w:ascii="Calibri" w:hAnsi="Calibri" w:eastAsia="微软雅黑"/>
+          <w:rFonts w:ascii="Calibri" w:hAnsi="Calibri" w:eastAsia="Noto Sans CJK SC"/>
           <w:b w:val="0"/>
           <w:sz w:val="21"/>
         </w:rPr>
@@ -1732,7 +2088,7 @@
       </w:pPr>
       <w:r>
         <w:rPr>
-          <w:rFonts w:ascii="Calibri" w:hAnsi="Calibri" w:eastAsia="微软雅黑"/>
+          <w:rFonts w:ascii="Calibri" w:hAnsi="Calibri" w:eastAsia="Noto Sans CJK SC"/>
           <w:b w:val="0"/>
           <w:sz w:val="20"/>
         </w:rPr>
@@ -1740,7 +2096,7 @@
       </w:r>
       <w:r>
         <w:rPr>
-          <w:rFonts w:ascii="Calibri" w:hAnsi="Calibri" w:eastAsia="微软雅黑"/>
+          <w:rFonts w:ascii="Calibri" w:hAnsi="Calibri" w:eastAsia="Noto Sans CJK SC"/>
           <w:b w:val="0"/>
           <w:sz w:val="21"/>
         </w:rPr>
@@ -1756,7 +2112,7 @@
       </w:pPr>
       <w:r>
         <w:rPr>
-          <w:rFonts w:ascii="Calibri" w:hAnsi="Calibri" w:eastAsia="微软雅黑"/>
+          <w:rFonts w:ascii="Calibri" w:hAnsi="Calibri" w:eastAsia="Noto Sans CJK SC"/>
           <w:b w:val="0"/>
           <w:sz w:val="20"/>
         </w:rPr>
@@ -1764,7 +2120,7 @@
       </w:r>
       <w:r>
         <w:rPr>
-          <w:rFonts w:ascii="Calibri" w:hAnsi="Calibri" w:eastAsia="微软雅黑"/>
+          <w:rFonts w:ascii="Calibri" w:hAnsi="Calibri" w:eastAsia="Noto Sans CJK SC"/>
           <w:b/>
           <w:sz w:val="21"/>
         </w:rPr>
@@ -1772,7 +2128,7 @@
       </w:r>
       <w:r>
         <w:rPr>
-          <w:rFonts w:ascii="Calibri" w:hAnsi="Calibri" w:eastAsia="微软雅黑"/>
+          <w:rFonts w:ascii="Calibri" w:hAnsi="Calibri" w:eastAsia="Noto Sans CJK SC"/>
           <w:b w:val="0"/>
           <w:sz w:val="21"/>
         </w:rPr>
@@ -1781,6 +2137,7 @@
     </w:p>
     <w:p>
       <w:pPr>
+        <w:keepNext/>
         <w:spacing w:before="200" w:after="80"/>
         <w:pBdr>
           <w:left w:val="single" w:sz="18" w:color="1A1A1A"/>
@@ -1788,7 +2145,7 @@
       </w:pPr>
       <w:r>
         <w:rPr>
-          <w:rFonts w:ascii="Calibri" w:hAnsi="Calibri" w:eastAsia="微软雅黑"/>
+          <w:rFonts w:ascii="Calibri" w:hAnsi="Calibri" w:eastAsia="Noto Sans CJK SC"/>
           <w:b/>
           <w:color w:val="1A1A1A"/>
           <w:sz w:val="25"/>
@@ -1802,7 +2159,7 @@
       </w:pPr>
       <w:r>
         <w:rPr>
-          <w:rFonts w:ascii="Calibri" w:hAnsi="Calibri" w:eastAsia="微软雅黑"/>
+          <w:rFonts w:ascii="Calibri" w:hAnsi="Calibri" w:eastAsia="Noto Sans CJK SC"/>
           <w:b/>
           <w:sz w:val="21"/>
         </w:rPr>
@@ -2182,8 +2539,11 @@
     <w:name w:val="Normal"/>
     <w:qFormat/>
     <w:rsid w:val="00FC693F"/>
+    <w:pPr>
+      <w:spacing w:line="276" w:lineRule="auto" w:after="60"/>
+    </w:pPr>
     <w:rPr>
-      <w:rFonts w:ascii="Calibri" w:hAnsi="Calibri" w:eastAsia="微软雅黑"/>
+      <w:rFonts w:ascii="Calibri" w:hAnsi="Calibri" w:eastAsia="Noto Sans CJK SC"/>
       <w:sz w:val="21"/>
     </w:rPr>
   </w:style>

</xml_diff>

<commit_message>
Update resume with Chengfeng AOI experience and current location (#1)
</commit_message>
<xml_diff>
--- a/docs/秦宇-测试工程师.docx
+++ b/docs/秦宇-测试工程师.docx
@@ -4,11 +4,15 @@
   <w:body>
     <w:p>
       <w:pPr>
+        <w:pStyle w:val="Title"/>
+        <w:pBdr>
+          <w:bottom w:val="nil"/>
+        </w:pBdr>
         <w:spacing w:after="40"/>
       </w:pPr>
       <w:r>
         <w:rPr>
-          <w:rFonts w:ascii="Calibri" w:hAnsi="Calibri" w:eastAsia="微软雅黑"/>
+          <w:rFonts w:ascii="Calibri" w:hAnsi="Calibri" w:eastAsia="Noto Sans CJK SC"/>
           <w:b/>
           <w:color w:val="1A1A1A"/>
           <w:sz w:val="52"/>
@@ -22,12 +26,12 @@
       </w:pPr>
       <w:r>
         <w:rPr>
-          <w:rFonts w:ascii="Calibri" w:hAnsi="Calibri" w:eastAsia="微软雅黑"/>
+          <w:rFonts w:ascii="Calibri" w:hAnsi="Calibri" w:eastAsia="Noto Sans CJK SC"/>
           <w:b/>
-          <w:color w:val="0563C1"/>
+          <w:color w:val="1A1A1A"/>
           <w:sz w:val="22"/>
         </w:rPr>
-        <w:t>Test Development Engineer · AI Testing · Automation · ATE / Semiconductor · Windows Desktop Testing</w:t>
+        <w:t>Test Development Engineer · AI Testing · Automation · AOI / ATE · Windows Desktop Testing</w:t>
       </w:r>
     </w:p>
     <w:p>
@@ -36,7 +40,7 @@
       </w:pPr>
       <w:r>
         <w:rPr>
-          <w:rFonts w:ascii="Calibri" w:hAnsi="Calibri" w:eastAsia="微软雅黑"/>
+          <w:rFonts w:ascii="Calibri" w:hAnsi="Calibri" w:eastAsia="Noto Sans CJK SC"/>
           <w:b w:val="0"/>
           <w:color w:val="666666"/>
           <w:sz w:val="20"/>
@@ -45,7 +49,7 @@
       </w:r>
       <w:r>
         <w:rPr>
-          <w:rFonts w:ascii="Calibri" w:hAnsi="Calibri" w:eastAsia="微软雅黑"/>
+          <w:rFonts w:ascii="Calibri" w:hAnsi="Calibri" w:eastAsia="Noto Sans CJK SC"/>
           <w:b w:val="0"/>
           <w:sz w:val="20"/>
         </w:rPr>
@@ -53,7 +57,7 @@
       </w:r>
       <w:r>
         <w:rPr>
-          <w:rFonts w:ascii="Calibri" w:hAnsi="Calibri" w:eastAsia="微软雅黑"/>
+          <w:rFonts w:ascii="Calibri" w:hAnsi="Calibri" w:eastAsia="Noto Sans CJK SC"/>
           <w:b w:val="0"/>
           <w:color w:val="666666"/>
           <w:sz w:val="20"/>
@@ -63,7 +67,7 @@
       <w:hyperlink r:id="rId9">
         <w:r>
           <w:rPr>
-            <w:rFonts w:ascii="Calibri" w:eastAsia="微软雅黑"/>
+            <w:rFonts w:ascii="Calibri" w:eastAsia="Noto Sans CJK SC"/>
             <w:color w:val="0563C1"/>
             <w:u w:val="single"/>
           </w:rPr>
@@ -72,24 +76,24 @@
       </w:hyperlink>
       <w:r>
         <w:rPr>
-          <w:rFonts w:ascii="Calibri" w:hAnsi="Calibri" w:eastAsia="微软雅黑"/>
+          <w:rFonts w:ascii="Calibri" w:hAnsi="Calibri" w:eastAsia="Noto Sans CJK SC"/>
           <w:b w:val="0"/>
           <w:color w:val="666666"/>
           <w:sz w:val="20"/>
         </w:rPr>
-        <w:t xml:space="preserve"> ｜ 本科 · 软件工程 · 1 年+测试 / 测试开发经验 ｜ 期望城市：</w:t>
+        <w:t xml:space="preserve"> ｜ 本科 · 软件工程 · 1 年+测试 / 测试开发经验 ｜ 现居：</w:t>
       </w:r>
       <w:r>
         <w:rPr>
-          <w:rFonts w:ascii="Calibri" w:hAnsi="Calibri" w:eastAsia="微软雅黑"/>
+          <w:rFonts w:ascii="Calibri" w:hAnsi="Calibri" w:eastAsia="Noto Sans CJK SC"/>
           <w:b w:val="0"/>
           <w:sz w:val="20"/>
         </w:rPr>
-        <w:t>深圳</w:t>
+        <w:t>珠海</w:t>
       </w:r>
       <w:r>
         <w:rPr>
-          <w:rFonts w:ascii="Calibri" w:hAnsi="Calibri" w:eastAsia="微软雅黑"/>
+          <w:rFonts w:ascii="Calibri" w:hAnsi="Calibri" w:eastAsia="Noto Sans CJK SC"/>
           <w:b w:val="0"/>
           <w:color w:val="666666"/>
           <w:sz w:val="20"/>
@@ -98,7 +102,7 @@
       </w:r>
       <w:r>
         <w:rPr>
-          <w:rFonts w:ascii="Calibri" w:hAnsi="Calibri" w:eastAsia="微软雅黑"/>
+          <w:rFonts w:ascii="Calibri" w:hAnsi="Calibri" w:eastAsia="Noto Sans CJK SC"/>
           <w:b w:val="0"/>
           <w:sz w:val="20"/>
         </w:rPr>
@@ -111,7 +115,7 @@
       </w:pPr>
       <w:r>
         <w:rPr>
-          <w:rFonts w:ascii="Calibri" w:hAnsi="Calibri" w:eastAsia="微软雅黑"/>
+          <w:rFonts w:ascii="Calibri" w:hAnsi="Calibri" w:eastAsia="Noto Sans CJK SC"/>
           <w:b w:val="0"/>
           <w:color w:val="666666"/>
           <w:sz w:val="20"/>
@@ -121,7 +125,7 @@
       <w:hyperlink r:id="rId10">
         <w:r>
           <w:rPr>
-            <w:rFonts w:ascii="Calibri" w:eastAsia="微软雅黑"/>
+            <w:rFonts w:ascii="Calibri" w:eastAsia="Noto Sans CJK SC"/>
             <w:color w:val="0563C1"/>
             <w:u w:val="single"/>
           </w:rPr>
@@ -143,7 +147,7 @@
       </w:pPr>
       <w:r>
         <w:rPr>
-          <w:rFonts w:ascii="Calibri" w:hAnsi="Calibri" w:eastAsia="微软雅黑"/>
+          <w:rFonts w:ascii="Calibri" w:hAnsi="Calibri" w:eastAsia="Noto Sans CJK SC"/>
           <w:b/>
           <w:sz w:val="21"/>
         </w:rPr>
@@ -151,15 +155,16 @@
       </w:r>
       <w:r>
         <w:rPr>
-          <w:rFonts w:ascii="Calibri" w:hAnsi="Calibri" w:eastAsia="微软雅黑"/>
+          <w:rFonts w:ascii="Calibri" w:hAnsi="Calibri" w:eastAsia="Noto Sans CJK SC"/>
           <w:b w:val="0"/>
           <w:sz w:val="21"/>
         </w:rPr>
-        <w:t>专注软件测试开发、AI 应用测试与半导体 ATE 上位机测试。 现于半导体芯片测试机上市公司负责 ATE 上位机软件测试（黑盒 + UI 自动化）；此前在 AI 智能体与低代码平台独立完成 1000+ 用例与 50+ 核心 API 自动巡检。</w:t>
+        <w:t>专注软件测试开发、AI 应用测试与半导体设备软件测试。 软件工程本科，1 年+测试 / 测试开发经验。目前在珠海诚锋科技从事半导体 AOI 设备软件测试，此前参与 ATE 上位机测试与 AI 智能体平台测试，积累 1000+ 用例与 50+ 核心 API 自动巡检实践。结合接口、SQL 与日志定位问题，持续推进测试自动化。</w:t>
       </w:r>
     </w:p>
     <w:p>
       <w:pPr>
+        <w:keepNext/>
         <w:spacing w:before="200" w:after="80"/>
         <w:pBdr>
           <w:left w:val="single" w:sz="18" w:color="1A1A1A"/>
@@ -167,7 +172,7 @@
       </w:pPr>
       <w:r>
         <w:rPr>
-          <w:rFonts w:ascii="Calibri" w:hAnsi="Calibri" w:eastAsia="微软雅黑"/>
+          <w:rFonts w:ascii="Calibri" w:hAnsi="Calibri" w:eastAsia="Noto Sans CJK SC"/>
           <w:b/>
           <w:color w:val="1A1A1A"/>
           <w:sz w:val="25"/>
@@ -184,7 +189,7 @@
       </w:pPr>
       <w:r>
         <w:rPr>
-          <w:rFonts w:ascii="Calibri" w:hAnsi="Calibri" w:eastAsia="微软雅黑"/>
+          <w:rFonts w:ascii="Calibri" w:hAnsi="Calibri" w:eastAsia="Noto Sans CJK SC"/>
           <w:b w:val="0"/>
           <w:sz w:val="20"/>
         </w:rPr>
@@ -192,7 +197,7 @@
       </w:r>
       <w:r>
         <w:rPr>
-          <w:rFonts w:ascii="Calibri" w:hAnsi="Calibri" w:eastAsia="微软雅黑"/>
+          <w:rFonts w:ascii="Calibri" w:hAnsi="Calibri" w:eastAsia="Noto Sans CJK SC"/>
           <w:b w:val="0"/>
           <w:sz w:val="21"/>
         </w:rPr>
@@ -208,7 +213,7 @@
       </w:pPr>
       <w:r>
         <w:rPr>
-          <w:rFonts w:ascii="Calibri" w:hAnsi="Calibri" w:eastAsia="微软雅黑"/>
+          <w:rFonts w:ascii="Calibri" w:hAnsi="Calibri" w:eastAsia="Noto Sans CJK SC"/>
           <w:b w:val="0"/>
           <w:sz w:val="20"/>
         </w:rPr>
@@ -216,7 +221,7 @@
       </w:r>
       <w:r>
         <w:rPr>
-          <w:rFonts w:ascii="Calibri" w:hAnsi="Calibri" w:eastAsia="微软雅黑"/>
+          <w:rFonts w:ascii="Calibri" w:hAnsi="Calibri" w:eastAsia="Noto Sans CJK SC"/>
           <w:b w:val="0"/>
           <w:sz w:val="21"/>
         </w:rPr>
@@ -232,7 +237,7 @@
       </w:pPr>
       <w:r>
         <w:rPr>
-          <w:rFonts w:ascii="Calibri" w:hAnsi="Calibri" w:eastAsia="微软雅黑"/>
+          <w:rFonts w:ascii="Calibri" w:hAnsi="Calibri" w:eastAsia="Noto Sans CJK SC"/>
           <w:b w:val="0"/>
           <w:sz w:val="20"/>
         </w:rPr>
@@ -240,7 +245,7 @@
       </w:r>
       <w:r>
         <w:rPr>
-          <w:rFonts w:ascii="Calibri" w:hAnsi="Calibri" w:eastAsia="微软雅黑"/>
+          <w:rFonts w:ascii="Calibri" w:hAnsi="Calibri" w:eastAsia="Noto Sans CJK SC"/>
           <w:b w:val="0"/>
           <w:sz w:val="21"/>
         </w:rPr>
@@ -256,7 +261,7 @@
       </w:pPr>
       <w:r>
         <w:rPr>
-          <w:rFonts w:ascii="Calibri" w:hAnsi="Calibri" w:eastAsia="微软雅黑"/>
+          <w:rFonts w:ascii="Calibri" w:hAnsi="Calibri" w:eastAsia="Noto Sans CJK SC"/>
           <w:b w:val="0"/>
           <w:sz w:val="20"/>
         </w:rPr>
@@ -264,15 +269,16 @@
       </w:r>
       <w:r>
         <w:rPr>
-          <w:rFonts w:ascii="Calibri" w:hAnsi="Calibri" w:eastAsia="微软雅黑"/>
+          <w:rFonts w:ascii="Calibri" w:hAnsi="Calibri" w:eastAsia="Noto Sans CJK SC"/>
           <w:b w:val="0"/>
           <w:sz w:val="21"/>
         </w:rPr>
-        <w:t>1 年+ 测试 / 测试开发经验（软件测试 → 测试开发 → ATE）</w:t>
+        <w:t>1 年+ 测试 / 测试开发经验（AI 应用测试 · ATE 上位机 · AOI 设备软件）</w:t>
       </w:r>
     </w:p>
     <w:p>
       <w:pPr>
+        <w:keepNext/>
         <w:spacing w:before="200" w:after="80"/>
         <w:pBdr>
           <w:left w:val="single" w:sz="18" w:color="1A1A1A"/>
@@ -280,7 +286,7 @@
       </w:pPr>
       <w:r>
         <w:rPr>
-          <w:rFonts w:ascii="Calibri" w:hAnsi="Calibri" w:eastAsia="微软雅黑"/>
+          <w:rFonts w:ascii="Calibri" w:hAnsi="Calibri" w:eastAsia="Noto Sans CJK SC"/>
           <w:b/>
           <w:color w:val="1A1A1A"/>
           <w:sz w:val="25"/>
@@ -296,7 +302,7 @@
       </w:pPr>
       <w:r>
         <w:rPr>
-          <w:rFonts w:ascii="Calibri" w:hAnsi="Calibri" w:eastAsia="微软雅黑"/>
+          <w:rFonts w:ascii="Calibri" w:hAnsi="Calibri" w:eastAsia="Noto Sans CJK SC"/>
           <w:b/>
           <w:sz w:val="21"/>
         </w:rPr>
@@ -304,7 +310,7 @@
       </w:r>
       <w:r>
         <w:rPr>
-          <w:rFonts w:ascii="Calibri" w:hAnsi="Calibri" w:eastAsia="微软雅黑"/>
+          <w:rFonts w:ascii="Calibri" w:hAnsi="Calibri" w:eastAsia="Noto Sans CJK SC"/>
           <w:b w:val="0"/>
           <w:color w:val="666666"/>
           <w:sz w:val="19"/>
@@ -313,7 +319,7 @@
       </w:r>
       <w:r>
         <w:rPr>
-          <w:rFonts w:ascii="Calibri" w:hAnsi="Calibri" w:eastAsia="微软雅黑"/>
+          <w:rFonts w:ascii="Calibri" w:hAnsi="Calibri" w:eastAsia="Noto Sans CJK SC"/>
           <w:b w:val="0"/>
           <w:sz w:val="21"/>
         </w:rPr>
@@ -328,7 +334,7 @@
       </w:pPr>
       <w:r>
         <w:rPr>
-          <w:rFonts w:ascii="Calibri" w:hAnsi="Calibri" w:eastAsia="微软雅黑"/>
+          <w:rFonts w:ascii="Calibri" w:hAnsi="Calibri" w:eastAsia="Noto Sans CJK SC"/>
           <w:b/>
           <w:sz w:val="21"/>
         </w:rPr>
@@ -336,7 +342,7 @@
       </w:r>
       <w:r>
         <w:rPr>
-          <w:rFonts w:ascii="Calibri" w:hAnsi="Calibri" w:eastAsia="微软雅黑"/>
+          <w:rFonts w:ascii="Calibri" w:hAnsi="Calibri" w:eastAsia="Noto Sans CJK SC"/>
           <w:b w:val="0"/>
           <w:color w:val="666666"/>
           <w:sz w:val="19"/>
@@ -345,7 +351,7 @@
       </w:r>
       <w:r>
         <w:rPr>
-          <w:rFonts w:ascii="Calibri" w:hAnsi="Calibri" w:eastAsia="微软雅黑"/>
+          <w:rFonts w:ascii="Calibri" w:hAnsi="Calibri" w:eastAsia="Noto Sans CJK SC"/>
           <w:b w:val="0"/>
           <w:sz w:val="21"/>
         </w:rPr>
@@ -360,7 +366,7 @@
       </w:pPr>
       <w:r>
         <w:rPr>
-          <w:rFonts w:ascii="Calibri" w:hAnsi="Calibri" w:eastAsia="微软雅黑"/>
+          <w:rFonts w:ascii="Calibri" w:hAnsi="Calibri" w:eastAsia="Noto Sans CJK SC"/>
           <w:b/>
           <w:sz w:val="21"/>
         </w:rPr>
@@ -368,7 +374,7 @@
       </w:r>
       <w:r>
         <w:rPr>
-          <w:rFonts w:ascii="Calibri" w:hAnsi="Calibri" w:eastAsia="微软雅黑"/>
+          <w:rFonts w:ascii="Calibri" w:hAnsi="Calibri" w:eastAsia="Noto Sans CJK SC"/>
           <w:b w:val="0"/>
           <w:color w:val="666666"/>
           <w:sz w:val="19"/>
@@ -377,7 +383,7 @@
       </w:r>
       <w:r>
         <w:rPr>
-          <w:rFonts w:ascii="Calibri" w:hAnsi="Calibri" w:eastAsia="微软雅黑"/>
+          <w:rFonts w:ascii="Calibri" w:hAnsi="Calibri" w:eastAsia="Noto Sans CJK SC"/>
           <w:b w:val="0"/>
           <w:sz w:val="21"/>
         </w:rPr>
@@ -392,7 +398,7 @@
       </w:pPr>
       <w:r>
         <w:rPr>
-          <w:rFonts w:ascii="Calibri" w:hAnsi="Calibri" w:eastAsia="微软雅黑"/>
+          <w:rFonts w:ascii="Calibri" w:hAnsi="Calibri" w:eastAsia="Noto Sans CJK SC"/>
           <w:b/>
           <w:sz w:val="21"/>
         </w:rPr>
@@ -400,7 +406,7 @@
       </w:r>
       <w:r>
         <w:rPr>
-          <w:rFonts w:ascii="Calibri" w:hAnsi="Calibri" w:eastAsia="微软雅黑"/>
+          <w:rFonts w:ascii="Calibri" w:hAnsi="Calibri" w:eastAsia="Noto Sans CJK SC"/>
           <w:b w:val="0"/>
           <w:color w:val="666666"/>
           <w:sz w:val="19"/>
@@ -409,7 +415,7 @@
       </w:r>
       <w:r>
         <w:rPr>
-          <w:rFonts w:ascii="Calibri" w:hAnsi="Calibri" w:eastAsia="微软雅黑"/>
+          <w:rFonts w:ascii="Calibri" w:hAnsi="Calibri" w:eastAsia="Noto Sans CJK SC"/>
           <w:b w:val="0"/>
           <w:sz w:val="21"/>
         </w:rPr>
@@ -424,15 +430,15 @@
       </w:pPr>
       <w:r>
         <w:rPr>
-          <w:rFonts w:ascii="Calibri" w:hAnsi="Calibri" w:eastAsia="微软雅黑"/>
+          <w:rFonts w:ascii="Calibri" w:hAnsi="Calibri" w:eastAsia="Noto Sans CJK SC"/>
           <w:b/>
           <w:sz w:val="21"/>
         </w:rPr>
-        <w:t xml:space="preserve">Desktop Testing </w:t>
+        <w:t xml:space="preserve">AOI Equipment Testing </w:t>
       </w:r>
       <w:r>
         <w:rPr>
-          <w:rFonts w:ascii="Calibri" w:hAnsi="Calibri" w:eastAsia="微软雅黑"/>
+          <w:rFonts w:ascii="Calibri" w:hAnsi="Calibri" w:eastAsia="Noto Sans CJK SC"/>
           <w:b w:val="0"/>
           <w:color w:val="666666"/>
           <w:sz w:val="19"/>
@@ -441,7 +447,39 @@
       </w:r>
       <w:r>
         <w:rPr>
-          <w:rFonts w:ascii="Calibri" w:hAnsi="Calibri" w:eastAsia="微软雅黑"/>
+          <w:rFonts w:ascii="Calibri" w:hAnsi="Calibri" w:eastAsia="Noto Sans CJK SC"/>
+          <w:b w:val="0"/>
+          <w:sz w:val="21"/>
+        </w:rPr>
+        <w:t>设备操作流程 / 检测模板 / 建模 / 成像完整性检查 / 测试记录 / 问题跟踪</w:t>
+      </w:r>
+    </w:p>
+    <w:p>
+      <w:pPr>
+        <w:keepNext w:val="0"/>
+        <w:keepLines/>
+        <w:spacing w:after="40"/>
+      </w:pPr>
+      <w:r>
+        <w:rPr>
+          <w:rFonts w:ascii="Calibri" w:hAnsi="Calibri" w:eastAsia="Noto Sans CJK SC"/>
+          <w:b/>
+          <w:sz w:val="21"/>
+        </w:rPr>
+        <w:t xml:space="preserve">Desktop Testing </w:t>
+      </w:r>
+      <w:r>
+        <w:rPr>
+          <w:rFonts w:ascii="Calibri" w:hAnsi="Calibri" w:eastAsia="Noto Sans CJK SC"/>
+          <w:b w:val="0"/>
+          <w:color w:val="666666"/>
+          <w:sz w:val="19"/>
+        </w:rPr>
+        <w:t xml:space="preserve">（项目实践） </w:t>
+      </w:r>
+      <w:r>
+        <w:rPr>
+          <w:rFonts w:ascii="Calibri" w:hAnsi="Calibri" w:eastAsia="Noto Sans CJK SC"/>
           <w:b w:val="0"/>
           <w:sz w:val="21"/>
         </w:rPr>
@@ -456,7 +494,7 @@
       </w:pPr>
       <w:r>
         <w:rPr>
-          <w:rFonts w:ascii="Calibri" w:hAnsi="Calibri" w:eastAsia="微软雅黑"/>
+          <w:rFonts w:ascii="Calibri" w:hAnsi="Calibri" w:eastAsia="Noto Sans CJK SC"/>
           <w:b/>
           <w:sz w:val="21"/>
         </w:rPr>
@@ -464,7 +502,7 @@
       </w:r>
       <w:r>
         <w:rPr>
-          <w:rFonts w:ascii="Calibri" w:hAnsi="Calibri" w:eastAsia="微软雅黑"/>
+          <w:rFonts w:ascii="Calibri" w:hAnsi="Calibri" w:eastAsia="Noto Sans CJK SC"/>
           <w:b w:val="0"/>
           <w:color w:val="666666"/>
           <w:sz w:val="19"/>
@@ -473,7 +511,7 @@
       </w:r>
       <w:r>
         <w:rPr>
-          <w:rFonts w:ascii="Calibri" w:hAnsi="Calibri" w:eastAsia="微软雅黑"/>
+          <w:rFonts w:ascii="Calibri" w:hAnsi="Calibri" w:eastAsia="Noto Sans CJK SC"/>
           <w:b w:val="0"/>
           <w:sz w:val="21"/>
         </w:rPr>
@@ -488,7 +526,7 @@
       </w:pPr>
       <w:r>
         <w:rPr>
-          <w:rFonts w:ascii="Calibri" w:hAnsi="Calibri" w:eastAsia="微软雅黑"/>
+          <w:rFonts w:ascii="Calibri" w:hAnsi="Calibri" w:eastAsia="Noto Sans CJK SC"/>
           <w:b/>
           <w:sz w:val="21"/>
         </w:rPr>
@@ -496,7 +534,7 @@
       </w:r>
       <w:r>
         <w:rPr>
-          <w:rFonts w:ascii="Calibri" w:hAnsi="Calibri" w:eastAsia="微软雅黑"/>
+          <w:rFonts w:ascii="Calibri" w:hAnsi="Calibri" w:eastAsia="Noto Sans CJK SC"/>
           <w:b w:val="0"/>
           <w:color w:val="666666"/>
           <w:sz w:val="19"/>
@@ -505,7 +543,7 @@
       </w:r>
       <w:r>
         <w:rPr>
-          <w:rFonts w:ascii="Calibri" w:hAnsi="Calibri" w:eastAsia="微软雅黑"/>
+          <w:rFonts w:ascii="Calibri" w:hAnsi="Calibri" w:eastAsia="Noto Sans CJK SC"/>
           <w:b w:val="0"/>
           <w:sz w:val="21"/>
         </w:rPr>
@@ -520,7 +558,7 @@
       </w:pPr>
       <w:r>
         <w:rPr>
-          <w:rFonts w:ascii="Calibri" w:hAnsi="Calibri" w:eastAsia="微软雅黑"/>
+          <w:rFonts w:ascii="Calibri" w:hAnsi="Calibri" w:eastAsia="Noto Sans CJK SC"/>
           <w:b/>
           <w:sz w:val="21"/>
         </w:rPr>
@@ -528,7 +566,7 @@
       </w:r>
       <w:r>
         <w:rPr>
-          <w:rFonts w:ascii="Calibri" w:hAnsi="Calibri" w:eastAsia="微软雅黑"/>
+          <w:rFonts w:ascii="Calibri" w:hAnsi="Calibri" w:eastAsia="Noto Sans CJK SC"/>
           <w:b w:val="0"/>
           <w:color w:val="666666"/>
           <w:sz w:val="19"/>
@@ -537,7 +575,7 @@
       </w:r>
       <w:r>
         <w:rPr>
-          <w:rFonts w:ascii="Calibri" w:hAnsi="Calibri" w:eastAsia="微软雅黑"/>
+          <w:rFonts w:ascii="Calibri" w:hAnsi="Calibri" w:eastAsia="Noto Sans CJK SC"/>
           <w:b w:val="0"/>
           <w:sz w:val="21"/>
         </w:rPr>
@@ -552,7 +590,7 @@
       </w:pPr>
       <w:r>
         <w:rPr>
-          <w:rFonts w:ascii="Calibri" w:hAnsi="Calibri" w:eastAsia="微软雅黑"/>
+          <w:rFonts w:ascii="Calibri" w:hAnsi="Calibri" w:eastAsia="Noto Sans CJK SC"/>
           <w:b/>
           <w:sz w:val="21"/>
         </w:rPr>
@@ -560,7 +598,7 @@
       </w:r>
       <w:r>
         <w:rPr>
-          <w:rFonts w:ascii="Calibri" w:hAnsi="Calibri" w:eastAsia="微软雅黑"/>
+          <w:rFonts w:ascii="Calibri" w:hAnsi="Calibri" w:eastAsia="Noto Sans CJK SC"/>
           <w:b w:val="0"/>
           <w:color w:val="666666"/>
           <w:sz w:val="19"/>
@@ -569,7 +607,7 @@
       </w:r>
       <w:r>
         <w:rPr>
-          <w:rFonts w:ascii="Calibri" w:hAnsi="Calibri" w:eastAsia="微软雅黑"/>
+          <w:rFonts w:ascii="Calibri" w:hAnsi="Calibri" w:eastAsia="Noto Sans CJK SC"/>
           <w:b w:val="0"/>
           <w:sz w:val="21"/>
         </w:rPr>
@@ -578,6 +616,7 @@
     </w:p>
     <w:p>
       <w:pPr>
+        <w:keepNext/>
         <w:spacing w:before="200" w:after="80"/>
         <w:pBdr>
           <w:left w:val="single" w:sz="18" w:color="1A1A1A"/>
@@ -585,7 +624,7 @@
       </w:pPr>
       <w:r>
         <w:rPr>
-          <w:rFonts w:ascii="Calibri" w:hAnsi="Calibri" w:eastAsia="微软雅黑"/>
+          <w:rFonts w:ascii="Calibri" w:hAnsi="Calibri" w:eastAsia="Noto Sans CJK SC"/>
           <w:b/>
           <w:color w:val="1A1A1A"/>
           <w:sz w:val="25"/>
@@ -595,13 +634,157 @@
     </w:p>
     <w:p>
       <w:pPr>
-        <w:keepNext w:val="0"/>
+        <w:keepNext/>
         <w:keepLines/>
         <w:spacing w:before="100" w:after="20"/>
       </w:pPr>
       <w:r>
         <w:rPr>
-          <w:rFonts w:ascii="Calibri" w:hAnsi="Calibri" w:eastAsia="微软雅黑"/>
+          <w:rFonts w:ascii="Calibri" w:hAnsi="Calibri" w:eastAsia="Noto Sans CJK SC"/>
+          <w:b/>
+          <w:sz w:val="23"/>
+        </w:rPr>
+        <w:t xml:space="preserve">珠海诚锋电子科技有限公司　</w:t>
+      </w:r>
+      <w:r>
+        <w:rPr>
+          <w:rFonts w:ascii="Calibri" w:hAnsi="Calibri" w:eastAsia="Noto Sans CJK SC"/>
+          <w:b w:val="0"/>
+          <w:color w:val="666666"/>
+          <w:sz w:val="19"/>
+        </w:rPr>
+        <w:t xml:space="preserve">[测试工程师]　</w:t>
+      </w:r>
+      <w:r>
+        <w:rPr>
+          <w:rFonts w:ascii="Calibri" w:hAnsi="Calibri" w:eastAsia="Noto Sans CJK SC"/>
+          <w:b w:val="0"/>
+          <w:color w:val="666666"/>
+          <w:sz w:val="19"/>
+        </w:rPr>
+        <w:t>2026.09.28 — 至今</w:t>
+      </w:r>
+    </w:p>
+    <w:p>
+      <w:pPr>
+        <w:keepNext/>
+        <w:spacing w:after="40"/>
+      </w:pPr>
+      <w:r>
+        <w:rPr>
+          <w:rFonts w:ascii="Calibri" w:hAnsi="Calibri" w:eastAsia="Noto Sans CJK SC"/>
+          <w:b w:val="0"/>
+          <w:color w:val="666666"/>
+          <w:sz w:val="19"/>
+        </w:rPr>
+        <w:t>半导体 AOI 光学检测设备 · 设备软件测试</w:t>
+      </w:r>
+    </w:p>
+    <w:p>
+      <w:pPr>
+        <w:keepNext w:val="0"/>
+        <w:keepLines/>
+        <w:spacing w:after="40"/>
+        <w:ind w:left="283"/>
+      </w:pPr>
+      <w:r>
+        <w:rPr>
+          <w:rFonts w:ascii="Calibri" w:hAnsi="Calibri" w:eastAsia="Noto Sans CJK SC"/>
+          <w:b w:val="0"/>
+          <w:sz w:val="20"/>
+        </w:rPr>
+        <w:t xml:space="preserve">▪ </w:t>
+      </w:r>
+      <w:r>
+        <w:rPr>
+          <w:rFonts w:ascii="Calibri" w:hAnsi="Calibri" w:eastAsia="Noto Sans CJK SC"/>
+          <w:b/>
+          <w:sz w:val="21"/>
+        </w:rPr>
+        <w:t>设备流程梳理：</w:t>
+      </w:r>
+      <w:r>
+        <w:rPr>
+          <w:rFonts w:ascii="Calibri" w:hAnsi="Calibri" w:eastAsia="Noto Sans CJK SC"/>
+          <w:b w:val="0"/>
+          <w:sz w:val="21"/>
+        </w:rPr>
+        <w:t>结合设备作业指导书与软件功能清单，梳理操作流程、功能入口和测试关注点，逐步建立设备软件测试清单。</w:t>
+      </w:r>
+    </w:p>
+    <w:p>
+      <w:pPr>
+        <w:keepNext w:val="0"/>
+        <w:keepLines/>
+        <w:spacing w:after="40"/>
+        <w:ind w:left="283"/>
+      </w:pPr>
+      <w:r>
+        <w:rPr>
+          <w:rFonts w:ascii="Calibri" w:hAnsi="Calibri" w:eastAsia="Noto Sans CJK SC"/>
+          <w:b w:val="0"/>
+          <w:sz w:val="20"/>
+        </w:rPr>
+        <w:t xml:space="preserve">▪ </w:t>
+      </w:r>
+      <w:r>
+        <w:rPr>
+          <w:rFonts w:ascii="Calibri" w:hAnsi="Calibri" w:eastAsia="Noto Sans CJK SC"/>
+          <w:b/>
+          <w:sz w:val="21"/>
+        </w:rPr>
+        <w:t>建模与检测记录：</w:t>
+      </w:r>
+      <w:r>
+        <w:rPr>
+          <w:rFonts w:ascii="Calibri" w:hAnsi="Calibri" w:eastAsia="Noto Sans CJK SC"/>
+          <w:b w:val="0"/>
+          <w:sz w:val="21"/>
+        </w:rPr>
+        <w:t>参与 MPW 晶圆建模流程学习与检测验证，整理截图和检测记录，关注拍摄位置偏移、Die 成像不完整等影响检测覆盖的问题。</w:t>
+      </w:r>
+    </w:p>
+    <w:p>
+      <w:pPr>
+        <w:keepNext w:val="0"/>
+        <w:keepLines/>
+        <w:spacing w:after="40"/>
+        <w:ind w:left="283"/>
+      </w:pPr>
+      <w:r>
+        <w:rPr>
+          <w:rFonts w:ascii="Calibri" w:hAnsi="Calibri" w:eastAsia="Noto Sans CJK SC"/>
+          <w:b w:val="0"/>
+          <w:sz w:val="20"/>
+        </w:rPr>
+        <w:t xml:space="preserve">▪ </w:t>
+      </w:r>
+      <w:r>
+        <w:rPr>
+          <w:rFonts w:ascii="Calibri" w:hAnsi="Calibri" w:eastAsia="Noto Sans CJK SC"/>
+          <w:b/>
+          <w:sz w:val="21"/>
+        </w:rPr>
+        <w:t>测试管理工具：</w:t>
+      </w:r>
+      <w:r>
+        <w:rPr>
+          <w:rFonts w:ascii="Calibri" w:hAnsi="Calibri" w:eastAsia="Noto Sans CJK SC"/>
+          <w:b w:val="0"/>
+          <w:sz w:val="21"/>
+        </w:rPr>
+        <w:t>推进轻量测试管理系统的需求与交互设计，按项目、软件版本、功能模块组织问题，完善进度说明、附件及测试用例管理。</w:t>
+      </w:r>
+    </w:p>
+    <w:p>
+      <w:pPr>
+        <w:keepNext/>
+        <w:keepLines/>
+        <w:spacing w:before="100" w:after="20"/>
+      </w:pPr>
+      <w:r>
+        <w:rPr>
+          <w:rFonts w:ascii="Calibri" w:hAnsi="Calibri" w:eastAsia="Noto Sans CJK SC"/>
           <w:b/>
           <w:sz w:val="23"/>
         </w:rPr>
@@ -609,30 +792,31 @@
       </w:r>
       <w:r>
         <w:rPr>
-          <w:rFonts w:ascii="Calibri" w:hAnsi="Calibri" w:eastAsia="微软雅黑"/>
+          <w:rFonts w:ascii="Calibri" w:hAnsi="Calibri" w:eastAsia="Noto Sans CJK SC"/>
           <w:b w:val="0"/>
           <w:color w:val="666666"/>
           <w:sz w:val="19"/>
         </w:rPr>
-        <w:t xml:space="preserve">[软件测试]　</w:t>
+        <w:t xml:space="preserve">[软件测试助理工程师]　</w:t>
       </w:r>
       <w:r>
         <w:rPr>
-          <w:rFonts w:ascii="Calibri" w:hAnsi="Calibri" w:eastAsia="微软雅黑"/>
+          <w:rFonts w:ascii="Calibri" w:hAnsi="Calibri" w:eastAsia="Noto Sans CJK SC"/>
           <w:b w:val="0"/>
           <w:color w:val="666666"/>
           <w:sz w:val="19"/>
         </w:rPr>
-        <w:t>2026.07 — 至今</w:t>
+        <w:t>2026.07 — 2026.09</w:t>
       </w:r>
     </w:p>
     <w:p>
       <w:pPr>
+        <w:keepNext/>
         <w:spacing w:after="40"/>
       </w:pPr>
       <w:r>
         <w:rPr>
-          <w:rFonts w:ascii="Calibri" w:hAnsi="Calibri" w:eastAsia="微软雅黑"/>
+          <w:rFonts w:ascii="Calibri" w:hAnsi="Calibri" w:eastAsia="Noto Sans CJK SC"/>
           <w:b w:val="0"/>
           <w:color w:val="666666"/>
           <w:sz w:val="19"/>
@@ -649,7 +833,7 @@
       </w:pPr>
       <w:r>
         <w:rPr>
-          <w:rFonts w:ascii="Calibri" w:hAnsi="Calibri" w:eastAsia="微软雅黑"/>
+          <w:rFonts w:ascii="Calibri" w:hAnsi="Calibri" w:eastAsia="Noto Sans CJK SC"/>
           <w:b w:val="0"/>
           <w:sz w:val="20"/>
         </w:rPr>
@@ -657,7 +841,7 @@
       </w:r>
       <w:r>
         <w:rPr>
-          <w:rFonts w:ascii="Calibri" w:hAnsi="Calibri" w:eastAsia="微软雅黑"/>
+          <w:rFonts w:ascii="Calibri" w:hAnsi="Calibri" w:eastAsia="Noto Sans CJK SC"/>
           <w:b/>
           <w:sz w:val="21"/>
         </w:rPr>
@@ -665,7 +849,7 @@
       </w:r>
       <w:r>
         <w:rPr>
-          <w:rFonts w:ascii="Calibri" w:hAnsi="Calibri" w:eastAsia="微软雅黑"/>
+          <w:rFonts w:ascii="Calibri" w:hAnsi="Calibri" w:eastAsia="Noto Sans CJK SC"/>
           <w:b w:val="0"/>
           <w:sz w:val="21"/>
         </w:rPr>
@@ -681,7 +865,7 @@
       </w:pPr>
       <w:r>
         <w:rPr>
-          <w:rFonts w:ascii="Calibri" w:hAnsi="Calibri" w:eastAsia="微软雅黑"/>
+          <w:rFonts w:ascii="Calibri" w:hAnsi="Calibri" w:eastAsia="Noto Sans CJK SC"/>
           <w:b w:val="0"/>
           <w:sz w:val="20"/>
         </w:rPr>
@@ -689,7 +873,7 @@
       </w:r>
       <w:r>
         <w:rPr>
-          <w:rFonts w:ascii="Calibri" w:hAnsi="Calibri" w:eastAsia="微软雅黑"/>
+          <w:rFonts w:ascii="Calibri" w:hAnsi="Calibri" w:eastAsia="Noto Sans CJK SC"/>
           <w:b/>
           <w:sz w:val="21"/>
         </w:rPr>
@@ -697,7 +881,7 @@
       </w:r>
       <w:r>
         <w:rPr>
-          <w:rFonts w:ascii="Calibri" w:hAnsi="Calibri" w:eastAsia="微软雅黑"/>
+          <w:rFonts w:ascii="Calibri" w:hAnsi="Calibri" w:eastAsia="Noto Sans CJK SC"/>
           <w:b w:val="0"/>
           <w:sz w:val="21"/>
         </w:rPr>
@@ -713,7 +897,7 @@
       </w:pPr>
       <w:r>
         <w:rPr>
-          <w:rFonts w:ascii="Calibri" w:hAnsi="Calibri" w:eastAsia="微软雅黑"/>
+          <w:rFonts w:ascii="Calibri" w:hAnsi="Calibri" w:eastAsia="Noto Sans CJK SC"/>
           <w:b w:val="0"/>
           <w:sz w:val="20"/>
         </w:rPr>
@@ -721,7 +905,7 @@
       </w:r>
       <w:r>
         <w:rPr>
-          <w:rFonts w:ascii="Calibri" w:hAnsi="Calibri" w:eastAsia="微软雅黑"/>
+          <w:rFonts w:ascii="Calibri" w:hAnsi="Calibri" w:eastAsia="Noto Sans CJK SC"/>
           <w:b/>
           <w:sz w:val="21"/>
         </w:rPr>
@@ -729,7 +913,7 @@
       </w:r>
       <w:r>
         <w:rPr>
-          <w:rFonts w:ascii="Calibri" w:hAnsi="Calibri" w:eastAsia="微软雅黑"/>
+          <w:rFonts w:ascii="Calibri" w:hAnsi="Calibri" w:eastAsia="Noto Sans CJK SC"/>
           <w:b w:val="0"/>
           <w:sz w:val="21"/>
         </w:rPr>
@@ -745,7 +929,7 @@
       </w:pPr>
       <w:r>
         <w:rPr>
-          <w:rFonts w:ascii="Calibri" w:hAnsi="Calibri" w:eastAsia="微软雅黑"/>
+          <w:rFonts w:ascii="Calibri" w:hAnsi="Calibri" w:eastAsia="Noto Sans CJK SC"/>
           <w:b w:val="0"/>
           <w:sz w:val="20"/>
         </w:rPr>
@@ -753,7 +937,7 @@
       </w:r>
       <w:r>
         <w:rPr>
-          <w:rFonts w:ascii="Calibri" w:hAnsi="Calibri" w:eastAsia="微软雅黑"/>
+          <w:rFonts w:ascii="Calibri" w:hAnsi="Calibri" w:eastAsia="Noto Sans CJK SC"/>
           <w:b/>
           <w:sz w:val="21"/>
         </w:rPr>
@@ -761,7 +945,7 @@
       </w:r>
       <w:r>
         <w:rPr>
-          <w:rFonts w:ascii="Calibri" w:hAnsi="Calibri" w:eastAsia="微软雅黑"/>
+          <w:rFonts w:ascii="Calibri" w:hAnsi="Calibri" w:eastAsia="Noto Sans CJK SC"/>
           <w:b w:val="0"/>
           <w:sz w:val="21"/>
         </w:rPr>
@@ -770,13 +954,13 @@
     </w:p>
     <w:p>
       <w:pPr>
-        <w:keepNext w:val="0"/>
+        <w:keepNext/>
         <w:keepLines/>
         <w:spacing w:before="100" w:after="20"/>
       </w:pPr>
       <w:r>
         <w:rPr>
-          <w:rFonts w:ascii="Calibri" w:hAnsi="Calibri" w:eastAsia="微软雅黑"/>
+          <w:rFonts w:ascii="Calibri" w:hAnsi="Calibri" w:eastAsia="Noto Sans CJK SC"/>
           <w:b/>
           <w:sz w:val="23"/>
         </w:rPr>
@@ -784,7 +968,7 @@
       </w:r>
       <w:r>
         <w:rPr>
-          <w:rFonts w:ascii="Calibri" w:hAnsi="Calibri" w:eastAsia="微软雅黑"/>
+          <w:rFonts w:ascii="Calibri" w:hAnsi="Calibri" w:eastAsia="Noto Sans CJK SC"/>
           <w:b w:val="0"/>
           <w:color w:val="666666"/>
           <w:sz w:val="19"/>
@@ -793,7 +977,7 @@
       </w:r>
       <w:r>
         <w:rPr>
-          <w:rFonts w:ascii="Calibri" w:hAnsi="Calibri" w:eastAsia="微软雅黑"/>
+          <w:rFonts w:ascii="Calibri" w:hAnsi="Calibri" w:eastAsia="Noto Sans CJK SC"/>
           <w:b w:val="0"/>
           <w:color w:val="666666"/>
           <w:sz w:val="19"/>
@@ -803,11 +987,12 @@
     </w:p>
     <w:p>
       <w:pPr>
+        <w:keepNext/>
         <w:spacing w:after="40"/>
       </w:pPr>
       <w:r>
         <w:rPr>
-          <w:rFonts w:ascii="Calibri" w:hAnsi="Calibri" w:eastAsia="微软雅黑"/>
+          <w:rFonts w:ascii="Calibri" w:hAnsi="Calibri" w:eastAsia="Noto Sans CJK SC"/>
           <w:b w:val="0"/>
           <w:color w:val="666666"/>
           <w:sz w:val="19"/>
@@ -824,7 +1009,7 @@
       </w:pPr>
       <w:r>
         <w:rPr>
-          <w:rFonts w:ascii="Calibri" w:hAnsi="Calibri" w:eastAsia="微软雅黑"/>
+          <w:rFonts w:ascii="Calibri" w:hAnsi="Calibri" w:eastAsia="Noto Sans CJK SC"/>
           <w:b w:val="0"/>
           <w:sz w:val="20"/>
         </w:rPr>
@@ -832,7 +1017,7 @@
       </w:r>
       <w:r>
         <w:rPr>
-          <w:rFonts w:ascii="Calibri" w:hAnsi="Calibri" w:eastAsia="微软雅黑"/>
+          <w:rFonts w:ascii="Calibri" w:hAnsi="Calibri" w:eastAsia="Noto Sans CJK SC"/>
           <w:b/>
           <w:sz w:val="21"/>
         </w:rPr>
@@ -840,7 +1025,7 @@
       </w:r>
       <w:r>
         <w:rPr>
-          <w:rFonts w:ascii="Calibri" w:hAnsi="Calibri" w:eastAsia="微软雅黑"/>
+          <w:rFonts w:ascii="Calibri" w:hAnsi="Calibri" w:eastAsia="Noto Sans CJK SC"/>
           <w:b w:val="0"/>
           <w:sz w:val="21"/>
         </w:rPr>
@@ -856,7 +1041,7 @@
       </w:pPr>
       <w:r>
         <w:rPr>
-          <w:rFonts w:ascii="Calibri" w:hAnsi="Calibri" w:eastAsia="微软雅黑"/>
+          <w:rFonts w:ascii="Calibri" w:hAnsi="Calibri" w:eastAsia="Noto Sans CJK SC"/>
           <w:b w:val="0"/>
           <w:sz w:val="20"/>
         </w:rPr>
@@ -864,7 +1049,7 @@
       </w:r>
       <w:r>
         <w:rPr>
-          <w:rFonts w:ascii="Calibri" w:hAnsi="Calibri" w:eastAsia="微软雅黑"/>
+          <w:rFonts w:ascii="Calibri" w:hAnsi="Calibri" w:eastAsia="Noto Sans CJK SC"/>
           <w:b/>
           <w:sz w:val="21"/>
         </w:rPr>
@@ -872,7 +1057,7 @@
       </w:r>
       <w:r>
         <w:rPr>
-          <w:rFonts w:ascii="Calibri" w:hAnsi="Calibri" w:eastAsia="微软雅黑"/>
+          <w:rFonts w:ascii="Calibri" w:hAnsi="Calibri" w:eastAsia="Noto Sans CJK SC"/>
           <w:b w:val="0"/>
           <w:sz w:val="21"/>
         </w:rPr>
@@ -888,7 +1073,7 @@
       </w:pPr>
       <w:r>
         <w:rPr>
-          <w:rFonts w:ascii="Calibri" w:hAnsi="Calibri" w:eastAsia="微软雅黑"/>
+          <w:rFonts w:ascii="Calibri" w:hAnsi="Calibri" w:eastAsia="Noto Sans CJK SC"/>
           <w:b w:val="0"/>
           <w:sz w:val="20"/>
         </w:rPr>
@@ -896,7 +1081,7 @@
       </w:r>
       <w:r>
         <w:rPr>
-          <w:rFonts w:ascii="Calibri" w:hAnsi="Calibri" w:eastAsia="微软雅黑"/>
+          <w:rFonts w:ascii="Calibri" w:hAnsi="Calibri" w:eastAsia="Noto Sans CJK SC"/>
           <w:b/>
           <w:sz w:val="21"/>
         </w:rPr>
@@ -904,7 +1089,7 @@
       </w:r>
       <w:r>
         <w:rPr>
-          <w:rFonts w:ascii="Calibri" w:hAnsi="Calibri" w:eastAsia="微软雅黑"/>
+          <w:rFonts w:ascii="Calibri" w:hAnsi="Calibri" w:eastAsia="Noto Sans CJK SC"/>
           <w:b w:val="0"/>
           <w:sz w:val="21"/>
         </w:rPr>
@@ -920,7 +1105,7 @@
       </w:pPr>
       <w:r>
         <w:rPr>
-          <w:rFonts w:ascii="Calibri" w:hAnsi="Calibri" w:eastAsia="微软雅黑"/>
+          <w:rFonts w:ascii="Calibri" w:hAnsi="Calibri" w:eastAsia="Noto Sans CJK SC"/>
           <w:b w:val="0"/>
           <w:sz w:val="20"/>
         </w:rPr>
@@ -928,7 +1113,7 @@
       </w:r>
       <w:r>
         <w:rPr>
-          <w:rFonts w:ascii="Calibri" w:hAnsi="Calibri" w:eastAsia="微软雅黑"/>
+          <w:rFonts w:ascii="Calibri" w:hAnsi="Calibri" w:eastAsia="Noto Sans CJK SC"/>
           <w:b/>
           <w:sz w:val="21"/>
         </w:rPr>
@@ -936,7 +1121,7 @@
       </w:r>
       <w:r>
         <w:rPr>
-          <w:rFonts w:ascii="Calibri" w:hAnsi="Calibri" w:eastAsia="微软雅黑"/>
+          <w:rFonts w:ascii="Calibri" w:hAnsi="Calibri" w:eastAsia="Noto Sans CJK SC"/>
           <w:b w:val="0"/>
           <w:sz w:val="21"/>
         </w:rPr>
@@ -945,13 +1130,13 @@
     </w:p>
     <w:p>
       <w:pPr>
-        <w:keepNext w:val="0"/>
+        <w:keepNext/>
         <w:keepLines/>
         <w:spacing w:before="100" w:after="20"/>
       </w:pPr>
       <w:r>
         <w:rPr>
-          <w:rFonts w:ascii="Calibri" w:hAnsi="Calibri" w:eastAsia="微软雅黑"/>
+          <w:rFonts w:ascii="Calibri" w:hAnsi="Calibri" w:eastAsia="Noto Sans CJK SC"/>
           <w:b/>
           <w:sz w:val="23"/>
         </w:rPr>
@@ -959,7 +1144,7 @@
       </w:r>
       <w:r>
         <w:rPr>
-          <w:rFonts w:ascii="Calibri" w:hAnsi="Calibri" w:eastAsia="微软雅黑"/>
+          <w:rFonts w:ascii="Calibri" w:hAnsi="Calibri" w:eastAsia="Noto Sans CJK SC"/>
           <w:b w:val="0"/>
           <w:color w:val="666666"/>
           <w:sz w:val="19"/>
@@ -968,7 +1153,7 @@
       </w:r>
       <w:r>
         <w:rPr>
-          <w:rFonts w:ascii="Calibri" w:hAnsi="Calibri" w:eastAsia="微软雅黑"/>
+          <w:rFonts w:ascii="Calibri" w:hAnsi="Calibri" w:eastAsia="Noto Sans CJK SC"/>
           <w:b w:val="0"/>
           <w:color w:val="666666"/>
           <w:sz w:val="19"/>
@@ -978,11 +1163,12 @@
     </w:p>
     <w:p>
       <w:pPr>
+        <w:keepNext/>
         <w:spacing w:after="40"/>
       </w:pPr>
       <w:r>
         <w:rPr>
-          <w:rFonts w:ascii="Calibri" w:hAnsi="Calibri" w:eastAsia="微软雅黑"/>
+          <w:rFonts w:ascii="Calibri" w:hAnsi="Calibri" w:eastAsia="Noto Sans CJK SC"/>
           <w:b w:val="0"/>
           <w:color w:val="666666"/>
           <w:sz w:val="19"/>
@@ -999,7 +1185,7 @@
       </w:pPr>
       <w:r>
         <w:rPr>
-          <w:rFonts w:ascii="Calibri" w:hAnsi="Calibri" w:eastAsia="微软雅黑"/>
+          <w:rFonts w:ascii="Calibri" w:hAnsi="Calibri" w:eastAsia="Noto Sans CJK SC"/>
           <w:b w:val="0"/>
           <w:sz w:val="20"/>
         </w:rPr>
@@ -1007,7 +1193,7 @@
       </w:r>
       <w:r>
         <w:rPr>
-          <w:rFonts w:ascii="Calibri" w:hAnsi="Calibri" w:eastAsia="微软雅黑"/>
+          <w:rFonts w:ascii="Calibri" w:hAnsi="Calibri" w:eastAsia="Noto Sans CJK SC"/>
           <w:b/>
           <w:sz w:val="21"/>
         </w:rPr>
@@ -1015,7 +1201,7 @@
       </w:r>
       <w:r>
         <w:rPr>
-          <w:rFonts w:ascii="Calibri" w:hAnsi="Calibri" w:eastAsia="微软雅黑"/>
+          <w:rFonts w:ascii="Calibri" w:hAnsi="Calibri" w:eastAsia="Noto Sans CJK SC"/>
           <w:b w:val="0"/>
           <w:sz w:val="21"/>
         </w:rPr>
@@ -1031,7 +1217,7 @@
       </w:pPr>
       <w:r>
         <w:rPr>
-          <w:rFonts w:ascii="Calibri" w:hAnsi="Calibri" w:eastAsia="微软雅黑"/>
+          <w:rFonts w:ascii="Calibri" w:hAnsi="Calibri" w:eastAsia="Noto Sans CJK SC"/>
           <w:b w:val="0"/>
           <w:sz w:val="20"/>
         </w:rPr>
@@ -1039,7 +1225,7 @@
       </w:r>
       <w:r>
         <w:rPr>
-          <w:rFonts w:ascii="Calibri" w:hAnsi="Calibri" w:eastAsia="微软雅黑"/>
+          <w:rFonts w:ascii="Calibri" w:hAnsi="Calibri" w:eastAsia="Noto Sans CJK SC"/>
           <w:b/>
           <w:sz w:val="21"/>
         </w:rPr>
@@ -1047,7 +1233,7 @@
       </w:r>
       <w:r>
         <w:rPr>
-          <w:rFonts w:ascii="Calibri" w:hAnsi="Calibri" w:eastAsia="微软雅黑"/>
+          <w:rFonts w:ascii="Calibri" w:hAnsi="Calibri" w:eastAsia="Noto Sans CJK SC"/>
           <w:b w:val="0"/>
           <w:sz w:val="21"/>
         </w:rPr>
@@ -1063,7 +1249,7 @@
       </w:pPr>
       <w:r>
         <w:rPr>
-          <w:rFonts w:ascii="Calibri" w:hAnsi="Calibri" w:eastAsia="微软雅黑"/>
+          <w:rFonts w:ascii="Calibri" w:hAnsi="Calibri" w:eastAsia="Noto Sans CJK SC"/>
           <w:b w:val="0"/>
           <w:sz w:val="20"/>
         </w:rPr>
@@ -1071,7 +1257,7 @@
       </w:r>
       <w:r>
         <w:rPr>
-          <w:rFonts w:ascii="Calibri" w:hAnsi="Calibri" w:eastAsia="微软雅黑"/>
+          <w:rFonts w:ascii="Calibri" w:hAnsi="Calibri" w:eastAsia="Noto Sans CJK SC"/>
           <w:b/>
           <w:sz w:val="21"/>
         </w:rPr>
@@ -1079,7 +1265,7 @@
       </w:r>
       <w:r>
         <w:rPr>
-          <w:rFonts w:ascii="Calibri" w:hAnsi="Calibri" w:eastAsia="微软雅黑"/>
+          <w:rFonts w:ascii="Calibri" w:hAnsi="Calibri" w:eastAsia="Noto Sans CJK SC"/>
           <w:b w:val="0"/>
           <w:sz w:val="21"/>
         </w:rPr>
@@ -1088,6 +1274,7 @@
     </w:p>
     <w:p>
       <w:pPr>
+        <w:keepNext/>
         <w:spacing w:before="200" w:after="80"/>
         <w:pBdr>
           <w:left w:val="single" w:sz="18" w:color="1A1A1A"/>
@@ -1095,7 +1282,7 @@
       </w:pPr>
       <w:r>
         <w:rPr>
-          <w:rFonts w:ascii="Calibri" w:hAnsi="Calibri" w:eastAsia="微软雅黑"/>
+          <w:rFonts w:ascii="Calibri" w:hAnsi="Calibri" w:eastAsia="Noto Sans CJK SC"/>
           <w:b/>
           <w:color w:val="1A1A1A"/>
           <w:sz w:val="25"/>
@@ -1105,21 +1292,21 @@
     </w:p>
     <w:p>
       <w:pPr>
-        <w:keepNext w:val="0"/>
+        <w:keepNext/>
         <w:keepLines/>
         <w:spacing w:before="100" w:after="20"/>
       </w:pPr>
       <w:r>
         <w:rPr>
-          <w:rFonts w:ascii="Calibri" w:hAnsi="Calibri" w:eastAsia="微软雅黑"/>
+          <w:rFonts w:ascii="Calibri" w:hAnsi="Calibri" w:eastAsia="Noto Sans CJK SC"/>
           <w:b/>
           <w:sz w:val="22"/>
         </w:rPr>
-        <w:t xml:space="preserve">车规级芯片测试机（ATE）上位机软件　</w:t>
+        <w:t xml:space="preserve">半导体 AOI 设备软件测试与检测记录　</w:t>
       </w:r>
       <w:r>
         <w:rPr>
-          <w:rFonts w:ascii="Calibri" w:hAnsi="Calibri" w:eastAsia="微软雅黑"/>
+          <w:rFonts w:ascii="Calibri" w:hAnsi="Calibri" w:eastAsia="Noto Sans CJK SC"/>
           <w:b w:val="0"/>
           <w:color w:val="666666"/>
           <w:sz w:val="19"/>
@@ -1128,12 +1315,12 @@
       </w:r>
       <w:r>
         <w:rPr>
-          <w:rFonts w:ascii="Calibri" w:hAnsi="Calibri" w:eastAsia="微软雅黑"/>
+          <w:rFonts w:ascii="Calibri" w:hAnsi="Calibri" w:eastAsia="Noto Sans CJK SC"/>
           <w:b w:val="0"/>
           <w:color w:val="666666"/>
           <w:sz w:val="19"/>
         </w:rPr>
-        <w:t>2026.07 — 至今</w:t>
+        <w:t>2026.09 — 至今</w:t>
       </w:r>
     </w:p>
     <w:p>
@@ -1145,7 +1332,7 @@
       </w:pPr>
       <w:r>
         <w:rPr>
-          <w:rFonts w:ascii="Calibri" w:hAnsi="Calibri" w:eastAsia="微软雅黑"/>
+          <w:rFonts w:ascii="Calibri" w:hAnsi="Calibri" w:eastAsia="Noto Sans CJK SC"/>
           <w:b w:val="0"/>
           <w:sz w:val="20"/>
         </w:rPr>
@@ -1153,7 +1340,7 @@
       </w:r>
       <w:r>
         <w:rPr>
-          <w:rFonts w:ascii="Calibri" w:hAnsi="Calibri" w:eastAsia="微软雅黑"/>
+          <w:rFonts w:ascii="Calibri" w:hAnsi="Calibri" w:eastAsia="Noto Sans CJK SC"/>
           <w:b/>
           <w:sz w:val="21"/>
         </w:rPr>
@@ -1161,7 +1348,176 @@
       </w:r>
       <w:r>
         <w:rPr>
-          <w:rFonts w:ascii="Calibri" w:hAnsi="Calibri" w:eastAsia="微软雅黑"/>
+          <w:rFonts w:ascii="Calibri" w:hAnsi="Calibri" w:eastAsia="Noto Sans CJK SC"/>
+          <w:b w:val="0"/>
+          <w:sz w:val="21"/>
+        </w:rPr>
+        <w:t>光学检测结果依赖设备操作、模板参数和成像范围，需要把软件流程、现场现象与检测记录对应起来。 结合操作手册梳理建模与检测流程，按截图整理检测记录，记录拍摄偏移、Die 成像不完整等现象，并核对相机定位与建模环节。</w:t>
+      </w:r>
+    </w:p>
+    <w:p>
+      <w:pPr>
+        <w:keepNext w:val="0"/>
+        <w:keepLines/>
+        <w:spacing w:after="40"/>
+        <w:ind w:left="283"/>
+      </w:pPr>
+      <w:r>
+        <w:rPr>
+          <w:rFonts w:ascii="Calibri" w:hAnsi="Calibri" w:eastAsia="Noto Sans CJK SC"/>
+          <w:b w:val="0"/>
+          <w:sz w:val="20"/>
+        </w:rPr>
+        <w:t xml:space="preserve">▪ </w:t>
+      </w:r>
+      <w:r>
+        <w:rPr>
+          <w:rFonts w:ascii="Calibri" w:hAnsi="Calibri" w:eastAsia="Noto Sans CJK SC"/>
+          <w:b w:val="0"/>
+          <w:sz w:val="21"/>
+        </w:rPr>
+        <w:t>按操作步骤整理功能入口与测试关注点</w:t>
+      </w:r>
+    </w:p>
+    <w:p>
+      <w:pPr>
+        <w:keepNext w:val="0"/>
+        <w:keepLines/>
+        <w:spacing w:after="40"/>
+        <w:ind w:left="283"/>
+      </w:pPr>
+      <w:r>
+        <w:rPr>
+          <w:rFonts w:ascii="Calibri" w:hAnsi="Calibri" w:eastAsia="Noto Sans CJK SC"/>
+          <w:b w:val="0"/>
+          <w:sz w:val="20"/>
+        </w:rPr>
+        <w:t xml:space="preserve">▪ </w:t>
+      </w:r>
+      <w:r>
+        <w:rPr>
+          <w:rFonts w:ascii="Calibri" w:hAnsi="Calibri" w:eastAsia="Noto Sans CJK SC"/>
+          <w:b w:val="0"/>
+          <w:sz w:val="21"/>
+        </w:rPr>
+        <w:t>检查拍摄位置与 Die 成像完整性，保留现象截图</w:t>
+      </w:r>
+    </w:p>
+    <w:p>
+      <w:pPr>
+        <w:keepNext w:val="0"/>
+        <w:keepLines/>
+        <w:spacing w:after="40"/>
+        <w:ind w:left="283"/>
+      </w:pPr>
+      <w:r>
+        <w:rPr>
+          <w:rFonts w:ascii="Calibri" w:hAnsi="Calibri" w:eastAsia="Noto Sans CJK SC"/>
+          <w:b w:val="0"/>
+          <w:sz w:val="20"/>
+        </w:rPr>
+        <w:t xml:space="preserve">▪ </w:t>
+      </w:r>
+      <w:r>
+        <w:rPr>
+          <w:rFonts w:ascii="Calibri" w:hAnsi="Calibri" w:eastAsia="Noto Sans CJK SC"/>
+          <w:b w:val="0"/>
+          <w:sz w:val="21"/>
+        </w:rPr>
+        <w:t>将问题现象、复现条件与记录对应，便于后续验证</w:t>
+      </w:r>
+    </w:p>
+    <w:p>
+      <w:pPr>
+        <w:keepNext w:val="0"/>
+        <w:keepLines/>
+        <w:spacing w:after="40"/>
+        <w:ind w:left="283"/>
+      </w:pPr>
+      <w:r>
+        <w:rPr>
+          <w:rFonts w:ascii="Calibri" w:hAnsi="Calibri" w:eastAsia="Noto Sans CJK SC"/>
+          <w:b w:val="0"/>
+          <w:sz w:val="20"/>
+        </w:rPr>
+        <w:t xml:space="preserve">▪ </w:t>
+      </w:r>
+      <w:r>
+        <w:rPr>
+          <w:rFonts w:ascii="Calibri" w:hAnsi="Calibri" w:eastAsia="Noto Sans CJK SC"/>
+          <w:b/>
+          <w:sz w:val="21"/>
+        </w:rPr>
+        <w:t>结果：</w:t>
+      </w:r>
+      <w:r>
+        <w:rPr>
+          <w:rFonts w:ascii="Calibri" w:hAnsi="Calibri" w:eastAsia="Noto Sans CJK SC"/>
+          <w:b w:val="0"/>
+          <w:sz w:val="21"/>
+        </w:rPr>
+        <w:t>已整理 MPW 检测记录与截图材料，持续完善设备流程理解和测试清单。</w:t>
+      </w:r>
+    </w:p>
+    <w:p>
+      <w:pPr>
+        <w:keepNext/>
+        <w:keepLines/>
+        <w:spacing w:before="100" w:after="20"/>
+      </w:pPr>
+      <w:r>
+        <w:rPr>
+          <w:rFonts w:ascii="Calibri" w:hAnsi="Calibri" w:eastAsia="Noto Sans CJK SC"/>
+          <w:b/>
+          <w:sz w:val="22"/>
+        </w:rPr>
+        <w:t xml:space="preserve">车规级芯片测试机（ATE）上位机软件　</w:t>
+      </w:r>
+      <w:r>
+        <w:rPr>
+          <w:rFonts w:ascii="Calibri" w:hAnsi="Calibri" w:eastAsia="Noto Sans CJK SC"/>
+          <w:b w:val="0"/>
+          <w:color w:val="666666"/>
+          <w:sz w:val="19"/>
+        </w:rPr>
+        <w:t xml:space="preserve">[软件测试]　</w:t>
+      </w:r>
+      <w:r>
+        <w:rPr>
+          <w:rFonts w:ascii="Calibri" w:hAnsi="Calibri" w:eastAsia="Noto Sans CJK SC"/>
+          <w:b w:val="0"/>
+          <w:color w:val="666666"/>
+          <w:sz w:val="19"/>
+        </w:rPr>
+        <w:t>2026.07 — 2026.09</w:t>
+      </w:r>
+    </w:p>
+    <w:p>
+      <w:pPr>
+        <w:keepNext w:val="0"/>
+        <w:keepLines/>
+        <w:spacing w:after="40"/>
+        <w:ind w:left="283"/>
+      </w:pPr>
+      <w:r>
+        <w:rPr>
+          <w:rFonts w:ascii="Calibri" w:hAnsi="Calibri" w:eastAsia="Noto Sans CJK SC"/>
+          <w:b w:val="0"/>
+          <w:sz w:val="20"/>
+        </w:rPr>
+        <w:t xml:space="preserve">▪ </w:t>
+      </w:r>
+      <w:r>
+        <w:rPr>
+          <w:rFonts w:ascii="Calibri" w:hAnsi="Calibri" w:eastAsia="Noto Sans CJK SC"/>
+          <w:b/>
+          <w:sz w:val="21"/>
+        </w:rPr>
+        <w:t>问题与方法：</w:t>
+      </w:r>
+      <w:r>
+        <w:rPr>
+          <w:rFonts w:ascii="Calibri" w:hAnsi="Calibri" w:eastAsia="Noto Sans CJK SC"/>
           <w:b w:val="0"/>
           <w:sz w:val="21"/>
         </w:rPr>
@@ -1177,7 +1533,7 @@
       </w:pPr>
       <w:r>
         <w:rPr>
-          <w:rFonts w:ascii="Calibri" w:hAnsi="Calibri" w:eastAsia="微软雅黑"/>
+          <w:rFonts w:ascii="Calibri" w:hAnsi="Calibri" w:eastAsia="Noto Sans CJK SC"/>
           <w:b w:val="0"/>
           <w:sz w:val="20"/>
         </w:rPr>
@@ -1185,7 +1541,7 @@
       </w:r>
       <w:r>
         <w:rPr>
-          <w:rFonts w:ascii="Calibri" w:hAnsi="Calibri" w:eastAsia="微软雅黑"/>
+          <w:rFonts w:ascii="Calibri" w:hAnsi="Calibri" w:eastAsia="Noto Sans CJK SC"/>
           <w:b w:val="0"/>
           <w:sz w:val="21"/>
         </w:rPr>
@@ -1201,7 +1557,7 @@
       </w:pPr>
       <w:r>
         <w:rPr>
-          <w:rFonts w:ascii="Calibri" w:hAnsi="Calibri" w:eastAsia="微软雅黑"/>
+          <w:rFonts w:ascii="Calibri" w:hAnsi="Calibri" w:eastAsia="Noto Sans CJK SC"/>
           <w:b w:val="0"/>
           <w:sz w:val="20"/>
         </w:rPr>
@@ -1209,7 +1565,7 @@
       </w:r>
       <w:r>
         <w:rPr>
-          <w:rFonts w:ascii="Calibri" w:hAnsi="Calibri" w:eastAsia="微软雅黑"/>
+          <w:rFonts w:ascii="Calibri" w:hAnsi="Calibri" w:eastAsia="Noto Sans CJK SC"/>
           <w:b w:val="0"/>
           <w:sz w:val="21"/>
         </w:rPr>
@@ -1225,7 +1581,7 @@
       </w:pPr>
       <w:r>
         <w:rPr>
-          <w:rFonts w:ascii="Calibri" w:hAnsi="Calibri" w:eastAsia="微软雅黑"/>
+          <w:rFonts w:ascii="Calibri" w:hAnsi="Calibri" w:eastAsia="Noto Sans CJK SC"/>
           <w:b w:val="0"/>
           <w:sz w:val="20"/>
         </w:rPr>
@@ -1233,7 +1589,7 @@
       </w:r>
       <w:r>
         <w:rPr>
-          <w:rFonts w:ascii="Calibri" w:hAnsi="Calibri" w:eastAsia="微软雅黑"/>
+          <w:rFonts w:ascii="Calibri" w:hAnsi="Calibri" w:eastAsia="Noto Sans CJK SC"/>
           <w:b w:val="0"/>
           <w:sz w:val="21"/>
         </w:rPr>
@@ -1249,7 +1605,7 @@
       </w:pPr>
       <w:r>
         <w:rPr>
-          <w:rFonts w:ascii="Calibri" w:hAnsi="Calibri" w:eastAsia="微软雅黑"/>
+          <w:rFonts w:ascii="Calibri" w:hAnsi="Calibri" w:eastAsia="Noto Sans CJK SC"/>
           <w:b w:val="0"/>
           <w:sz w:val="20"/>
         </w:rPr>
@@ -1257,7 +1613,7 @@
       </w:r>
       <w:r>
         <w:rPr>
-          <w:rFonts w:ascii="Calibri" w:hAnsi="Calibri" w:eastAsia="微软雅黑"/>
+          <w:rFonts w:ascii="Calibri" w:hAnsi="Calibri" w:eastAsia="Noto Sans CJK SC"/>
           <w:b/>
           <w:sz w:val="21"/>
         </w:rPr>
@@ -1265,7 +1621,7 @@
       </w:r>
       <w:r>
         <w:rPr>
-          <w:rFonts w:ascii="Calibri" w:hAnsi="Calibri" w:eastAsia="微软雅黑"/>
+          <w:rFonts w:ascii="Calibri" w:hAnsi="Calibri" w:eastAsia="Noto Sans CJK SC"/>
           <w:b w:val="0"/>
           <w:sz w:val="21"/>
         </w:rPr>
@@ -1274,13 +1630,13 @@
     </w:p>
     <w:p>
       <w:pPr>
-        <w:keepNext w:val="0"/>
+        <w:keepNext/>
         <w:keepLines/>
         <w:spacing w:before="100" w:after="20"/>
       </w:pPr>
       <w:r>
         <w:rPr>
-          <w:rFonts w:ascii="Calibri" w:hAnsi="Calibri" w:eastAsia="微软雅黑"/>
+          <w:rFonts w:ascii="Calibri" w:hAnsi="Calibri" w:eastAsia="Noto Sans CJK SC"/>
           <w:b/>
           <w:sz w:val="22"/>
         </w:rPr>
@@ -1288,7 +1644,7 @@
       </w:r>
       <w:r>
         <w:rPr>
-          <w:rFonts w:ascii="Calibri" w:hAnsi="Calibri" w:eastAsia="微软雅黑"/>
+          <w:rFonts w:ascii="Calibri" w:hAnsi="Calibri" w:eastAsia="Noto Sans CJK SC"/>
           <w:b w:val="0"/>
           <w:color w:val="666666"/>
           <w:sz w:val="19"/>
@@ -1297,7 +1653,7 @@
       </w:r>
       <w:r>
         <w:rPr>
-          <w:rFonts w:ascii="Calibri" w:hAnsi="Calibri" w:eastAsia="微软雅黑"/>
+          <w:rFonts w:ascii="Calibri" w:hAnsi="Calibri" w:eastAsia="Noto Sans CJK SC"/>
           <w:b w:val="0"/>
           <w:color w:val="666666"/>
           <w:sz w:val="19"/>
@@ -1314,7 +1670,7 @@
       </w:pPr>
       <w:r>
         <w:rPr>
-          <w:rFonts w:ascii="Calibri" w:hAnsi="Calibri" w:eastAsia="微软雅黑"/>
+          <w:rFonts w:ascii="Calibri" w:hAnsi="Calibri" w:eastAsia="Noto Sans CJK SC"/>
           <w:b w:val="0"/>
           <w:sz w:val="20"/>
         </w:rPr>
@@ -1322,7 +1678,7 @@
       </w:r>
       <w:r>
         <w:rPr>
-          <w:rFonts w:ascii="Calibri" w:hAnsi="Calibri" w:eastAsia="微软雅黑"/>
+          <w:rFonts w:ascii="Calibri" w:hAnsi="Calibri" w:eastAsia="Noto Sans CJK SC"/>
           <w:b/>
           <w:sz w:val="21"/>
         </w:rPr>
@@ -1330,7 +1686,7 @@
       </w:r>
       <w:r>
         <w:rPr>
-          <w:rFonts w:ascii="Calibri" w:hAnsi="Calibri" w:eastAsia="微软雅黑"/>
+          <w:rFonts w:ascii="Calibri" w:hAnsi="Calibri" w:eastAsia="Noto Sans CJK SC"/>
           <w:b w:val="0"/>
           <w:sz w:val="21"/>
         </w:rPr>
@@ -1346,7 +1702,7 @@
       </w:pPr>
       <w:r>
         <w:rPr>
-          <w:rFonts w:ascii="Calibri" w:hAnsi="Calibri" w:eastAsia="微软雅黑"/>
+          <w:rFonts w:ascii="Calibri" w:hAnsi="Calibri" w:eastAsia="Noto Sans CJK SC"/>
           <w:b w:val="0"/>
           <w:sz w:val="20"/>
         </w:rPr>
@@ -1354,7 +1710,7 @@
       </w:r>
       <w:r>
         <w:rPr>
-          <w:rFonts w:ascii="Calibri" w:hAnsi="Calibri" w:eastAsia="微软雅黑"/>
+          <w:rFonts w:ascii="Calibri" w:hAnsi="Calibri" w:eastAsia="Noto Sans CJK SC"/>
           <w:b w:val="0"/>
           <w:sz w:val="21"/>
         </w:rPr>
@@ -1370,7 +1726,7 @@
       </w:pPr>
       <w:r>
         <w:rPr>
-          <w:rFonts w:ascii="Calibri" w:hAnsi="Calibri" w:eastAsia="微软雅黑"/>
+          <w:rFonts w:ascii="Calibri" w:hAnsi="Calibri" w:eastAsia="Noto Sans CJK SC"/>
           <w:b w:val="0"/>
           <w:sz w:val="20"/>
         </w:rPr>
@@ -1378,7 +1734,7 @@
       </w:r>
       <w:r>
         <w:rPr>
-          <w:rFonts w:ascii="Calibri" w:hAnsi="Calibri" w:eastAsia="微软雅黑"/>
+          <w:rFonts w:ascii="Calibri" w:hAnsi="Calibri" w:eastAsia="Noto Sans CJK SC"/>
           <w:b w:val="0"/>
           <w:sz w:val="21"/>
         </w:rPr>
@@ -1394,7 +1750,7 @@
       </w:pPr>
       <w:r>
         <w:rPr>
-          <w:rFonts w:ascii="Calibri" w:hAnsi="Calibri" w:eastAsia="微软雅黑"/>
+          <w:rFonts w:ascii="Calibri" w:hAnsi="Calibri" w:eastAsia="Noto Sans CJK SC"/>
           <w:b w:val="0"/>
           <w:sz w:val="20"/>
         </w:rPr>
@@ -1402,7 +1758,7 @@
       </w:r>
       <w:r>
         <w:rPr>
-          <w:rFonts w:ascii="Calibri" w:hAnsi="Calibri" w:eastAsia="微软雅黑"/>
+          <w:rFonts w:ascii="Calibri" w:hAnsi="Calibri" w:eastAsia="Noto Sans CJK SC"/>
           <w:b w:val="0"/>
           <w:sz w:val="21"/>
         </w:rPr>
@@ -1418,7 +1774,7 @@
       </w:pPr>
       <w:r>
         <w:rPr>
-          <w:rFonts w:ascii="Calibri" w:hAnsi="Calibri" w:eastAsia="微软雅黑"/>
+          <w:rFonts w:ascii="Calibri" w:hAnsi="Calibri" w:eastAsia="Noto Sans CJK SC"/>
           <w:b w:val="0"/>
           <w:sz w:val="20"/>
         </w:rPr>
@@ -1426,7 +1782,7 @@
       </w:r>
       <w:r>
         <w:rPr>
-          <w:rFonts w:ascii="Calibri" w:hAnsi="Calibri" w:eastAsia="微软雅黑"/>
+          <w:rFonts w:ascii="Calibri" w:hAnsi="Calibri" w:eastAsia="Noto Sans CJK SC"/>
           <w:b/>
           <w:sz w:val="21"/>
         </w:rPr>
@@ -1434,7 +1790,7 @@
       </w:r>
       <w:r>
         <w:rPr>
-          <w:rFonts w:ascii="Calibri" w:hAnsi="Calibri" w:eastAsia="微软雅黑"/>
+          <w:rFonts w:ascii="Calibri" w:hAnsi="Calibri" w:eastAsia="Noto Sans CJK SC"/>
           <w:b w:val="0"/>
           <w:sz w:val="21"/>
         </w:rPr>
@@ -1443,13 +1799,13 @@
     </w:p>
     <w:p>
       <w:pPr>
-        <w:keepNext w:val="0"/>
+        <w:keepNext/>
         <w:keepLines/>
         <w:spacing w:before="100" w:after="20"/>
       </w:pPr>
       <w:r>
         <w:rPr>
-          <w:rFonts w:ascii="Calibri" w:hAnsi="Calibri" w:eastAsia="微软雅黑"/>
+          <w:rFonts w:ascii="Calibri" w:hAnsi="Calibri" w:eastAsia="Noto Sans CJK SC"/>
           <w:b/>
           <w:sz w:val="22"/>
         </w:rPr>
@@ -1457,7 +1813,7 @@
       </w:r>
       <w:r>
         <w:rPr>
-          <w:rFonts w:ascii="Calibri" w:hAnsi="Calibri" w:eastAsia="微软雅黑"/>
+          <w:rFonts w:ascii="Calibri" w:hAnsi="Calibri" w:eastAsia="Noto Sans CJK SC"/>
           <w:b w:val="0"/>
           <w:color w:val="666666"/>
           <w:sz w:val="19"/>
@@ -1466,7 +1822,7 @@
       </w:r>
       <w:r>
         <w:rPr>
-          <w:rFonts w:ascii="Calibri" w:hAnsi="Calibri" w:eastAsia="微软雅黑"/>
+          <w:rFonts w:ascii="Calibri" w:hAnsi="Calibri" w:eastAsia="Noto Sans CJK SC"/>
           <w:b w:val="0"/>
           <w:color w:val="666666"/>
           <w:sz w:val="19"/>
@@ -1483,7 +1839,7 @@
       </w:pPr>
       <w:r>
         <w:rPr>
-          <w:rFonts w:ascii="Calibri" w:hAnsi="Calibri" w:eastAsia="微软雅黑"/>
+          <w:rFonts w:ascii="Calibri" w:hAnsi="Calibri" w:eastAsia="Noto Sans CJK SC"/>
           <w:b w:val="0"/>
           <w:sz w:val="20"/>
         </w:rPr>
@@ -1491,7 +1847,7 @@
       </w:r>
       <w:r>
         <w:rPr>
-          <w:rFonts w:ascii="Calibri" w:hAnsi="Calibri" w:eastAsia="微软雅黑"/>
+          <w:rFonts w:ascii="Calibri" w:hAnsi="Calibri" w:eastAsia="Noto Sans CJK SC"/>
           <w:b/>
           <w:sz w:val="21"/>
         </w:rPr>
@@ -1499,7 +1855,7 @@
       </w:r>
       <w:r>
         <w:rPr>
-          <w:rFonts w:ascii="Calibri" w:hAnsi="Calibri" w:eastAsia="微软雅黑"/>
+          <w:rFonts w:ascii="Calibri" w:hAnsi="Calibri" w:eastAsia="Noto Sans CJK SC"/>
           <w:b w:val="0"/>
           <w:sz w:val="21"/>
         </w:rPr>
@@ -1515,7 +1871,7 @@
       </w:pPr>
       <w:r>
         <w:rPr>
-          <w:rFonts w:ascii="Calibri" w:hAnsi="Calibri" w:eastAsia="微软雅黑"/>
+          <w:rFonts w:ascii="Calibri" w:hAnsi="Calibri" w:eastAsia="Noto Sans CJK SC"/>
           <w:b w:val="0"/>
           <w:sz w:val="20"/>
         </w:rPr>
@@ -1523,7 +1879,7 @@
       </w:r>
       <w:r>
         <w:rPr>
-          <w:rFonts w:ascii="Calibri" w:hAnsi="Calibri" w:eastAsia="微软雅黑"/>
+          <w:rFonts w:ascii="Calibri" w:hAnsi="Calibri" w:eastAsia="Noto Sans CJK SC"/>
           <w:b w:val="0"/>
           <w:sz w:val="21"/>
         </w:rPr>
@@ -1539,7 +1895,7 @@
       </w:pPr>
       <w:r>
         <w:rPr>
-          <w:rFonts w:ascii="Calibri" w:hAnsi="Calibri" w:eastAsia="微软雅黑"/>
+          <w:rFonts w:ascii="Calibri" w:hAnsi="Calibri" w:eastAsia="Noto Sans CJK SC"/>
           <w:b w:val="0"/>
           <w:sz w:val="20"/>
         </w:rPr>
@@ -1547,7 +1903,7 @@
       </w:r>
       <w:r>
         <w:rPr>
-          <w:rFonts w:ascii="Calibri" w:hAnsi="Calibri" w:eastAsia="微软雅黑"/>
+          <w:rFonts w:ascii="Calibri" w:hAnsi="Calibri" w:eastAsia="Noto Sans CJK SC"/>
           <w:b w:val="0"/>
           <w:sz w:val="21"/>
         </w:rPr>
@@ -1563,7 +1919,7 @@
       </w:pPr>
       <w:r>
         <w:rPr>
-          <w:rFonts w:ascii="Calibri" w:hAnsi="Calibri" w:eastAsia="微软雅黑"/>
+          <w:rFonts w:ascii="Calibri" w:hAnsi="Calibri" w:eastAsia="Noto Sans CJK SC"/>
           <w:b w:val="0"/>
           <w:sz w:val="20"/>
         </w:rPr>
@@ -1571,7 +1927,7 @@
       </w:r>
       <w:r>
         <w:rPr>
-          <w:rFonts w:ascii="Calibri" w:hAnsi="Calibri" w:eastAsia="微软雅黑"/>
+          <w:rFonts w:ascii="Calibri" w:hAnsi="Calibri" w:eastAsia="Noto Sans CJK SC"/>
           <w:b w:val="0"/>
           <w:sz w:val="21"/>
         </w:rPr>
@@ -1587,7 +1943,7 @@
       </w:pPr>
       <w:r>
         <w:rPr>
-          <w:rFonts w:ascii="Calibri" w:hAnsi="Calibri" w:eastAsia="微软雅黑"/>
+          <w:rFonts w:ascii="Calibri" w:hAnsi="Calibri" w:eastAsia="Noto Sans CJK SC"/>
           <w:b w:val="0"/>
           <w:sz w:val="20"/>
         </w:rPr>
@@ -1595,7 +1951,7 @@
       </w:r>
       <w:r>
         <w:rPr>
-          <w:rFonts w:ascii="Calibri" w:hAnsi="Calibri" w:eastAsia="微软雅黑"/>
+          <w:rFonts w:ascii="Calibri" w:hAnsi="Calibri" w:eastAsia="Noto Sans CJK SC"/>
           <w:b/>
           <w:sz w:val="21"/>
         </w:rPr>
@@ -1603,7 +1959,7 @@
       </w:r>
       <w:r>
         <w:rPr>
-          <w:rFonts w:ascii="Calibri" w:hAnsi="Calibri" w:eastAsia="微软雅黑"/>
+          <w:rFonts w:ascii="Calibri" w:hAnsi="Calibri" w:eastAsia="Noto Sans CJK SC"/>
           <w:b w:val="0"/>
           <w:sz w:val="21"/>
         </w:rPr>
@@ -1612,13 +1968,13 @@
     </w:p>
     <w:p>
       <w:pPr>
-        <w:keepNext w:val="0"/>
+        <w:keepNext/>
         <w:keepLines/>
         <w:spacing w:before="100" w:after="20"/>
       </w:pPr>
       <w:r>
         <w:rPr>
-          <w:rFonts w:ascii="Calibri" w:hAnsi="Calibri" w:eastAsia="微软雅黑"/>
+          <w:rFonts w:ascii="Calibri" w:hAnsi="Calibri" w:eastAsia="Noto Sans CJK SC"/>
           <w:b/>
           <w:sz w:val="22"/>
         </w:rPr>
@@ -1626,7 +1982,7 @@
       </w:r>
       <w:r>
         <w:rPr>
-          <w:rFonts w:ascii="Calibri" w:hAnsi="Calibri" w:eastAsia="微软雅黑"/>
+          <w:rFonts w:ascii="Calibri" w:hAnsi="Calibri" w:eastAsia="Noto Sans CJK SC"/>
           <w:b w:val="0"/>
           <w:color w:val="666666"/>
           <w:sz w:val="19"/>
@@ -1635,7 +1991,7 @@
       </w:r>
       <w:r>
         <w:rPr>
-          <w:rFonts w:ascii="Calibri" w:hAnsi="Calibri" w:eastAsia="微软雅黑"/>
+          <w:rFonts w:ascii="Calibri" w:hAnsi="Calibri" w:eastAsia="Noto Sans CJK SC"/>
           <w:b w:val="0"/>
           <w:color w:val="666666"/>
           <w:sz w:val="19"/>
@@ -1652,7 +2008,7 @@
       </w:pPr>
       <w:r>
         <w:rPr>
-          <w:rFonts w:ascii="Calibri" w:hAnsi="Calibri" w:eastAsia="微软雅黑"/>
+          <w:rFonts w:ascii="Calibri" w:hAnsi="Calibri" w:eastAsia="Noto Sans CJK SC"/>
           <w:b w:val="0"/>
           <w:sz w:val="20"/>
         </w:rPr>
@@ -1660,7 +2016,7 @@
       </w:r>
       <w:r>
         <w:rPr>
-          <w:rFonts w:ascii="Calibri" w:hAnsi="Calibri" w:eastAsia="微软雅黑"/>
+          <w:rFonts w:ascii="Calibri" w:hAnsi="Calibri" w:eastAsia="Noto Sans CJK SC"/>
           <w:b/>
           <w:sz w:val="21"/>
         </w:rPr>
@@ -1668,7 +2024,7 @@
       </w:r>
       <w:r>
         <w:rPr>
-          <w:rFonts w:ascii="Calibri" w:hAnsi="Calibri" w:eastAsia="微软雅黑"/>
+          <w:rFonts w:ascii="Calibri" w:hAnsi="Calibri" w:eastAsia="Noto Sans CJK SC"/>
           <w:b w:val="0"/>
           <w:sz w:val="21"/>
         </w:rPr>
@@ -1684,7 +2040,7 @@
       </w:pPr>
       <w:r>
         <w:rPr>
-          <w:rFonts w:ascii="Calibri" w:hAnsi="Calibri" w:eastAsia="微软雅黑"/>
+          <w:rFonts w:ascii="Calibri" w:hAnsi="Calibri" w:eastAsia="Noto Sans CJK SC"/>
           <w:b w:val="0"/>
           <w:sz w:val="20"/>
         </w:rPr>
@@ -1692,7 +2048,7 @@
       </w:r>
       <w:r>
         <w:rPr>
-          <w:rFonts w:ascii="Calibri" w:hAnsi="Calibri" w:eastAsia="微软雅黑"/>
+          <w:rFonts w:ascii="Calibri" w:hAnsi="Calibri" w:eastAsia="Noto Sans CJK SC"/>
           <w:b w:val="0"/>
           <w:sz w:val="21"/>
         </w:rPr>
@@ -1708,7 +2064,7 @@
       </w:pPr>
       <w:r>
         <w:rPr>
-          <w:rFonts w:ascii="Calibri" w:hAnsi="Calibri" w:eastAsia="微软雅黑"/>
+          <w:rFonts w:ascii="Calibri" w:hAnsi="Calibri" w:eastAsia="Noto Sans CJK SC"/>
           <w:b w:val="0"/>
           <w:sz w:val="20"/>
         </w:rPr>
@@ -1716,7 +2072,7 @@
       </w:r>
       <w:r>
         <w:rPr>
-          <w:rFonts w:ascii="Calibri" w:hAnsi="Calibri" w:eastAsia="微软雅黑"/>
+          <w:rFonts w:ascii="Calibri" w:hAnsi="Calibri" w:eastAsia="Noto Sans CJK SC"/>
           <w:b w:val="0"/>
           <w:sz w:val="21"/>
         </w:rPr>
@@ -1732,7 +2088,7 @@
       </w:pPr>
       <w:r>
         <w:rPr>
-          <w:rFonts w:ascii="Calibri" w:hAnsi="Calibri" w:eastAsia="微软雅黑"/>
+          <w:rFonts w:ascii="Calibri" w:hAnsi="Calibri" w:eastAsia="Noto Sans CJK SC"/>
           <w:b w:val="0"/>
           <w:sz w:val="20"/>
         </w:rPr>
@@ -1740,7 +2096,7 @@
       </w:r>
       <w:r>
         <w:rPr>
-          <w:rFonts w:ascii="Calibri" w:hAnsi="Calibri" w:eastAsia="微软雅黑"/>
+          <w:rFonts w:ascii="Calibri" w:hAnsi="Calibri" w:eastAsia="Noto Sans CJK SC"/>
           <w:b w:val="0"/>
           <w:sz w:val="21"/>
         </w:rPr>
@@ -1756,7 +2112,7 @@
       </w:pPr>
       <w:r>
         <w:rPr>
-          <w:rFonts w:ascii="Calibri" w:hAnsi="Calibri" w:eastAsia="微软雅黑"/>
+          <w:rFonts w:ascii="Calibri" w:hAnsi="Calibri" w:eastAsia="Noto Sans CJK SC"/>
           <w:b w:val="0"/>
           <w:sz w:val="20"/>
         </w:rPr>
@@ -1764,7 +2120,7 @@
       </w:r>
       <w:r>
         <w:rPr>
-          <w:rFonts w:ascii="Calibri" w:hAnsi="Calibri" w:eastAsia="微软雅黑"/>
+          <w:rFonts w:ascii="Calibri" w:hAnsi="Calibri" w:eastAsia="Noto Sans CJK SC"/>
           <w:b/>
           <w:sz w:val="21"/>
         </w:rPr>
@@ -1772,7 +2128,7 @@
       </w:r>
       <w:r>
         <w:rPr>
-          <w:rFonts w:ascii="Calibri" w:hAnsi="Calibri" w:eastAsia="微软雅黑"/>
+          <w:rFonts w:ascii="Calibri" w:hAnsi="Calibri" w:eastAsia="Noto Sans CJK SC"/>
           <w:b w:val="0"/>
           <w:sz w:val="21"/>
         </w:rPr>
@@ -1781,6 +2137,7 @@
     </w:p>
     <w:p>
       <w:pPr>
+        <w:keepNext/>
         <w:spacing w:before="200" w:after="80"/>
         <w:pBdr>
           <w:left w:val="single" w:sz="18" w:color="1A1A1A"/>
@@ -1788,7 +2145,7 @@
       </w:pPr>
       <w:r>
         <w:rPr>
-          <w:rFonts w:ascii="Calibri" w:hAnsi="Calibri" w:eastAsia="微软雅黑"/>
+          <w:rFonts w:ascii="Calibri" w:hAnsi="Calibri" w:eastAsia="Noto Sans CJK SC"/>
           <w:b/>
           <w:color w:val="1A1A1A"/>
           <w:sz w:val="25"/>
@@ -1802,7 +2159,7 @@
       </w:pPr>
       <w:r>
         <w:rPr>
-          <w:rFonts w:ascii="Calibri" w:hAnsi="Calibri" w:eastAsia="微软雅黑"/>
+          <w:rFonts w:ascii="Calibri" w:hAnsi="Calibri" w:eastAsia="Noto Sans CJK SC"/>
           <w:b/>
           <w:sz w:val="21"/>
         </w:rPr>
@@ -2182,8 +2539,11 @@
     <w:name w:val="Normal"/>
     <w:qFormat/>
     <w:rsid w:val="00FC693F"/>
+    <w:pPr>
+      <w:spacing w:line="276" w:lineRule="auto" w:after="60"/>
+    </w:pPr>
     <w:rPr>
-      <w:rFonts w:ascii="Calibri" w:hAnsi="Calibri" w:eastAsia="微软雅黑"/>
+      <w:rFonts w:ascii="Calibri" w:hAnsi="Calibri" w:eastAsia="Noto Sans CJK SC"/>
       <w:sz w:val="21"/>
     </w:rPr>
   </w:style>

</xml_diff>

<commit_message>
Refine resume visual hierarchy, project browsing and professional narrative
</commit_message>
<xml_diff>
--- a/docs/秦宇-测试工程师.docx
+++ b/docs/秦宇-测试工程师.docx
@@ -159,121 +159,7 @@
           <w:b w:val="0"/>
           <w:sz w:val="21"/>
         </w:rPr>
-        <w:t>专注软件测试开发、AI 应用测试与半导体设备软件测试。 软件工程本科，1 年+测试 / 测试开发经验。目前在珠海诚锋科技从事半导体 AOI 设备软件测试，此前参与 ATE 上位机测试与 AI 智能体平台测试，积累 1000+ 用例与 50+ 核心 API 自动巡检实践。结合接口、SQL 与日志定位问题，持续推进测试自动化。</w:t>
-      </w:r>
-    </w:p>
-    <w:p>
-      <w:pPr>
-        <w:keepNext/>
-        <w:spacing w:before="200" w:after="80"/>
-        <w:pBdr>
-          <w:left w:val="single" w:sz="18" w:color="1A1A1A"/>
-        </w:pBdr>
-      </w:pPr>
-      <w:r>
-        <w:rPr>
-          <w:rFonts w:ascii="Calibri" w:hAnsi="Calibri" w:eastAsia="Noto Sans CJK SC"/>
-          <w:b/>
-          <w:color w:val="1A1A1A"/>
-          <w:sz w:val="25"/>
-        </w:rPr>
-        <w:t>核心亮点</w:t>
-      </w:r>
-    </w:p>
-    <w:p>
-      <w:pPr>
-        <w:keepNext w:val="0"/>
-        <w:keepLines/>
-        <w:spacing w:after="40"/>
-        <w:ind w:left="283"/>
-      </w:pPr>
-      <w:r>
-        <w:rPr>
-          <w:rFonts w:ascii="Calibri" w:hAnsi="Calibri" w:eastAsia="Noto Sans CJK SC"/>
-          <w:b w:val="0"/>
-          <w:sz w:val="20"/>
-        </w:rPr>
-        <w:t xml:space="preserve">▪ </w:t>
-      </w:r>
-      <w:r>
-        <w:rPr>
-          <w:rFonts w:ascii="Calibri" w:hAnsi="Calibri" w:eastAsia="Noto Sans CJK SC"/>
-          <w:b w:val="0"/>
-          <w:sz w:val="21"/>
-        </w:rPr>
-        <w:t>1000+ 独立设计与执行的功能 / 接口 / 回归用例（覆盖 4 条产品线，回归基线持续维护）</w:t>
-      </w:r>
-    </w:p>
-    <w:p>
-      <w:pPr>
-        <w:keepNext w:val="0"/>
-        <w:keepLines/>
-        <w:spacing w:after="40"/>
-        <w:ind w:left="283"/>
-      </w:pPr>
-      <w:r>
-        <w:rPr>
-          <w:rFonts w:ascii="Calibri" w:hAnsi="Calibri" w:eastAsia="Noto Sans CJK SC"/>
-          <w:b w:val="0"/>
-          <w:sz w:val="20"/>
-        </w:rPr>
-        <w:t xml:space="preserve">▪ </w:t>
-      </w:r>
-      <w:r>
-        <w:rPr>
-          <w:rFonts w:ascii="Calibri" w:hAnsi="Calibri" w:eastAsia="Noto Sans CJK SC"/>
-          <w:b w:val="0"/>
-          <w:sz w:val="21"/>
-        </w:rPr>
-        <w:t>50+ 核心 API 自动巡检（MeterSphere 定时执行、断言、异常钉钉告警）</w:t>
-      </w:r>
-    </w:p>
-    <w:p>
-      <w:pPr>
-        <w:keepNext w:val="0"/>
-        <w:keepLines/>
-        <w:spacing w:after="40"/>
-        <w:ind w:left="283"/>
-      </w:pPr>
-      <w:r>
-        <w:rPr>
-          <w:rFonts w:ascii="Calibri" w:hAnsi="Calibri" w:eastAsia="Noto Sans CJK SC"/>
-          <w:b w:val="0"/>
-          <w:sz w:val="20"/>
-        </w:rPr>
-        <w:t xml:space="preserve">▪ </w:t>
-      </w:r>
-      <w:r>
-        <w:rPr>
-          <w:rFonts w:ascii="Calibri" w:hAnsi="Calibri" w:eastAsia="Noto Sans CJK SC"/>
-          <w:b w:val="0"/>
-          <w:sz w:val="21"/>
-        </w:rPr>
-        <w:t>10+ 企业站点测试环境搭建（摄像头 / 分机 / AI 盒子现场联调）</w:t>
-      </w:r>
-    </w:p>
-    <w:p>
-      <w:pPr>
-        <w:keepNext w:val="0"/>
-        <w:keepLines/>
-        <w:spacing w:after="40"/>
-        <w:ind w:left="283"/>
-      </w:pPr>
-      <w:r>
-        <w:rPr>
-          <w:rFonts w:ascii="Calibri" w:hAnsi="Calibri" w:eastAsia="Noto Sans CJK SC"/>
-          <w:b w:val="0"/>
-          <w:sz w:val="20"/>
-        </w:rPr>
-        <w:t xml:space="preserve">▪ </w:t>
-      </w:r>
-      <w:r>
-        <w:rPr>
-          <w:rFonts w:ascii="Calibri" w:hAnsi="Calibri" w:eastAsia="Noto Sans CJK SC"/>
-          <w:b w:val="0"/>
-          <w:sz w:val="21"/>
-        </w:rPr>
-        <w:t>1 年+ 测试 / 测试开发经验（AI 应用测试 · ATE 上位机 · AOI 设备软件）</w:t>
+        <w:t>专注软件测试开发、AI 应用测试与半导体设备软件测试。 软件工程本科，1 年+测试与测试开发经验。覆盖半导体设备软件、AI 智能体与 Web 应用，积累 1000+ 用例和 50+ 核心 API 自动巡检实践。使用 Python、Pytest 与 Playwright 编写自动化，结合接口、SQL 和日志定位问题。</w:t>
       </w:r>
     </w:p>
     <w:p>
@@ -451,135 +337,7 @@
           <w:b w:val="0"/>
           <w:sz w:val="21"/>
         </w:rPr>
-        <w:t>设备操作流程 / 检测模板 / 建模 / 成像完整性检查 / 测试记录 / 问题跟踪</w:t>
-      </w:r>
-    </w:p>
-    <w:p>
-      <w:pPr>
-        <w:keepNext w:val="0"/>
-        <w:keepLines/>
-        <w:spacing w:after="40"/>
-      </w:pPr>
-      <w:r>
-        <w:rPr>
-          <w:rFonts w:ascii="Calibri" w:hAnsi="Calibri" w:eastAsia="Noto Sans CJK SC"/>
-          <w:b/>
-          <w:sz w:val="21"/>
-        </w:rPr>
-        <w:t xml:space="preserve">Desktop Testing </w:t>
-      </w:r>
-      <w:r>
-        <w:rPr>
-          <w:rFonts w:ascii="Calibri" w:hAnsi="Calibri" w:eastAsia="Noto Sans CJK SC"/>
-          <w:b w:val="0"/>
-          <w:color w:val="666666"/>
-          <w:sz w:val="19"/>
-        </w:rPr>
-        <w:t xml:space="preserve">（项目实践） </w:t>
-      </w:r>
-      <w:r>
-        <w:rPr>
-          <w:rFonts w:ascii="Calibri" w:hAnsi="Calibri" w:eastAsia="Noto Sans CJK SC"/>
-          <w:b w:val="0"/>
-          <w:sz w:val="21"/>
-        </w:rPr>
-        <w:t>Windows 上位机 / ATE 设备通信链路 / UI 自动化 / 稳定性 / 压力测试</w:t>
-      </w:r>
-    </w:p>
-    <w:p>
-      <w:pPr>
-        <w:keepNext w:val="0"/>
-        <w:keepLines/>
-        <w:spacing w:after="40"/>
-      </w:pPr>
-      <w:r>
-        <w:rPr>
-          <w:rFonts w:ascii="Calibri" w:hAnsi="Calibri" w:eastAsia="Noto Sans CJK SC"/>
-          <w:b/>
-          <w:sz w:val="21"/>
-        </w:rPr>
-        <w:t xml:space="preserve">Performance </w:t>
-      </w:r>
-      <w:r>
-        <w:rPr>
-          <w:rFonts w:ascii="Calibri" w:hAnsi="Calibri" w:eastAsia="Noto Sans CJK SC"/>
-          <w:b w:val="0"/>
-          <w:color w:val="666666"/>
-          <w:sz w:val="19"/>
-        </w:rPr>
-        <w:t xml:space="preserve">（实际项目使用） </w:t>
-      </w:r>
-      <w:r>
-        <w:rPr>
-          <w:rFonts w:ascii="Calibri" w:hAnsi="Calibri" w:eastAsia="Noto Sans CJK SC"/>
-          <w:b w:val="0"/>
-          <w:sz w:val="21"/>
-        </w:rPr>
-        <w:t>JMeter / 长时间压测 / 资源占用监控 / 响应延迟分析</w:t>
-      </w:r>
-    </w:p>
-    <w:p>
-      <w:pPr>
-        <w:keepNext w:val="0"/>
-        <w:keepLines/>
-        <w:spacing w:after="40"/>
-      </w:pPr>
-      <w:r>
-        <w:rPr>
-          <w:rFonts w:ascii="Calibri" w:hAnsi="Calibri" w:eastAsia="Noto Sans CJK SC"/>
-          <w:b/>
-          <w:sz w:val="21"/>
-        </w:rPr>
-        <w:t xml:space="preserve">CI / CD </w:t>
-      </w:r>
-      <w:r>
-        <w:rPr>
-          <w:rFonts w:ascii="Calibri" w:hAnsi="Calibri" w:eastAsia="Noto Sans CJK SC"/>
-          <w:b w:val="0"/>
-          <w:color w:val="666666"/>
-          <w:sz w:val="19"/>
-        </w:rPr>
-        <w:t xml:space="preserve">（实际项目使用） </w:t>
-      </w:r>
-      <w:r>
-        <w:rPr>
-          <w:rFonts w:ascii="Calibri" w:hAnsi="Calibri" w:eastAsia="Noto Sans CJK SC"/>
-          <w:b w:val="0"/>
-          <w:sz w:val="21"/>
-        </w:rPr>
-        <w:t>Jenkins / MeterSphere 定时巡检 / 钉钉告警 / Git</w:t>
-      </w:r>
-    </w:p>
-    <w:p>
-      <w:pPr>
-        <w:keepNext w:val="0"/>
-        <w:keepLines/>
-        <w:spacing w:after="40"/>
-      </w:pPr>
-      <w:r>
-        <w:rPr>
-          <w:rFonts w:ascii="Calibri" w:hAnsi="Calibri" w:eastAsia="Noto Sans CJK SC"/>
-          <w:b/>
-          <w:sz w:val="21"/>
-        </w:rPr>
-        <w:t xml:space="preserve">Linux &amp; Shell </w:t>
-      </w:r>
-      <w:r>
-        <w:rPr>
-          <w:rFonts w:ascii="Calibri" w:hAnsi="Calibri" w:eastAsia="Noto Sans CJK SC"/>
-          <w:b w:val="0"/>
-          <w:color w:val="666666"/>
-          <w:sz w:val="19"/>
-        </w:rPr>
-        <w:t xml:space="preserve">（实际项目使用） </w:t>
-      </w:r>
-      <w:r>
-        <w:rPr>
-          <w:rFonts w:ascii="Calibri" w:hAnsi="Calibri" w:eastAsia="Noto Sans CJK SC"/>
-          <w:b w:val="0"/>
-          <w:sz w:val="21"/>
-        </w:rPr>
-        <w:t>Linux / Shell / 日志分析 / Docker / 服务状态排查</w:t>
+        <w:t>设备软件功能验证 / 成像结果核查 / 异常场景 / 问题跟踪</w:t>
       </w:r>
     </w:p>
     <w:p>
@@ -701,7 +459,7 @@
           <w:b/>
           <w:sz w:val="21"/>
         </w:rPr>
-        <w:t>设备流程梳理：</w:t>
+        <w:t>设备软件验证：</w:t>
       </w:r>
       <w:r>
         <w:rPr>
@@ -709,7 +467,7 @@
           <w:b w:val="0"/>
           <w:sz w:val="21"/>
         </w:rPr>
-        <w:t>结合设备作业指导书与软件功能清单，梳理操作流程、功能入口和测试关注点，逐步建立设备软件测试清单。</w:t>
+        <w:t>结合设备作业指导书与软件功能清单梳理测试范围，整理操作流程、功能入口和异常场景，形成可执行的测试清单。</w:t>
       </w:r>
     </w:p>
     <w:p>
@@ -733,7 +491,7 @@
           <w:b/>
           <w:sz w:val="21"/>
         </w:rPr>
-        <w:t>建模与检测记录：</w:t>
+        <w:t>检测结果核查：</w:t>
       </w:r>
       <w:r>
         <w:rPr>
@@ -741,7 +499,7 @@
           <w:b w:val="0"/>
           <w:sz w:val="21"/>
         </w:rPr>
-        <w:t>参与 MPW 晶圆建模流程学习与检测验证，整理截图和检测记录，关注拍摄位置偏移、Die 成像不完整等影响检测覆盖的问题。</w:t>
+        <w:t>核对成像范围与检测结果，记录位置偏移、图像覆盖不完整等问题，整理截图、问题现象与复现条件，为后续排查和回归提供依据。</w:t>
       </w:r>
     </w:p>
     <w:p>
@@ -773,7 +531,7 @@
           <w:b w:val="0"/>
           <w:sz w:val="21"/>
         </w:rPr>
-        <w:t>推进轻量测试管理系统的需求与交互设计，按项目、软件版本、功能模块组织问题，完善进度说明、附件及测试用例管理。</w:t>
+        <w:t>设计并迭代轻量测试管理系统，按项目、软件版本、功能模块组织问题，完善进度说明、截图附件与测试用例管理，兼顾操作员录入和管理者查看进度。</w:t>
       </w:r>
     </w:p>
     <w:p>
@@ -1302,7 +1060,7 @@
           <w:b/>
           <w:sz w:val="22"/>
         </w:rPr>
-        <w:t xml:space="preserve">半导体 AOI 设备软件测试与检测记录　</w:t>
+        <w:t xml:space="preserve">轻量测试管理系统　</w:t>
       </w:r>
       <w:r>
         <w:rPr>
@@ -1311,7 +1069,7 @@
           <w:color w:val="666666"/>
           <w:sz w:val="19"/>
         </w:rPr>
-        <w:t xml:space="preserve">[软件测试]　</w:t>
+        <w:t xml:space="preserve">[测试工具设计]　</w:t>
       </w:r>
       <w:r>
         <w:rPr>
@@ -1320,7 +1078,7 @@
           <w:color w:val="666666"/>
           <w:sz w:val="19"/>
         </w:rPr>
-        <w:t>2026.09 — 至今</w:t>
+        <w:t>2026.10 — 至今</w:t>
       </w:r>
     </w:p>
     <w:p>
@@ -1344,7 +1102,7 @@
           <w:b/>
           <w:sz w:val="21"/>
         </w:rPr>
-        <w:t>问题与方法：</w:t>
+        <w:t>测试实践：</w:t>
       </w:r>
       <w:r>
         <w:rPr>
@@ -1352,79 +1110,7 @@
           <w:b w:val="0"/>
           <w:sz w:val="21"/>
         </w:rPr>
-        <w:t>光学检测结果依赖设备操作、模板参数和成像范围，需要把软件流程、现场现象与检测记录对应起来。 结合操作手册梳理建模与检测流程，按截图整理检测记录，记录拍摄偏移、Die 成像不完整等现象，并核对相机定位与建模环节。</w:t>
-      </w:r>
-    </w:p>
-    <w:p>
-      <w:pPr>
-        <w:keepNext w:val="0"/>
-        <w:keepLines/>
-        <w:spacing w:after="40"/>
-        <w:ind w:left="283"/>
-      </w:pPr>
-      <w:r>
-        <w:rPr>
-          <w:rFonts w:ascii="Calibri" w:hAnsi="Calibri" w:eastAsia="Noto Sans CJK SC"/>
-          <w:b w:val="0"/>
-          <w:sz w:val="20"/>
-        </w:rPr>
-        <w:t xml:space="preserve">▪ </w:t>
-      </w:r>
-      <w:r>
-        <w:rPr>
-          <w:rFonts w:ascii="Calibri" w:hAnsi="Calibri" w:eastAsia="Noto Sans CJK SC"/>
-          <w:b w:val="0"/>
-          <w:sz w:val="21"/>
-        </w:rPr>
-        <w:t>按操作步骤整理功能入口与测试关注点</w:t>
-      </w:r>
-    </w:p>
-    <w:p>
-      <w:pPr>
-        <w:keepNext w:val="0"/>
-        <w:keepLines/>
-        <w:spacing w:after="40"/>
-        <w:ind w:left="283"/>
-      </w:pPr>
-      <w:r>
-        <w:rPr>
-          <w:rFonts w:ascii="Calibri" w:hAnsi="Calibri" w:eastAsia="Noto Sans CJK SC"/>
-          <w:b w:val="0"/>
-          <w:sz w:val="20"/>
-        </w:rPr>
-        <w:t xml:space="preserve">▪ </w:t>
-      </w:r>
-      <w:r>
-        <w:rPr>
-          <w:rFonts w:ascii="Calibri" w:hAnsi="Calibri" w:eastAsia="Noto Sans CJK SC"/>
-          <w:b w:val="0"/>
-          <w:sz w:val="21"/>
-        </w:rPr>
-        <w:t>检查拍摄位置与 Die 成像完整性，保留现象截图</w:t>
-      </w:r>
-    </w:p>
-    <w:p>
-      <w:pPr>
-        <w:keepNext w:val="0"/>
-        <w:keepLines/>
-        <w:spacing w:after="40"/>
-        <w:ind w:left="283"/>
-      </w:pPr>
-      <w:r>
-        <w:rPr>
-          <w:rFonts w:ascii="Calibri" w:hAnsi="Calibri" w:eastAsia="Noto Sans CJK SC"/>
-          <w:b w:val="0"/>
-          <w:sz w:val="20"/>
-        </w:rPr>
-        <w:t xml:space="preserve">▪ </w:t>
-      </w:r>
-      <w:r>
-        <w:rPr>
-          <w:rFonts w:ascii="Calibri" w:hAnsi="Calibri" w:eastAsia="Noto Sans CJK SC"/>
-          <w:b w:val="0"/>
-          <w:sz w:val="21"/>
-        </w:rPr>
-        <w:t>将问题现象、复现条件与记录对应，便于后续验证</w:t>
+        <w:t>按项目、软件版本、功能模块组织问题，设计问题记录、进度说明和附件关联流程，持续调整 PC 与移动端的信息展示和操作入口。</w:t>
       </w:r>
     </w:p>
     <w:p>
@@ -1456,514 +1142,7 @@
           <w:b w:val="0"/>
           <w:sz w:val="21"/>
         </w:rPr>
-        <w:t>已整理 MPW 检测记录与截图材料，持续完善设备流程理解和测试清单。</w:t>
-      </w:r>
-    </w:p>
-    <w:p>
-      <w:pPr>
-        <w:keepNext/>
-        <w:keepLines/>
-        <w:spacing w:before="100" w:after="20"/>
-      </w:pPr>
-      <w:r>
-        <w:rPr>
-          <w:rFonts w:ascii="Calibri" w:hAnsi="Calibri" w:eastAsia="Noto Sans CJK SC"/>
-          <w:b/>
-          <w:sz w:val="22"/>
-        </w:rPr>
-        <w:t xml:space="preserve">车规级芯片测试机（ATE）上位机软件　</w:t>
-      </w:r>
-      <w:r>
-        <w:rPr>
-          <w:rFonts w:ascii="Calibri" w:hAnsi="Calibri" w:eastAsia="Noto Sans CJK SC"/>
-          <w:b w:val="0"/>
-          <w:color w:val="666666"/>
-          <w:sz w:val="19"/>
-        </w:rPr>
-        <w:t xml:space="preserve">[软件测试]　</w:t>
-      </w:r>
-      <w:r>
-        <w:rPr>
-          <w:rFonts w:ascii="Calibri" w:hAnsi="Calibri" w:eastAsia="Noto Sans CJK SC"/>
-          <w:b w:val="0"/>
-          <w:color w:val="666666"/>
-          <w:sz w:val="19"/>
-        </w:rPr>
-        <w:t>2026.07 — 2026.09</w:t>
-      </w:r>
-    </w:p>
-    <w:p>
-      <w:pPr>
-        <w:keepNext w:val="0"/>
-        <w:keepLines/>
-        <w:spacing w:after="40"/>
-        <w:ind w:left="283"/>
-      </w:pPr>
-      <w:r>
-        <w:rPr>
-          <w:rFonts w:ascii="Calibri" w:hAnsi="Calibri" w:eastAsia="Noto Sans CJK SC"/>
-          <w:b w:val="0"/>
-          <w:sz w:val="20"/>
-        </w:rPr>
-        <w:t xml:space="preserve">▪ </w:t>
-      </w:r>
-      <w:r>
-        <w:rPr>
-          <w:rFonts w:ascii="Calibri" w:hAnsi="Calibri" w:eastAsia="Noto Sans CJK SC"/>
-          <w:b/>
-          <w:sz w:val="21"/>
-        </w:rPr>
-        <w:t>问题与方法：</w:t>
-      </w:r>
-      <w:r>
-        <w:rPr>
-          <w:rFonts w:ascii="Calibri" w:hAnsi="Calibri" w:eastAsia="Noto Sans CJK SC"/>
-          <w:b w:val="0"/>
-          <w:sz w:val="21"/>
-        </w:rPr>
-        <w:t>半导体 ATE 上位机软件面向车规级功放芯片、功耗芯片的自动化测试，功能路径深、设备通信链路长、稳定性要求高。 按黑盒方法设计用例，核心路径（指令下发、参数配置、数据采集、状态回传）优先覆盖；搭建界面 UI 自动化支撑版本迭代回归；组织长时间连续运行压测监测资源占用与响应延迟。</w:t>
-      </w:r>
-    </w:p>
-    <w:p>
-      <w:pPr>
-        <w:keepNext w:val="0"/>
-        <w:keepLines/>
-        <w:spacing w:after="40"/>
-        <w:ind w:left="283"/>
-      </w:pPr>
-      <w:r>
-        <w:rPr>
-          <w:rFonts w:ascii="Calibri" w:hAnsi="Calibri" w:eastAsia="Noto Sans CJK SC"/>
-          <w:b w:val="0"/>
-          <w:sz w:val="20"/>
-        </w:rPr>
-        <w:t xml:space="preserve">▪ </w:t>
-      </w:r>
-      <w:r>
-        <w:rPr>
-          <w:rFonts w:ascii="Calibri" w:hAnsi="Calibri" w:eastAsia="Noto Sans CJK SC"/>
-          <w:b w:val="0"/>
-          <w:sz w:val="21"/>
-        </w:rPr>
-        <w:t>功能路径、权限、异常输入、边界数据逐条设计用例</w:t>
-      </w:r>
-    </w:p>
-    <w:p>
-      <w:pPr>
-        <w:keepNext w:val="0"/>
-        <w:keepLines/>
-        <w:spacing w:after="40"/>
-        <w:ind w:left="283"/>
-      </w:pPr>
-      <w:r>
-        <w:rPr>
-          <w:rFonts w:ascii="Calibri" w:hAnsi="Calibri" w:eastAsia="Noto Sans CJK SC"/>
-          <w:b w:val="0"/>
-          <w:sz w:val="20"/>
-        </w:rPr>
-        <w:t xml:space="preserve">▪ </w:t>
-      </w:r>
-      <w:r>
-        <w:rPr>
-          <w:rFonts w:ascii="Calibri" w:hAnsi="Calibri" w:eastAsia="Noto Sans CJK SC"/>
-          <w:b w:val="0"/>
-          <w:sz w:val="21"/>
-        </w:rPr>
-        <w:t>主流程与核心操作路径自动回归</w:t>
-      </w:r>
-    </w:p>
-    <w:p>
-      <w:pPr>
-        <w:keepNext w:val="0"/>
-        <w:keepLines/>
-        <w:spacing w:after="40"/>
-        <w:ind w:left="283"/>
-      </w:pPr>
-      <w:r>
-        <w:rPr>
-          <w:rFonts w:ascii="Calibri" w:hAnsi="Calibri" w:eastAsia="Noto Sans CJK SC"/>
-          <w:b w:val="0"/>
-          <w:sz w:val="20"/>
-        </w:rPr>
-        <w:t xml:space="preserve">▪ </w:t>
-      </w:r>
-      <w:r>
-        <w:rPr>
-          <w:rFonts w:ascii="Calibri" w:hAnsi="Calibri" w:eastAsia="Noto Sans CJK SC"/>
-          <w:b w:val="0"/>
-          <w:sz w:val="21"/>
-        </w:rPr>
-        <w:t>OS × 硬件配置兼容矩阵 + 发布前检查</w:t>
-      </w:r>
-    </w:p>
-    <w:p>
-      <w:pPr>
-        <w:keepNext w:val="0"/>
-        <w:keepLines/>
-        <w:spacing w:after="40"/>
-        <w:ind w:left="283"/>
-      </w:pPr>
-      <w:r>
-        <w:rPr>
-          <w:rFonts w:ascii="Calibri" w:hAnsi="Calibri" w:eastAsia="Noto Sans CJK SC"/>
-          <w:b w:val="0"/>
-          <w:sz w:val="20"/>
-        </w:rPr>
-        <w:t xml:space="preserve">▪ </w:t>
-      </w:r>
-      <w:r>
-        <w:rPr>
-          <w:rFonts w:ascii="Calibri" w:hAnsi="Calibri" w:eastAsia="Noto Sans CJK SC"/>
-          <w:b/>
-          <w:sz w:val="21"/>
-        </w:rPr>
-        <w:t>结果：</w:t>
-      </w:r>
-      <w:r>
-        <w:rPr>
-          <w:rFonts w:ascii="Calibri" w:hAnsi="Calibri" w:eastAsia="Noto Sans CJK SC"/>
-          <w:b w:val="0"/>
-          <w:sz w:val="21"/>
-        </w:rPr>
-        <w:t>版本回归与发布前验证有据可查，稳定性风险通过长时压测提前暴露并闭环。</w:t>
-      </w:r>
-    </w:p>
-    <w:p>
-      <w:pPr>
-        <w:keepNext/>
-        <w:keepLines/>
-        <w:spacing w:before="100" w:after="20"/>
-      </w:pPr>
-      <w:r>
-        <w:rPr>
-          <w:rFonts w:ascii="Calibri" w:hAnsi="Calibri" w:eastAsia="Noto Sans CJK SC"/>
-          <w:b/>
-          <w:sz w:val="22"/>
-        </w:rPr>
-        <w:t xml:space="preserve">星点评 AI 工具平台　</w:t>
-      </w:r>
-      <w:r>
-        <w:rPr>
-          <w:rFonts w:ascii="Calibri" w:hAnsi="Calibri" w:eastAsia="Noto Sans CJK SC"/>
-          <w:b w:val="0"/>
-          <w:color w:val="666666"/>
-          <w:sz w:val="19"/>
-        </w:rPr>
-        <w:t xml:space="preserve">[测试开发]　</w:t>
-      </w:r>
-      <w:r>
-        <w:rPr>
-          <w:rFonts w:ascii="Calibri" w:hAnsi="Calibri" w:eastAsia="Noto Sans CJK SC"/>
-          <w:b w:val="0"/>
-          <w:color w:val="666666"/>
-          <w:sz w:val="19"/>
-        </w:rPr>
-        <w:t>2026.03 — 2026.06</w:t>
-      </w:r>
-    </w:p>
-    <w:p>
-      <w:pPr>
-        <w:keepNext w:val="0"/>
-        <w:keepLines/>
-        <w:spacing w:after="40"/>
-        <w:ind w:left="283"/>
-      </w:pPr>
-      <w:r>
-        <w:rPr>
-          <w:rFonts w:ascii="Calibri" w:hAnsi="Calibri" w:eastAsia="Noto Sans CJK SC"/>
-          <w:b w:val="0"/>
-          <w:sz w:val="20"/>
-        </w:rPr>
-        <w:t xml:space="preserve">▪ </w:t>
-      </w:r>
-      <w:r>
-        <w:rPr>
-          <w:rFonts w:ascii="Calibri" w:hAnsi="Calibri" w:eastAsia="Noto Sans CJK SC"/>
-          <w:b/>
-          <w:sz w:val="21"/>
-        </w:rPr>
-        <w:t>问题与方法：</w:t>
-      </w:r>
-      <w:r>
-        <w:rPr>
-          <w:rFonts w:ascii="Calibri" w:hAnsi="Calibri" w:eastAsia="Noto Sans CJK SC"/>
-          <w:b w:val="0"/>
-          <w:sz w:val="21"/>
-        </w:rPr>
-        <w:t>AI 工具导航与推荐平台：检索、分类筛选、详情展示、榜单推荐、登录注册、数据导入，涉及登录态与数据一致性风险。 按模块拆解业务风险，边界、空数据、异常输入、权限状态单列场景；Playwright 执行主流程自动化，Pytest 校验接口；用 LLM 生成用例初稿与异常数据，结合业务规则人工复核。</w:t>
-      </w:r>
-    </w:p>
-    <w:p>
-      <w:pPr>
-        <w:keepNext w:val="0"/>
-        <w:keepLines/>
-        <w:spacing w:after="40"/>
-        <w:ind w:left="283"/>
-      </w:pPr>
-      <w:r>
-        <w:rPr>
-          <w:rFonts w:ascii="Calibri" w:hAnsi="Calibri" w:eastAsia="Noto Sans CJK SC"/>
-          <w:b w:val="0"/>
-          <w:sz w:val="20"/>
-        </w:rPr>
-        <w:t xml:space="preserve">▪ </w:t>
-      </w:r>
-      <w:r>
-        <w:rPr>
-          <w:rFonts w:ascii="Calibri" w:hAnsi="Calibri" w:eastAsia="Noto Sans CJK SC"/>
-          <w:b w:val="0"/>
-          <w:sz w:val="21"/>
-        </w:rPr>
-        <w:t>登录、未登录、过期三种登录态下的访问控制验证</w:t>
-      </w:r>
-    </w:p>
-    <w:p>
-      <w:pPr>
-        <w:keepNext w:val="0"/>
-        <w:keepLines/>
-        <w:spacing w:after="40"/>
-        <w:ind w:left="283"/>
-      </w:pPr>
-      <w:r>
-        <w:rPr>
-          <w:rFonts w:ascii="Calibri" w:hAnsi="Calibri" w:eastAsia="Noto Sans CJK SC"/>
-          <w:b w:val="0"/>
-          <w:sz w:val="20"/>
-        </w:rPr>
-        <w:t xml:space="preserve">▪ </w:t>
-      </w:r>
-      <w:r>
-        <w:rPr>
-          <w:rFonts w:ascii="Calibri" w:hAnsi="Calibri" w:eastAsia="Noto Sans CJK SC"/>
-          <w:b w:val="0"/>
-          <w:sz w:val="21"/>
-        </w:rPr>
-        <w:t>MySQL 核对导入数据、工具信息、标签和推荐结果</w:t>
-      </w:r>
-    </w:p>
-    <w:p>
-      <w:pPr>
-        <w:keepNext w:val="0"/>
-        <w:keepLines/>
-        <w:spacing w:after="40"/>
-        <w:ind w:left="283"/>
-      </w:pPr>
-      <w:r>
-        <w:rPr>
-          <w:rFonts w:ascii="Calibri" w:hAnsi="Calibri" w:eastAsia="Noto Sans CJK SC"/>
-          <w:b w:val="0"/>
-          <w:sz w:val="20"/>
-        </w:rPr>
-        <w:t xml:space="preserve">▪ </w:t>
-      </w:r>
-      <w:r>
-        <w:rPr>
-          <w:rFonts w:ascii="Calibri" w:hAnsi="Calibri" w:eastAsia="Noto Sans CJK SC"/>
-          <w:b w:val="0"/>
-          <w:sz w:val="21"/>
-        </w:rPr>
-        <w:t>LLM 生成内容做可执行性、覆盖缺口与结果偏差复核</w:t>
-      </w:r>
-    </w:p>
-    <w:p>
-      <w:pPr>
-        <w:keepNext w:val="0"/>
-        <w:keepLines/>
-        <w:spacing w:after="40"/>
-        <w:ind w:left="283"/>
-      </w:pPr>
-      <w:r>
-        <w:rPr>
-          <w:rFonts w:ascii="Calibri" w:hAnsi="Calibri" w:eastAsia="Noto Sans CJK SC"/>
-          <w:b w:val="0"/>
-          <w:sz w:val="20"/>
-        </w:rPr>
-        <w:t xml:space="preserve">▪ </w:t>
-      </w:r>
-      <w:r>
-        <w:rPr>
-          <w:rFonts w:ascii="Calibri" w:hAnsi="Calibri" w:eastAsia="Noto Sans CJK SC"/>
-          <w:b/>
-          <w:sz w:val="21"/>
-        </w:rPr>
-        <w:t>结果：</w:t>
-      </w:r>
-      <w:r>
-        <w:rPr>
-          <w:rFonts w:ascii="Calibri" w:hAnsi="Calibri" w:eastAsia="Noto Sans CJK SC"/>
-          <w:b w:val="0"/>
-          <w:sz w:val="21"/>
-        </w:rPr>
-        <w:t>核心路径全覆盖，页面行为与接口返回逐项比对，登录态与数据口径问题在提测前拦截。</w:t>
-      </w:r>
-    </w:p>
-    <w:p>
-      <w:pPr>
-        <w:keepNext/>
-        <w:keepLines/>
-        <w:spacing w:before="100" w:after="20"/>
-      </w:pPr>
-      <w:r>
-        <w:rPr>
-          <w:rFonts w:ascii="Calibri" w:hAnsi="Calibri" w:eastAsia="Noto Sans CJK SC"/>
-          <w:b/>
-          <w:sz w:val="22"/>
-        </w:rPr>
-        <w:t xml:space="preserve">数字分身小程序自动化　</w:t>
-      </w:r>
-      <w:r>
-        <w:rPr>
-          <w:rFonts w:ascii="Calibri" w:hAnsi="Calibri" w:eastAsia="Noto Sans CJK SC"/>
-          <w:b w:val="0"/>
-          <w:color w:val="666666"/>
-          <w:sz w:val="19"/>
-        </w:rPr>
-        <w:t xml:space="preserve">[测试开发]　</w:t>
-      </w:r>
-      <w:r>
-        <w:rPr>
-          <w:rFonts w:ascii="Calibri" w:hAnsi="Calibri" w:eastAsia="Noto Sans CJK SC"/>
-          <w:b w:val="0"/>
-          <w:color w:val="666666"/>
-          <w:sz w:val="19"/>
-        </w:rPr>
-        <w:t>2026.05 — 2026.06</w:t>
-      </w:r>
-    </w:p>
-    <w:p>
-      <w:pPr>
-        <w:keepNext w:val="0"/>
-        <w:keepLines/>
-        <w:spacing w:after="40"/>
-        <w:ind w:left="283"/>
-      </w:pPr>
-      <w:r>
-        <w:rPr>
-          <w:rFonts w:ascii="Calibri" w:hAnsi="Calibri" w:eastAsia="Noto Sans CJK SC"/>
-          <w:b w:val="0"/>
-          <w:sz w:val="20"/>
-        </w:rPr>
-        <w:t xml:space="preserve">▪ </w:t>
-      </w:r>
-      <w:r>
-        <w:rPr>
-          <w:rFonts w:ascii="Calibri" w:hAnsi="Calibri" w:eastAsia="Noto Sans CJK SC"/>
-          <w:b/>
-          <w:sz w:val="21"/>
-        </w:rPr>
-        <w:t>问题与方法：</w:t>
-      </w:r>
-      <w:r>
-        <w:rPr>
-          <w:rFonts w:ascii="Calibri" w:hAnsi="Calibri" w:eastAsia="Noto Sans CJK SC"/>
-          <w:b w:val="0"/>
-          <w:sz w:val="21"/>
-        </w:rPr>
-        <w:t>数字分身小程序缺少真实 UI 自动化，微信开发者工具自动化端口不稳定，元素定位易变。 接入微信开发者工具自动化端口；Python 解析 dist/app.json 以 auto 模式执行 Pytest，覆盖注册激活、Tab 导航、旅行入口、供需档案、数字档案、账号设置全流程；重试机制应对端口不稳定，参数管理与执行逻辑分离。</w:t>
-      </w:r>
-    </w:p>
-    <w:p>
-      <w:pPr>
-        <w:keepNext w:val="0"/>
-        <w:keepLines/>
-        <w:spacing w:after="40"/>
-        <w:ind w:left="283"/>
-      </w:pPr>
-      <w:r>
-        <w:rPr>
-          <w:rFonts w:ascii="Calibri" w:hAnsi="Calibri" w:eastAsia="Noto Sans CJK SC"/>
-          <w:b w:val="0"/>
-          <w:sz w:val="20"/>
-        </w:rPr>
-        <w:t xml:space="preserve">▪ </w:t>
-      </w:r>
-      <w:r>
-        <w:rPr>
-          <w:rFonts w:ascii="Calibri" w:hAnsi="Calibri" w:eastAsia="Noto Sans CJK SC"/>
-          <w:b w:val="0"/>
-          <w:sz w:val="21"/>
-        </w:rPr>
-        <w:t>自动化端口不稳定 → 重试机制 + 定位策略优化</w:t>
-      </w:r>
-    </w:p>
-    <w:p>
-      <w:pPr>
-        <w:keepNext w:val="0"/>
-        <w:keepLines/>
-        <w:spacing w:after="40"/>
-        <w:ind w:left="283"/>
-      </w:pPr>
-      <w:r>
-        <w:rPr>
-          <w:rFonts w:ascii="Calibri" w:hAnsi="Calibri" w:eastAsia="Noto Sans CJK SC"/>
-          <w:b w:val="0"/>
-          <w:sz w:val="20"/>
-        </w:rPr>
-        <w:t xml:space="preserve">▪ </w:t>
-      </w:r>
-      <w:r>
-        <w:rPr>
-          <w:rFonts w:ascii="Calibri" w:hAnsi="Calibri" w:eastAsia="Noto Sans CJK SC"/>
-          <w:b w:val="0"/>
-          <w:sz w:val="21"/>
-        </w:rPr>
-        <w:t>多环境配置冲突 → 参数管理与执行逻辑分离</w:t>
-      </w:r>
-    </w:p>
-    <w:p>
-      <w:pPr>
-        <w:keepNext w:val="0"/>
-        <w:keepLines/>
-        <w:spacing w:after="40"/>
-        <w:ind w:left="283"/>
-      </w:pPr>
-      <w:r>
-        <w:rPr>
-          <w:rFonts w:ascii="Calibri" w:hAnsi="Calibri" w:eastAsia="Noto Sans CJK SC"/>
-          <w:b w:val="0"/>
-          <w:sz w:val="20"/>
-        </w:rPr>
-        <w:t xml:space="preserve">▪ </w:t>
-      </w:r>
-      <w:r>
-        <w:rPr>
-          <w:rFonts w:ascii="Calibri" w:hAnsi="Calibri" w:eastAsia="Noto Sans CJK SC"/>
-          <w:b w:val="0"/>
-          <w:sz w:val="21"/>
-        </w:rPr>
-        <w:t>缺陷报告自动生成：截图 / JUnit / HTML / Markdown</w:t>
-      </w:r>
-    </w:p>
-    <w:p>
-      <w:pPr>
-        <w:keepNext w:val="0"/>
-        <w:keepLines/>
-        <w:spacing w:after="40"/>
-        <w:ind w:left="283"/>
-      </w:pPr>
-      <w:r>
-        <w:rPr>
-          <w:rFonts w:ascii="Calibri" w:hAnsi="Calibri" w:eastAsia="Noto Sans CJK SC"/>
-          <w:b w:val="0"/>
-          <w:sz w:val="20"/>
-        </w:rPr>
-        <w:t xml:space="preserve">▪ </w:t>
-      </w:r>
-      <w:r>
-        <w:rPr>
-          <w:rFonts w:ascii="Calibri" w:hAnsi="Calibri" w:eastAsia="Noto Sans CJK SC"/>
-          <w:b/>
-          <w:sz w:val="21"/>
-        </w:rPr>
-        <w:t>结果：</w:t>
-      </w:r>
-      <w:r>
-        <w:rPr>
-          <w:rFonts w:ascii="Calibri" w:hAnsi="Calibri" w:eastAsia="Noto Sans CJK SC"/>
-          <w:b w:val="0"/>
-          <w:sz w:val="21"/>
-        </w:rPr>
-        <w:t>冒烟、核心流程与协议文案回归自动化，缺陷报告含严重级别、复现步骤与修复建议。</w:t>
+        <w:t>形成问题分层、进度说明与附件关联的系统设计，持续迭代录入和查看流程。</w:t>
       </w:r>
     </w:p>
     <w:p>
@@ -2020,7 +1199,7 @@
           <w:b/>
           <w:sz w:val="21"/>
         </w:rPr>
-        <w:t>问题与方法：</w:t>
+        <w:t>测试实践：</w:t>
       </w:r>
       <w:r>
         <w:rPr>
@@ -2028,79 +1207,7 @@
           <w:b w:val="0"/>
           <w:sz w:val="21"/>
         </w:rPr>
-        <w:t>企业数据分析平台以自然语言提问生成数据查询，模型输出偏差、工具调用失败与数据口径不一致是高发风险。 正常、异常、边界、无权限、空结果、口径不一致六类场景全覆盖；Text-to-SQL 五维验证（用户问题、SQL 生成、查询结果、页面展示、业务口径）；Postman、MeterSphere 验证接口，SQL 核对 AI 返回与真实业务数据一致性。</w:t>
-      </w:r>
-    </w:p>
-    <w:p>
-      <w:pPr>
-        <w:keepNext w:val="0"/>
-        <w:keepLines/>
-        <w:spacing w:after="40"/>
-        <w:ind w:left="283"/>
-      </w:pPr>
-      <w:r>
-        <w:rPr>
-          <w:rFonts w:ascii="Calibri" w:hAnsi="Calibri" w:eastAsia="Noto Sans CJK SC"/>
-          <w:b w:val="0"/>
-          <w:sz w:val="20"/>
-        </w:rPr>
-        <w:t xml:space="preserve">▪ </w:t>
-      </w:r>
-      <w:r>
-        <w:rPr>
-          <w:rFonts w:ascii="Calibri" w:hAnsi="Calibri" w:eastAsia="Noto Sans CJK SC"/>
-          <w:b w:val="0"/>
-          <w:sz w:val="21"/>
-        </w:rPr>
-        <w:t>五维验证：问题 → SQL → 结果 → 展示 → 口径逐项核对</w:t>
-      </w:r>
-    </w:p>
-    <w:p>
-      <w:pPr>
-        <w:keepNext w:val="0"/>
-        <w:keepLines/>
-        <w:spacing w:after="40"/>
-        <w:ind w:left="283"/>
-      </w:pPr>
-      <w:r>
-        <w:rPr>
-          <w:rFonts w:ascii="Calibri" w:hAnsi="Calibri" w:eastAsia="Noto Sans CJK SC"/>
-          <w:b w:val="0"/>
-          <w:sz w:val="20"/>
-        </w:rPr>
-        <w:t xml:space="preserve">▪ </w:t>
-      </w:r>
-      <w:r>
-        <w:rPr>
-          <w:rFonts w:ascii="Calibri" w:hAnsi="Calibri" w:eastAsia="Noto Sans CJK SC"/>
-          <w:b w:val="0"/>
-          <w:sz w:val="21"/>
-        </w:rPr>
-        <w:t>接口参数、返回结构、状态码、异常提示、权限控制验证</w:t>
-      </w:r>
-    </w:p>
-    <w:p>
-      <w:pPr>
-        <w:keepNext w:val="0"/>
-        <w:keepLines/>
-        <w:spacing w:after="40"/>
-        <w:ind w:left="283"/>
-      </w:pPr>
-      <w:r>
-        <w:rPr>
-          <w:rFonts w:ascii="Calibri" w:hAnsi="Calibri" w:eastAsia="Noto Sans CJK SC"/>
-          <w:b w:val="0"/>
-          <w:sz w:val="20"/>
-        </w:rPr>
-        <w:t xml:space="preserve">▪ </w:t>
-      </w:r>
-      <w:r>
-        <w:rPr>
-          <w:rFonts w:ascii="Calibri" w:hAnsi="Calibri" w:eastAsia="Noto Sans CJK SC"/>
-          <w:b w:val="0"/>
-          <w:sz w:val="21"/>
-        </w:rPr>
-        <w:t>缺陷从复现、提交到回归全程跟进</w:t>
+        <w:t>正常、异常、边界、无权限、空结果、口径不一致六类场景全覆盖；Text-to-SQL 五维验证（用户问题、SQL 生成、查询结果、页面展示、业务口径）；Postman、MeterSphere 验证接口，SQL 核对 AI 返回与真实业务数据一致性。</w:t>
       </w:r>
     </w:p>
     <w:p>

</xml_diff>

<commit_message>
Refine resume visual hierarchy, project browsing and professional narrative (#2)
</commit_message>
<xml_diff>
--- a/docs/秦宇-测试工程师.docx
+++ b/docs/秦宇-测试工程师.docx
@@ -159,121 +159,7 @@
           <w:b w:val="0"/>
           <w:sz w:val="21"/>
         </w:rPr>
-        <w:t>专注软件测试开发、AI 应用测试与半导体设备软件测试。 软件工程本科，1 年+测试 / 测试开发经验。目前在珠海诚锋科技从事半导体 AOI 设备软件测试，此前参与 ATE 上位机测试与 AI 智能体平台测试，积累 1000+ 用例与 50+ 核心 API 自动巡检实践。结合接口、SQL 与日志定位问题，持续推进测试自动化。</w:t>
-      </w:r>
-    </w:p>
-    <w:p>
-      <w:pPr>
-        <w:keepNext/>
-        <w:spacing w:before="200" w:after="80"/>
-        <w:pBdr>
-          <w:left w:val="single" w:sz="18" w:color="1A1A1A"/>
-        </w:pBdr>
-      </w:pPr>
-      <w:r>
-        <w:rPr>
-          <w:rFonts w:ascii="Calibri" w:hAnsi="Calibri" w:eastAsia="Noto Sans CJK SC"/>
-          <w:b/>
-          <w:color w:val="1A1A1A"/>
-          <w:sz w:val="25"/>
-        </w:rPr>
-        <w:t>核心亮点</w:t>
-      </w:r>
-    </w:p>
-    <w:p>
-      <w:pPr>
-        <w:keepNext w:val="0"/>
-        <w:keepLines/>
-        <w:spacing w:after="40"/>
-        <w:ind w:left="283"/>
-      </w:pPr>
-      <w:r>
-        <w:rPr>
-          <w:rFonts w:ascii="Calibri" w:hAnsi="Calibri" w:eastAsia="Noto Sans CJK SC"/>
-          <w:b w:val="0"/>
-          <w:sz w:val="20"/>
-        </w:rPr>
-        <w:t xml:space="preserve">▪ </w:t>
-      </w:r>
-      <w:r>
-        <w:rPr>
-          <w:rFonts w:ascii="Calibri" w:hAnsi="Calibri" w:eastAsia="Noto Sans CJK SC"/>
-          <w:b w:val="0"/>
-          <w:sz w:val="21"/>
-        </w:rPr>
-        <w:t>1000+ 独立设计与执行的功能 / 接口 / 回归用例（覆盖 4 条产品线，回归基线持续维护）</w:t>
-      </w:r>
-    </w:p>
-    <w:p>
-      <w:pPr>
-        <w:keepNext w:val="0"/>
-        <w:keepLines/>
-        <w:spacing w:after="40"/>
-        <w:ind w:left="283"/>
-      </w:pPr>
-      <w:r>
-        <w:rPr>
-          <w:rFonts w:ascii="Calibri" w:hAnsi="Calibri" w:eastAsia="Noto Sans CJK SC"/>
-          <w:b w:val="0"/>
-          <w:sz w:val="20"/>
-        </w:rPr>
-        <w:t xml:space="preserve">▪ </w:t>
-      </w:r>
-      <w:r>
-        <w:rPr>
-          <w:rFonts w:ascii="Calibri" w:hAnsi="Calibri" w:eastAsia="Noto Sans CJK SC"/>
-          <w:b w:val="0"/>
-          <w:sz w:val="21"/>
-        </w:rPr>
-        <w:t>50+ 核心 API 自动巡检（MeterSphere 定时执行、断言、异常钉钉告警）</w:t>
-      </w:r>
-    </w:p>
-    <w:p>
-      <w:pPr>
-        <w:keepNext w:val="0"/>
-        <w:keepLines/>
-        <w:spacing w:after="40"/>
-        <w:ind w:left="283"/>
-      </w:pPr>
-      <w:r>
-        <w:rPr>
-          <w:rFonts w:ascii="Calibri" w:hAnsi="Calibri" w:eastAsia="Noto Sans CJK SC"/>
-          <w:b w:val="0"/>
-          <w:sz w:val="20"/>
-        </w:rPr>
-        <w:t xml:space="preserve">▪ </w:t>
-      </w:r>
-      <w:r>
-        <w:rPr>
-          <w:rFonts w:ascii="Calibri" w:hAnsi="Calibri" w:eastAsia="Noto Sans CJK SC"/>
-          <w:b w:val="0"/>
-          <w:sz w:val="21"/>
-        </w:rPr>
-        <w:t>10+ 企业站点测试环境搭建（摄像头 / 分机 / AI 盒子现场联调）</w:t>
-      </w:r>
-    </w:p>
-    <w:p>
-      <w:pPr>
-        <w:keepNext w:val="0"/>
-        <w:keepLines/>
-        <w:spacing w:after="40"/>
-        <w:ind w:left="283"/>
-      </w:pPr>
-      <w:r>
-        <w:rPr>
-          <w:rFonts w:ascii="Calibri" w:hAnsi="Calibri" w:eastAsia="Noto Sans CJK SC"/>
-          <w:b w:val="0"/>
-          <w:sz w:val="20"/>
-        </w:rPr>
-        <w:t xml:space="preserve">▪ </w:t>
-      </w:r>
-      <w:r>
-        <w:rPr>
-          <w:rFonts w:ascii="Calibri" w:hAnsi="Calibri" w:eastAsia="Noto Sans CJK SC"/>
-          <w:b w:val="0"/>
-          <w:sz w:val="21"/>
-        </w:rPr>
-        <w:t>1 年+ 测试 / 测试开发经验（AI 应用测试 · ATE 上位机 · AOI 设备软件）</w:t>
+        <w:t>专注软件测试开发、AI 应用测试与半导体设备软件测试。 软件工程本科，1 年+测试与测试开发经验。覆盖半导体设备软件、AI 智能体与 Web 应用，积累 1000+ 用例和 50+ 核心 API 自动巡检实践。使用 Python、Pytest 与 Playwright 编写自动化，结合接口、SQL 和日志定位问题。</w:t>
       </w:r>
     </w:p>
     <w:p>
@@ -451,135 +337,7 @@
           <w:b w:val="0"/>
           <w:sz w:val="21"/>
         </w:rPr>
-        <w:t>设备操作流程 / 检测模板 / 建模 / 成像完整性检查 / 测试记录 / 问题跟踪</w:t>
-      </w:r>
-    </w:p>
-    <w:p>
-      <w:pPr>
-        <w:keepNext w:val="0"/>
-        <w:keepLines/>
-        <w:spacing w:after="40"/>
-      </w:pPr>
-      <w:r>
-        <w:rPr>
-          <w:rFonts w:ascii="Calibri" w:hAnsi="Calibri" w:eastAsia="Noto Sans CJK SC"/>
-          <w:b/>
-          <w:sz w:val="21"/>
-        </w:rPr>
-        <w:t xml:space="preserve">Desktop Testing </w:t>
-      </w:r>
-      <w:r>
-        <w:rPr>
-          <w:rFonts w:ascii="Calibri" w:hAnsi="Calibri" w:eastAsia="Noto Sans CJK SC"/>
-          <w:b w:val="0"/>
-          <w:color w:val="666666"/>
-          <w:sz w:val="19"/>
-        </w:rPr>
-        <w:t xml:space="preserve">（项目实践） </w:t>
-      </w:r>
-      <w:r>
-        <w:rPr>
-          <w:rFonts w:ascii="Calibri" w:hAnsi="Calibri" w:eastAsia="Noto Sans CJK SC"/>
-          <w:b w:val="0"/>
-          <w:sz w:val="21"/>
-        </w:rPr>
-        <w:t>Windows 上位机 / ATE 设备通信链路 / UI 自动化 / 稳定性 / 压力测试</w:t>
-      </w:r>
-    </w:p>
-    <w:p>
-      <w:pPr>
-        <w:keepNext w:val="0"/>
-        <w:keepLines/>
-        <w:spacing w:after="40"/>
-      </w:pPr>
-      <w:r>
-        <w:rPr>
-          <w:rFonts w:ascii="Calibri" w:hAnsi="Calibri" w:eastAsia="Noto Sans CJK SC"/>
-          <w:b/>
-          <w:sz w:val="21"/>
-        </w:rPr>
-        <w:t xml:space="preserve">Performance </w:t>
-      </w:r>
-      <w:r>
-        <w:rPr>
-          <w:rFonts w:ascii="Calibri" w:hAnsi="Calibri" w:eastAsia="Noto Sans CJK SC"/>
-          <w:b w:val="0"/>
-          <w:color w:val="666666"/>
-          <w:sz w:val="19"/>
-        </w:rPr>
-        <w:t xml:space="preserve">（实际项目使用） </w:t>
-      </w:r>
-      <w:r>
-        <w:rPr>
-          <w:rFonts w:ascii="Calibri" w:hAnsi="Calibri" w:eastAsia="Noto Sans CJK SC"/>
-          <w:b w:val="0"/>
-          <w:sz w:val="21"/>
-        </w:rPr>
-        <w:t>JMeter / 长时间压测 / 资源占用监控 / 响应延迟分析</w:t>
-      </w:r>
-    </w:p>
-    <w:p>
-      <w:pPr>
-        <w:keepNext w:val="0"/>
-        <w:keepLines/>
-        <w:spacing w:after="40"/>
-      </w:pPr>
-      <w:r>
-        <w:rPr>
-          <w:rFonts w:ascii="Calibri" w:hAnsi="Calibri" w:eastAsia="Noto Sans CJK SC"/>
-          <w:b/>
-          <w:sz w:val="21"/>
-        </w:rPr>
-        <w:t xml:space="preserve">CI / CD </w:t>
-      </w:r>
-      <w:r>
-        <w:rPr>
-          <w:rFonts w:ascii="Calibri" w:hAnsi="Calibri" w:eastAsia="Noto Sans CJK SC"/>
-          <w:b w:val="0"/>
-          <w:color w:val="666666"/>
-          <w:sz w:val="19"/>
-        </w:rPr>
-        <w:t xml:space="preserve">（实际项目使用） </w:t>
-      </w:r>
-      <w:r>
-        <w:rPr>
-          <w:rFonts w:ascii="Calibri" w:hAnsi="Calibri" w:eastAsia="Noto Sans CJK SC"/>
-          <w:b w:val="0"/>
-          <w:sz w:val="21"/>
-        </w:rPr>
-        <w:t>Jenkins / MeterSphere 定时巡检 / 钉钉告警 / Git</w:t>
-      </w:r>
-    </w:p>
-    <w:p>
-      <w:pPr>
-        <w:keepNext w:val="0"/>
-        <w:keepLines/>
-        <w:spacing w:after="40"/>
-      </w:pPr>
-      <w:r>
-        <w:rPr>
-          <w:rFonts w:ascii="Calibri" w:hAnsi="Calibri" w:eastAsia="Noto Sans CJK SC"/>
-          <w:b/>
-          <w:sz w:val="21"/>
-        </w:rPr>
-        <w:t xml:space="preserve">Linux &amp; Shell </w:t>
-      </w:r>
-      <w:r>
-        <w:rPr>
-          <w:rFonts w:ascii="Calibri" w:hAnsi="Calibri" w:eastAsia="Noto Sans CJK SC"/>
-          <w:b w:val="0"/>
-          <w:color w:val="666666"/>
-          <w:sz w:val="19"/>
-        </w:rPr>
-        <w:t xml:space="preserve">（实际项目使用） </w:t>
-      </w:r>
-      <w:r>
-        <w:rPr>
-          <w:rFonts w:ascii="Calibri" w:hAnsi="Calibri" w:eastAsia="Noto Sans CJK SC"/>
-          <w:b w:val="0"/>
-          <w:sz w:val="21"/>
-        </w:rPr>
-        <w:t>Linux / Shell / 日志分析 / Docker / 服务状态排查</w:t>
+        <w:t>设备软件功能验证 / 成像结果核查 / 异常场景 / 问题跟踪</w:t>
       </w:r>
     </w:p>
     <w:p>
@@ -701,7 +459,7 @@
           <w:b/>
           <w:sz w:val="21"/>
         </w:rPr>
-        <w:t>设备流程梳理：</w:t>
+        <w:t>设备软件验证：</w:t>
       </w:r>
       <w:r>
         <w:rPr>
@@ -709,7 +467,7 @@
           <w:b w:val="0"/>
           <w:sz w:val="21"/>
         </w:rPr>
-        <w:t>结合设备作业指导书与软件功能清单，梳理操作流程、功能入口和测试关注点，逐步建立设备软件测试清单。</w:t>
+        <w:t>结合设备作业指导书与软件功能清单梳理测试范围，整理操作流程、功能入口和异常场景，形成可执行的测试清单。</w:t>
       </w:r>
     </w:p>
     <w:p>
@@ -733,7 +491,7 @@
           <w:b/>
           <w:sz w:val="21"/>
         </w:rPr>
-        <w:t>建模与检测记录：</w:t>
+        <w:t>检测结果核查：</w:t>
       </w:r>
       <w:r>
         <w:rPr>
@@ -741,7 +499,7 @@
           <w:b w:val="0"/>
           <w:sz w:val="21"/>
         </w:rPr>
-        <w:t>参与 MPW 晶圆建模流程学习与检测验证，整理截图和检测记录，关注拍摄位置偏移、Die 成像不完整等影响检测覆盖的问题。</w:t>
+        <w:t>核对成像范围与检测结果，记录位置偏移、图像覆盖不完整等问题，整理截图、问题现象与复现条件，为后续排查和回归提供依据。</w:t>
       </w:r>
     </w:p>
     <w:p>
@@ -773,7 +531,7 @@
           <w:b w:val="0"/>
           <w:sz w:val="21"/>
         </w:rPr>
-        <w:t>推进轻量测试管理系统的需求与交互设计，按项目、软件版本、功能模块组织问题，完善进度说明、附件及测试用例管理。</w:t>
+        <w:t>设计并迭代轻量测试管理系统，按项目、软件版本、功能模块组织问题，完善进度说明、截图附件与测试用例管理，兼顾操作员录入和管理者查看进度。</w:t>
       </w:r>
     </w:p>
     <w:p>
@@ -1302,7 +1060,7 @@
           <w:b/>
           <w:sz w:val="22"/>
         </w:rPr>
-        <w:t xml:space="preserve">半导体 AOI 设备软件测试与检测记录　</w:t>
+        <w:t xml:space="preserve">轻量测试管理系统　</w:t>
       </w:r>
       <w:r>
         <w:rPr>
@@ -1311,7 +1069,7 @@
           <w:color w:val="666666"/>
           <w:sz w:val="19"/>
         </w:rPr>
-        <w:t xml:space="preserve">[软件测试]　</w:t>
+        <w:t xml:space="preserve">[测试工具设计]　</w:t>
       </w:r>
       <w:r>
         <w:rPr>
@@ -1320,7 +1078,7 @@
           <w:color w:val="666666"/>
           <w:sz w:val="19"/>
         </w:rPr>
-        <w:t>2026.09 — 至今</w:t>
+        <w:t>2026.10 — 至今</w:t>
       </w:r>
     </w:p>
     <w:p>
@@ -1344,7 +1102,7 @@
           <w:b/>
           <w:sz w:val="21"/>
         </w:rPr>
-        <w:t>问题与方法：</w:t>
+        <w:t>测试实践：</w:t>
       </w:r>
       <w:r>
         <w:rPr>
@@ -1352,79 +1110,7 @@
           <w:b w:val="0"/>
           <w:sz w:val="21"/>
         </w:rPr>
-        <w:t>光学检测结果依赖设备操作、模板参数和成像范围，需要把软件流程、现场现象与检测记录对应起来。 结合操作手册梳理建模与检测流程，按截图整理检测记录，记录拍摄偏移、Die 成像不完整等现象，并核对相机定位与建模环节。</w:t>
-      </w:r>
-    </w:p>
-    <w:p>
-      <w:pPr>
-        <w:keepNext w:val="0"/>
-        <w:keepLines/>
-        <w:spacing w:after="40"/>
-        <w:ind w:left="283"/>
-      </w:pPr>
-      <w:r>
-        <w:rPr>
-          <w:rFonts w:ascii="Calibri" w:hAnsi="Calibri" w:eastAsia="Noto Sans CJK SC"/>
-          <w:b w:val="0"/>
-          <w:sz w:val="20"/>
-        </w:rPr>
-        <w:t xml:space="preserve">▪ </w:t>
-      </w:r>
-      <w:r>
-        <w:rPr>
-          <w:rFonts w:ascii="Calibri" w:hAnsi="Calibri" w:eastAsia="Noto Sans CJK SC"/>
-          <w:b w:val="0"/>
-          <w:sz w:val="21"/>
-        </w:rPr>
-        <w:t>按操作步骤整理功能入口与测试关注点</w:t>
-      </w:r>
-    </w:p>
-    <w:p>
-      <w:pPr>
-        <w:keepNext w:val="0"/>
-        <w:keepLines/>
-        <w:spacing w:after="40"/>
-        <w:ind w:left="283"/>
-      </w:pPr>
-      <w:r>
-        <w:rPr>
-          <w:rFonts w:ascii="Calibri" w:hAnsi="Calibri" w:eastAsia="Noto Sans CJK SC"/>
-          <w:b w:val="0"/>
-          <w:sz w:val="20"/>
-        </w:rPr>
-        <w:t xml:space="preserve">▪ </w:t>
-      </w:r>
-      <w:r>
-        <w:rPr>
-          <w:rFonts w:ascii="Calibri" w:hAnsi="Calibri" w:eastAsia="Noto Sans CJK SC"/>
-          <w:b w:val="0"/>
-          <w:sz w:val="21"/>
-        </w:rPr>
-        <w:t>检查拍摄位置与 Die 成像完整性，保留现象截图</w:t>
-      </w:r>
-    </w:p>
-    <w:p>
-      <w:pPr>
-        <w:keepNext w:val="0"/>
-        <w:keepLines/>
-        <w:spacing w:after="40"/>
-        <w:ind w:left="283"/>
-      </w:pPr>
-      <w:r>
-        <w:rPr>
-          <w:rFonts w:ascii="Calibri" w:hAnsi="Calibri" w:eastAsia="Noto Sans CJK SC"/>
-          <w:b w:val="0"/>
-          <w:sz w:val="20"/>
-        </w:rPr>
-        <w:t xml:space="preserve">▪ </w:t>
-      </w:r>
-      <w:r>
-        <w:rPr>
-          <w:rFonts w:ascii="Calibri" w:hAnsi="Calibri" w:eastAsia="Noto Sans CJK SC"/>
-          <w:b w:val="0"/>
-          <w:sz w:val="21"/>
-        </w:rPr>
-        <w:t>将问题现象、复现条件与记录对应，便于后续验证</w:t>
+        <w:t>按项目、软件版本、功能模块组织问题，设计问题记录、进度说明和附件关联流程，持续调整 PC 与移动端的信息展示和操作入口。</w:t>
       </w:r>
     </w:p>
     <w:p>
@@ -1456,514 +1142,7 @@
           <w:b w:val="0"/>
           <w:sz w:val="21"/>
         </w:rPr>
-        <w:t>已整理 MPW 检测记录与截图材料，持续完善设备流程理解和测试清单。</w:t>
-      </w:r>
-    </w:p>
-    <w:p>
-      <w:pPr>
-        <w:keepNext/>
-        <w:keepLines/>
-        <w:spacing w:before="100" w:after="20"/>
-      </w:pPr>
-      <w:r>
-        <w:rPr>
-          <w:rFonts w:ascii="Calibri" w:hAnsi="Calibri" w:eastAsia="Noto Sans CJK SC"/>
-          <w:b/>
-          <w:sz w:val="22"/>
-        </w:rPr>
-        <w:t xml:space="preserve">车规级芯片测试机（ATE）上位机软件　</w:t>
-      </w:r>
-      <w:r>
-        <w:rPr>
-          <w:rFonts w:ascii="Calibri" w:hAnsi="Calibri" w:eastAsia="Noto Sans CJK SC"/>
-          <w:b w:val="0"/>
-          <w:color w:val="666666"/>
-          <w:sz w:val="19"/>
-        </w:rPr>
-        <w:t xml:space="preserve">[软件测试]　</w:t>
-      </w:r>
-      <w:r>
-        <w:rPr>
-          <w:rFonts w:ascii="Calibri" w:hAnsi="Calibri" w:eastAsia="Noto Sans CJK SC"/>
-          <w:b w:val="0"/>
-          <w:color w:val="666666"/>
-          <w:sz w:val="19"/>
-        </w:rPr>
-        <w:t>2026.07 — 2026.09</w:t>
-      </w:r>
-    </w:p>
-    <w:p>
-      <w:pPr>
-        <w:keepNext w:val="0"/>
-        <w:keepLines/>
-        <w:spacing w:after="40"/>
-        <w:ind w:left="283"/>
-      </w:pPr>
-      <w:r>
-        <w:rPr>
-          <w:rFonts w:ascii="Calibri" w:hAnsi="Calibri" w:eastAsia="Noto Sans CJK SC"/>
-          <w:b w:val="0"/>
-          <w:sz w:val="20"/>
-        </w:rPr>
-        <w:t xml:space="preserve">▪ </w:t>
-      </w:r>
-      <w:r>
-        <w:rPr>
-          <w:rFonts w:ascii="Calibri" w:hAnsi="Calibri" w:eastAsia="Noto Sans CJK SC"/>
-          <w:b/>
-          <w:sz w:val="21"/>
-        </w:rPr>
-        <w:t>问题与方法：</w:t>
-      </w:r>
-      <w:r>
-        <w:rPr>
-          <w:rFonts w:ascii="Calibri" w:hAnsi="Calibri" w:eastAsia="Noto Sans CJK SC"/>
-          <w:b w:val="0"/>
-          <w:sz w:val="21"/>
-        </w:rPr>
-        <w:t>半导体 ATE 上位机软件面向车规级功放芯片、功耗芯片的自动化测试，功能路径深、设备通信链路长、稳定性要求高。 按黑盒方法设计用例，核心路径（指令下发、参数配置、数据采集、状态回传）优先覆盖；搭建界面 UI 自动化支撑版本迭代回归；组织长时间连续运行压测监测资源占用与响应延迟。</w:t>
-      </w:r>
-    </w:p>
-    <w:p>
-      <w:pPr>
-        <w:keepNext w:val="0"/>
-        <w:keepLines/>
-        <w:spacing w:after="40"/>
-        <w:ind w:left="283"/>
-      </w:pPr>
-      <w:r>
-        <w:rPr>
-          <w:rFonts w:ascii="Calibri" w:hAnsi="Calibri" w:eastAsia="Noto Sans CJK SC"/>
-          <w:b w:val="0"/>
-          <w:sz w:val="20"/>
-        </w:rPr>
-        <w:t xml:space="preserve">▪ </w:t>
-      </w:r>
-      <w:r>
-        <w:rPr>
-          <w:rFonts w:ascii="Calibri" w:hAnsi="Calibri" w:eastAsia="Noto Sans CJK SC"/>
-          <w:b w:val="0"/>
-          <w:sz w:val="21"/>
-        </w:rPr>
-        <w:t>功能路径、权限、异常输入、边界数据逐条设计用例</w:t>
-      </w:r>
-    </w:p>
-    <w:p>
-      <w:pPr>
-        <w:keepNext w:val="0"/>
-        <w:keepLines/>
-        <w:spacing w:after="40"/>
-        <w:ind w:left="283"/>
-      </w:pPr>
-      <w:r>
-        <w:rPr>
-          <w:rFonts w:ascii="Calibri" w:hAnsi="Calibri" w:eastAsia="Noto Sans CJK SC"/>
-          <w:b w:val="0"/>
-          <w:sz w:val="20"/>
-        </w:rPr>
-        <w:t xml:space="preserve">▪ </w:t>
-      </w:r>
-      <w:r>
-        <w:rPr>
-          <w:rFonts w:ascii="Calibri" w:hAnsi="Calibri" w:eastAsia="Noto Sans CJK SC"/>
-          <w:b w:val="0"/>
-          <w:sz w:val="21"/>
-        </w:rPr>
-        <w:t>主流程与核心操作路径自动回归</w:t>
-      </w:r>
-    </w:p>
-    <w:p>
-      <w:pPr>
-        <w:keepNext w:val="0"/>
-        <w:keepLines/>
-        <w:spacing w:after="40"/>
-        <w:ind w:left="283"/>
-      </w:pPr>
-      <w:r>
-        <w:rPr>
-          <w:rFonts w:ascii="Calibri" w:hAnsi="Calibri" w:eastAsia="Noto Sans CJK SC"/>
-          <w:b w:val="0"/>
-          <w:sz w:val="20"/>
-        </w:rPr>
-        <w:t xml:space="preserve">▪ </w:t>
-      </w:r>
-      <w:r>
-        <w:rPr>
-          <w:rFonts w:ascii="Calibri" w:hAnsi="Calibri" w:eastAsia="Noto Sans CJK SC"/>
-          <w:b w:val="0"/>
-          <w:sz w:val="21"/>
-        </w:rPr>
-        <w:t>OS × 硬件配置兼容矩阵 + 发布前检查</w:t>
-      </w:r>
-    </w:p>
-    <w:p>
-      <w:pPr>
-        <w:keepNext w:val="0"/>
-        <w:keepLines/>
-        <w:spacing w:after="40"/>
-        <w:ind w:left="283"/>
-      </w:pPr>
-      <w:r>
-        <w:rPr>
-          <w:rFonts w:ascii="Calibri" w:hAnsi="Calibri" w:eastAsia="Noto Sans CJK SC"/>
-          <w:b w:val="0"/>
-          <w:sz w:val="20"/>
-        </w:rPr>
-        <w:t xml:space="preserve">▪ </w:t>
-      </w:r>
-      <w:r>
-        <w:rPr>
-          <w:rFonts w:ascii="Calibri" w:hAnsi="Calibri" w:eastAsia="Noto Sans CJK SC"/>
-          <w:b/>
-          <w:sz w:val="21"/>
-        </w:rPr>
-        <w:t>结果：</w:t>
-      </w:r>
-      <w:r>
-        <w:rPr>
-          <w:rFonts w:ascii="Calibri" w:hAnsi="Calibri" w:eastAsia="Noto Sans CJK SC"/>
-          <w:b w:val="0"/>
-          <w:sz w:val="21"/>
-        </w:rPr>
-        <w:t>版本回归与发布前验证有据可查，稳定性风险通过长时压测提前暴露并闭环。</w:t>
-      </w:r>
-    </w:p>
-    <w:p>
-      <w:pPr>
-        <w:keepNext/>
-        <w:keepLines/>
-        <w:spacing w:before="100" w:after="20"/>
-      </w:pPr>
-      <w:r>
-        <w:rPr>
-          <w:rFonts w:ascii="Calibri" w:hAnsi="Calibri" w:eastAsia="Noto Sans CJK SC"/>
-          <w:b/>
-          <w:sz w:val="22"/>
-        </w:rPr>
-        <w:t xml:space="preserve">星点评 AI 工具平台　</w:t>
-      </w:r>
-      <w:r>
-        <w:rPr>
-          <w:rFonts w:ascii="Calibri" w:hAnsi="Calibri" w:eastAsia="Noto Sans CJK SC"/>
-          <w:b w:val="0"/>
-          <w:color w:val="666666"/>
-          <w:sz w:val="19"/>
-        </w:rPr>
-        <w:t xml:space="preserve">[测试开发]　</w:t>
-      </w:r>
-      <w:r>
-        <w:rPr>
-          <w:rFonts w:ascii="Calibri" w:hAnsi="Calibri" w:eastAsia="Noto Sans CJK SC"/>
-          <w:b w:val="0"/>
-          <w:color w:val="666666"/>
-          <w:sz w:val="19"/>
-        </w:rPr>
-        <w:t>2026.03 — 2026.06</w:t>
-      </w:r>
-    </w:p>
-    <w:p>
-      <w:pPr>
-        <w:keepNext w:val="0"/>
-        <w:keepLines/>
-        <w:spacing w:after="40"/>
-        <w:ind w:left="283"/>
-      </w:pPr>
-      <w:r>
-        <w:rPr>
-          <w:rFonts w:ascii="Calibri" w:hAnsi="Calibri" w:eastAsia="Noto Sans CJK SC"/>
-          <w:b w:val="0"/>
-          <w:sz w:val="20"/>
-        </w:rPr>
-        <w:t xml:space="preserve">▪ </w:t>
-      </w:r>
-      <w:r>
-        <w:rPr>
-          <w:rFonts w:ascii="Calibri" w:hAnsi="Calibri" w:eastAsia="Noto Sans CJK SC"/>
-          <w:b/>
-          <w:sz w:val="21"/>
-        </w:rPr>
-        <w:t>问题与方法：</w:t>
-      </w:r>
-      <w:r>
-        <w:rPr>
-          <w:rFonts w:ascii="Calibri" w:hAnsi="Calibri" w:eastAsia="Noto Sans CJK SC"/>
-          <w:b w:val="0"/>
-          <w:sz w:val="21"/>
-        </w:rPr>
-        <w:t>AI 工具导航与推荐平台：检索、分类筛选、详情展示、榜单推荐、登录注册、数据导入，涉及登录态与数据一致性风险。 按模块拆解业务风险，边界、空数据、异常输入、权限状态单列场景；Playwright 执行主流程自动化，Pytest 校验接口；用 LLM 生成用例初稿与异常数据，结合业务规则人工复核。</w:t>
-      </w:r>
-    </w:p>
-    <w:p>
-      <w:pPr>
-        <w:keepNext w:val="0"/>
-        <w:keepLines/>
-        <w:spacing w:after="40"/>
-        <w:ind w:left="283"/>
-      </w:pPr>
-      <w:r>
-        <w:rPr>
-          <w:rFonts w:ascii="Calibri" w:hAnsi="Calibri" w:eastAsia="Noto Sans CJK SC"/>
-          <w:b w:val="0"/>
-          <w:sz w:val="20"/>
-        </w:rPr>
-        <w:t xml:space="preserve">▪ </w:t>
-      </w:r>
-      <w:r>
-        <w:rPr>
-          <w:rFonts w:ascii="Calibri" w:hAnsi="Calibri" w:eastAsia="Noto Sans CJK SC"/>
-          <w:b w:val="0"/>
-          <w:sz w:val="21"/>
-        </w:rPr>
-        <w:t>登录、未登录、过期三种登录态下的访问控制验证</w:t>
-      </w:r>
-    </w:p>
-    <w:p>
-      <w:pPr>
-        <w:keepNext w:val="0"/>
-        <w:keepLines/>
-        <w:spacing w:after="40"/>
-        <w:ind w:left="283"/>
-      </w:pPr>
-      <w:r>
-        <w:rPr>
-          <w:rFonts w:ascii="Calibri" w:hAnsi="Calibri" w:eastAsia="Noto Sans CJK SC"/>
-          <w:b w:val="0"/>
-          <w:sz w:val="20"/>
-        </w:rPr>
-        <w:t xml:space="preserve">▪ </w:t>
-      </w:r>
-      <w:r>
-        <w:rPr>
-          <w:rFonts w:ascii="Calibri" w:hAnsi="Calibri" w:eastAsia="Noto Sans CJK SC"/>
-          <w:b w:val="0"/>
-          <w:sz w:val="21"/>
-        </w:rPr>
-        <w:t>MySQL 核对导入数据、工具信息、标签和推荐结果</w:t>
-      </w:r>
-    </w:p>
-    <w:p>
-      <w:pPr>
-        <w:keepNext w:val="0"/>
-        <w:keepLines/>
-        <w:spacing w:after="40"/>
-        <w:ind w:left="283"/>
-      </w:pPr>
-      <w:r>
-        <w:rPr>
-          <w:rFonts w:ascii="Calibri" w:hAnsi="Calibri" w:eastAsia="Noto Sans CJK SC"/>
-          <w:b w:val="0"/>
-          <w:sz w:val="20"/>
-        </w:rPr>
-        <w:t xml:space="preserve">▪ </w:t>
-      </w:r>
-      <w:r>
-        <w:rPr>
-          <w:rFonts w:ascii="Calibri" w:hAnsi="Calibri" w:eastAsia="Noto Sans CJK SC"/>
-          <w:b w:val="0"/>
-          <w:sz w:val="21"/>
-        </w:rPr>
-        <w:t>LLM 生成内容做可执行性、覆盖缺口与结果偏差复核</w:t>
-      </w:r>
-    </w:p>
-    <w:p>
-      <w:pPr>
-        <w:keepNext w:val="0"/>
-        <w:keepLines/>
-        <w:spacing w:after="40"/>
-        <w:ind w:left="283"/>
-      </w:pPr>
-      <w:r>
-        <w:rPr>
-          <w:rFonts w:ascii="Calibri" w:hAnsi="Calibri" w:eastAsia="Noto Sans CJK SC"/>
-          <w:b w:val="0"/>
-          <w:sz w:val="20"/>
-        </w:rPr>
-        <w:t xml:space="preserve">▪ </w:t>
-      </w:r>
-      <w:r>
-        <w:rPr>
-          <w:rFonts w:ascii="Calibri" w:hAnsi="Calibri" w:eastAsia="Noto Sans CJK SC"/>
-          <w:b/>
-          <w:sz w:val="21"/>
-        </w:rPr>
-        <w:t>结果：</w:t>
-      </w:r>
-      <w:r>
-        <w:rPr>
-          <w:rFonts w:ascii="Calibri" w:hAnsi="Calibri" w:eastAsia="Noto Sans CJK SC"/>
-          <w:b w:val="0"/>
-          <w:sz w:val="21"/>
-        </w:rPr>
-        <w:t>核心路径全覆盖，页面行为与接口返回逐项比对，登录态与数据口径问题在提测前拦截。</w:t>
-      </w:r>
-    </w:p>
-    <w:p>
-      <w:pPr>
-        <w:keepNext/>
-        <w:keepLines/>
-        <w:spacing w:before="100" w:after="20"/>
-      </w:pPr>
-      <w:r>
-        <w:rPr>
-          <w:rFonts w:ascii="Calibri" w:hAnsi="Calibri" w:eastAsia="Noto Sans CJK SC"/>
-          <w:b/>
-          <w:sz w:val="22"/>
-        </w:rPr>
-        <w:t xml:space="preserve">数字分身小程序自动化　</w:t>
-      </w:r>
-      <w:r>
-        <w:rPr>
-          <w:rFonts w:ascii="Calibri" w:hAnsi="Calibri" w:eastAsia="Noto Sans CJK SC"/>
-          <w:b w:val="0"/>
-          <w:color w:val="666666"/>
-          <w:sz w:val="19"/>
-        </w:rPr>
-        <w:t xml:space="preserve">[测试开发]　</w:t>
-      </w:r>
-      <w:r>
-        <w:rPr>
-          <w:rFonts w:ascii="Calibri" w:hAnsi="Calibri" w:eastAsia="Noto Sans CJK SC"/>
-          <w:b w:val="0"/>
-          <w:color w:val="666666"/>
-          <w:sz w:val="19"/>
-        </w:rPr>
-        <w:t>2026.05 — 2026.06</w:t>
-      </w:r>
-    </w:p>
-    <w:p>
-      <w:pPr>
-        <w:keepNext w:val="0"/>
-        <w:keepLines/>
-        <w:spacing w:after="40"/>
-        <w:ind w:left="283"/>
-      </w:pPr>
-      <w:r>
-        <w:rPr>
-          <w:rFonts w:ascii="Calibri" w:hAnsi="Calibri" w:eastAsia="Noto Sans CJK SC"/>
-          <w:b w:val="0"/>
-          <w:sz w:val="20"/>
-        </w:rPr>
-        <w:t xml:space="preserve">▪ </w:t>
-      </w:r>
-      <w:r>
-        <w:rPr>
-          <w:rFonts w:ascii="Calibri" w:hAnsi="Calibri" w:eastAsia="Noto Sans CJK SC"/>
-          <w:b/>
-          <w:sz w:val="21"/>
-        </w:rPr>
-        <w:t>问题与方法：</w:t>
-      </w:r>
-      <w:r>
-        <w:rPr>
-          <w:rFonts w:ascii="Calibri" w:hAnsi="Calibri" w:eastAsia="Noto Sans CJK SC"/>
-          <w:b w:val="0"/>
-          <w:sz w:val="21"/>
-        </w:rPr>
-        <w:t>数字分身小程序缺少真实 UI 自动化，微信开发者工具自动化端口不稳定，元素定位易变。 接入微信开发者工具自动化端口；Python 解析 dist/app.json 以 auto 模式执行 Pytest，覆盖注册激活、Tab 导航、旅行入口、供需档案、数字档案、账号设置全流程；重试机制应对端口不稳定，参数管理与执行逻辑分离。</w:t>
-      </w:r>
-    </w:p>
-    <w:p>
-      <w:pPr>
-        <w:keepNext w:val="0"/>
-        <w:keepLines/>
-        <w:spacing w:after="40"/>
-        <w:ind w:left="283"/>
-      </w:pPr>
-      <w:r>
-        <w:rPr>
-          <w:rFonts w:ascii="Calibri" w:hAnsi="Calibri" w:eastAsia="Noto Sans CJK SC"/>
-          <w:b w:val="0"/>
-          <w:sz w:val="20"/>
-        </w:rPr>
-        <w:t xml:space="preserve">▪ </w:t>
-      </w:r>
-      <w:r>
-        <w:rPr>
-          <w:rFonts w:ascii="Calibri" w:hAnsi="Calibri" w:eastAsia="Noto Sans CJK SC"/>
-          <w:b w:val="0"/>
-          <w:sz w:val="21"/>
-        </w:rPr>
-        <w:t>自动化端口不稳定 → 重试机制 + 定位策略优化</w:t>
-      </w:r>
-    </w:p>
-    <w:p>
-      <w:pPr>
-        <w:keepNext w:val="0"/>
-        <w:keepLines/>
-        <w:spacing w:after="40"/>
-        <w:ind w:left="283"/>
-      </w:pPr>
-      <w:r>
-        <w:rPr>
-          <w:rFonts w:ascii="Calibri" w:hAnsi="Calibri" w:eastAsia="Noto Sans CJK SC"/>
-          <w:b w:val="0"/>
-          <w:sz w:val="20"/>
-        </w:rPr>
-        <w:t xml:space="preserve">▪ </w:t>
-      </w:r>
-      <w:r>
-        <w:rPr>
-          <w:rFonts w:ascii="Calibri" w:hAnsi="Calibri" w:eastAsia="Noto Sans CJK SC"/>
-          <w:b w:val="0"/>
-          <w:sz w:val="21"/>
-        </w:rPr>
-        <w:t>多环境配置冲突 → 参数管理与执行逻辑分离</w:t>
-      </w:r>
-    </w:p>
-    <w:p>
-      <w:pPr>
-        <w:keepNext w:val="0"/>
-        <w:keepLines/>
-        <w:spacing w:after="40"/>
-        <w:ind w:left="283"/>
-      </w:pPr>
-      <w:r>
-        <w:rPr>
-          <w:rFonts w:ascii="Calibri" w:hAnsi="Calibri" w:eastAsia="Noto Sans CJK SC"/>
-          <w:b w:val="0"/>
-          <w:sz w:val="20"/>
-        </w:rPr>
-        <w:t xml:space="preserve">▪ </w:t>
-      </w:r>
-      <w:r>
-        <w:rPr>
-          <w:rFonts w:ascii="Calibri" w:hAnsi="Calibri" w:eastAsia="Noto Sans CJK SC"/>
-          <w:b w:val="0"/>
-          <w:sz w:val="21"/>
-        </w:rPr>
-        <w:t>缺陷报告自动生成：截图 / JUnit / HTML / Markdown</w:t>
-      </w:r>
-    </w:p>
-    <w:p>
-      <w:pPr>
-        <w:keepNext w:val="0"/>
-        <w:keepLines/>
-        <w:spacing w:after="40"/>
-        <w:ind w:left="283"/>
-      </w:pPr>
-      <w:r>
-        <w:rPr>
-          <w:rFonts w:ascii="Calibri" w:hAnsi="Calibri" w:eastAsia="Noto Sans CJK SC"/>
-          <w:b w:val="0"/>
-          <w:sz w:val="20"/>
-        </w:rPr>
-        <w:t xml:space="preserve">▪ </w:t>
-      </w:r>
-      <w:r>
-        <w:rPr>
-          <w:rFonts w:ascii="Calibri" w:hAnsi="Calibri" w:eastAsia="Noto Sans CJK SC"/>
-          <w:b/>
-          <w:sz w:val="21"/>
-        </w:rPr>
-        <w:t>结果：</w:t>
-      </w:r>
-      <w:r>
-        <w:rPr>
-          <w:rFonts w:ascii="Calibri" w:hAnsi="Calibri" w:eastAsia="Noto Sans CJK SC"/>
-          <w:b w:val="0"/>
-          <w:sz w:val="21"/>
-        </w:rPr>
-        <w:t>冒烟、核心流程与协议文案回归自动化，缺陷报告含严重级别、复现步骤与修复建议。</w:t>
+        <w:t>形成问题分层、进度说明与附件关联的系统设计，持续迭代录入和查看流程。</w:t>
       </w:r>
     </w:p>
     <w:p>
@@ -2020,7 +1199,7 @@
           <w:b/>
           <w:sz w:val="21"/>
         </w:rPr>
-        <w:t>问题与方法：</w:t>
+        <w:t>测试实践：</w:t>
       </w:r>
       <w:r>
         <w:rPr>
@@ -2028,79 +1207,7 @@
           <w:b w:val="0"/>
           <w:sz w:val="21"/>
         </w:rPr>
-        <w:t>企业数据分析平台以自然语言提问生成数据查询，模型输出偏差、工具调用失败与数据口径不一致是高发风险。 正常、异常、边界、无权限、空结果、口径不一致六类场景全覆盖；Text-to-SQL 五维验证（用户问题、SQL 生成、查询结果、页面展示、业务口径）；Postman、MeterSphere 验证接口，SQL 核对 AI 返回与真实业务数据一致性。</w:t>
-      </w:r>
-    </w:p>
-    <w:p>
-      <w:pPr>
-        <w:keepNext w:val="0"/>
-        <w:keepLines/>
-        <w:spacing w:after="40"/>
-        <w:ind w:left="283"/>
-      </w:pPr>
-      <w:r>
-        <w:rPr>
-          <w:rFonts w:ascii="Calibri" w:hAnsi="Calibri" w:eastAsia="Noto Sans CJK SC"/>
-          <w:b w:val="0"/>
-          <w:sz w:val="20"/>
-        </w:rPr>
-        <w:t xml:space="preserve">▪ </w:t>
-      </w:r>
-      <w:r>
-        <w:rPr>
-          <w:rFonts w:ascii="Calibri" w:hAnsi="Calibri" w:eastAsia="Noto Sans CJK SC"/>
-          <w:b w:val="0"/>
-          <w:sz w:val="21"/>
-        </w:rPr>
-        <w:t>五维验证：问题 → SQL → 结果 → 展示 → 口径逐项核对</w:t>
-      </w:r>
-    </w:p>
-    <w:p>
-      <w:pPr>
-        <w:keepNext w:val="0"/>
-        <w:keepLines/>
-        <w:spacing w:after="40"/>
-        <w:ind w:left="283"/>
-      </w:pPr>
-      <w:r>
-        <w:rPr>
-          <w:rFonts w:ascii="Calibri" w:hAnsi="Calibri" w:eastAsia="Noto Sans CJK SC"/>
-          <w:b w:val="0"/>
-          <w:sz w:val="20"/>
-        </w:rPr>
-        <w:t xml:space="preserve">▪ </w:t>
-      </w:r>
-      <w:r>
-        <w:rPr>
-          <w:rFonts w:ascii="Calibri" w:hAnsi="Calibri" w:eastAsia="Noto Sans CJK SC"/>
-          <w:b w:val="0"/>
-          <w:sz w:val="21"/>
-        </w:rPr>
-        <w:t>接口参数、返回结构、状态码、异常提示、权限控制验证</w:t>
-      </w:r>
-    </w:p>
-    <w:p>
-      <w:pPr>
-        <w:keepNext w:val="0"/>
-        <w:keepLines/>
-        <w:spacing w:after="40"/>
-        <w:ind w:left="283"/>
-      </w:pPr>
-      <w:r>
-        <w:rPr>
-          <w:rFonts w:ascii="Calibri" w:hAnsi="Calibri" w:eastAsia="Noto Sans CJK SC"/>
-          <w:b w:val="0"/>
-          <w:sz w:val="20"/>
-        </w:rPr>
-        <w:t xml:space="preserve">▪ </w:t>
-      </w:r>
-      <w:r>
-        <w:rPr>
-          <w:rFonts w:ascii="Calibri" w:hAnsi="Calibri" w:eastAsia="Noto Sans CJK SC"/>
-          <w:b w:val="0"/>
-          <w:sz w:val="21"/>
-        </w:rPr>
-        <w:t>缺陷从复现、提交到回归全程跟进</w:t>
+        <w:t>正常、异常、边界、无权限、空结果、口径不一致六类场景全覆盖；Text-to-SQL 五维验证（用户问题、SQL 生成、查询结果、页面展示、业务口径）；Postman、MeterSphere 验证接口，SQL 核对 AI 返回与真实业务数据一致性。</w:t>
       </w:r>
     </w:p>
     <w:p>

</xml_diff>